<commit_message>
feat: partage social + Wave Premium + déploiement APK + livrables 1-6 complets
- ServicePartage (share_plus) : partage pitch/profil/DIALI sur WhatsApp, FB, Telegram, X
- ServiceWave : lien marchand Wave + url_launcher, 3 plans Premium (5k/7.5k/15k FCFA)
- DatabaseService.setPremium() : activation Premium dans Firebase
- APK release signé 54.2MB — lien Drive : drive.google.com/file/d/1FapzU1NMRoacyW1jnRUHSvklJ6cJdHAj
- Livrables 1-6 tous mis à jour : packages, services, code, sections déploiement/Wave/partage
- generate_docx.py : livrable 1 ajouté à la génération automatique
</commit_message>
<xml_diff>
--- a/livrables/docx/DIAPALER_AFRICA_Livrable2.docx
+++ b/livrables/docx/DIAPALER_AFRICA_Livrable2.docx
@@ -1114,7 +1114,7 @@
           <w:rFonts w:ascii="Calibri" w:hAnsi="Calibri"/>
           <w:sz w:val="22"/>
         </w:rPr>
-        <w:t>[1.8 DELETE — Déconnexion et nettoyage](#18-delete--déconnexion-et-nettoyage)</w:t>
+        <w:t>[1.8 UPDATE — Activer le statut Premium (Wave)](#18-update--activer-le-statut-premium-wave)</w:t>
       </w:r>
     </w:p>
     <w:p>
@@ -1126,7 +1126,19 @@
           <w:rFonts w:ascii="Calibri" w:hAnsi="Calibri"/>
           <w:sz w:val="22"/>
         </w:rPr>
-        <w:t>[1.9 Sérialisation JSON ↔ Dart](#19-sérialisation-json--dart)</w:t>
+        <w:t>[1.9 DELETE — Déconnexion et nettoyage](#19-delete--déconnexion-et-nettoyage)</w:t>
+      </w:r>
+    </w:p>
+    <w:p>
+      <w:pPr>
+        <w:pStyle w:val="ListBullet"/>
+      </w:pPr>
+      <w:r>
+        <w:rPr>
+          <w:rFonts w:ascii="Calibri" w:hAnsi="Calibri"/>
+          <w:sz w:val="22"/>
+        </w:rPr>
+        <w:t>[1.10 Sérialisation JSON ↔ Dart](#110-sérialisation-json--dart)</w:t>
       </w:r>
     </w:p>
     <w:p>
@@ -1811,6 +1823,70 @@
           </w:p>
         </w:tc>
       </w:tr>
+      <w:tr>
+        <w:tc>
+          <w:tcPr>
+            <w:tcW w:type="dxa" w:w="4703"/>
+            <w:shd w:val="clear" w:color="auto" w:fill="EFF6FF"/>
+          </w:tcPr>
+          <w:p>
+            <w:r>
+              <w:rPr>
+                <w:rFonts w:ascii="Calibri" w:hAnsi="Calibri"/>
+                <w:color w:val="DC2626"/>
+                <w:sz w:val="20"/>
+              </w:rPr>
+              <w:t>service_partage.dart</w:t>
+            </w:r>
+          </w:p>
+        </w:tc>
+        <w:tc>
+          <w:tcPr>
+            <w:tcW w:type="dxa" w:w="4703"/>
+            <w:shd w:val="clear" w:color="auto" w:fill="EFF6FF"/>
+          </w:tcPr>
+          <w:p>
+            <w:r>
+              <w:rPr>
+                <w:rFonts w:ascii="Calibri" w:hAnsi="Calibri"/>
+                <w:sz w:val="20"/>
+              </w:rPr>
+              <w:t>Partage social natif (share_plus) — pitch, profil, conseil DIALI</w:t>
+            </w:r>
+          </w:p>
+        </w:tc>
+      </w:tr>
+      <w:tr>
+        <w:tc>
+          <w:tcPr>
+            <w:tcW w:type="dxa" w:w="4703"/>
+          </w:tcPr>
+          <w:p>
+            <w:r>
+              <w:rPr>
+                <w:rFonts w:ascii="Calibri" w:hAnsi="Calibri"/>
+                <w:color w:val="DC2626"/>
+                <w:sz w:val="20"/>
+              </w:rPr>
+              <w:t>service_wave.dart</w:t>
+            </w:r>
+          </w:p>
+        </w:tc>
+        <w:tc>
+          <w:tcPr>
+            <w:tcW w:type="dxa" w:w="4703"/>
+          </w:tcPr>
+          <w:p>
+            <w:r>
+              <w:rPr>
+                <w:rFonts w:ascii="Calibri" w:hAnsi="Calibri"/>
+                <w:sz w:val="20"/>
+              </w:rPr>
+              <w:t>Paiement Premium Wave — lien marchand + activation Firebase</w:t>
+            </w:r>
+          </w:p>
+        </w:tc>
+      </w:tr>
     </w:tbl>
     <w:p>
       <w:pPr>
@@ -6277,7 +6353,307 @@
         <w:pStyle w:val="Heading3"/>
       </w:pPr>
       <w:r>
-        <w:t>1.8 DELETE — Déconnexion et nettoyage</w:t>
+        <w:t>1.8 UPDATE — Activer le statut Premium (Wave)</w:t>
+      </w:r>
+    </w:p>
+    <w:p>
+      <w:r>
+        <w:rPr>
+          <w:rFonts w:ascii="Calibri" w:hAnsi="Calibri"/>
+          <w:sz w:val="22"/>
+        </w:rPr>
+        <w:t xml:space="preserve">Après confirmation du paiement Wave, un </w:t>
+      </w:r>
+      <w:r>
+        <w:rPr>
+          <w:rFonts w:ascii="Courier New" w:hAnsi="Courier New"/>
+          <w:color w:val="DC2626"/>
+          <w:sz w:val="20"/>
+        </w:rPr>
+        <w:t>update()</w:t>
+      </w:r>
+      <w:r>
+        <w:rPr>
+          <w:rFonts w:ascii="Calibri" w:hAnsi="Calibri"/>
+          <w:sz w:val="22"/>
+        </w:rPr>
+        <w:t xml:space="preserve"> partiel marque l'utilisateur Premium :</w:t>
+      </w:r>
+    </w:p>
+    <w:p>
+      <w:pPr>
+        <w:spacing w:before="0" w:after="0"/>
+        <w:ind w:left="283"/>
+        <w:shd w:val="clear" w:color="auto" w:fill="F3F4F6"/>
+      </w:pPr>
+      <w:r>
+        <w:rPr>
+          <w:rFonts w:ascii="Courier New" w:hAnsi="Courier New"/>
+          <w:color w:val="1F2D3D"/>
+          <w:sz w:val="18"/>
+        </w:rPr>
+        <w:t>// service_base_de_donnees.dart</w:t>
+      </w:r>
+    </w:p>
+    <w:p>
+      <w:pPr>
+        <w:spacing w:before="0" w:after="0"/>
+        <w:ind w:left="283"/>
+        <w:shd w:val="clear" w:color="auto" w:fill="F3F4F6"/>
+      </w:pPr>
+      <w:r>
+        <w:rPr>
+          <w:rFonts w:ascii="Courier New" w:hAnsi="Courier New"/>
+          <w:color w:val="1F2D3D"/>
+          <w:sz w:val="18"/>
+        </w:rPr>
+        <w:t>static Future&lt;void&gt; setPremium({</w:t>
+      </w:r>
+    </w:p>
+    <w:p>
+      <w:pPr>
+        <w:spacing w:before="0" w:after="0"/>
+        <w:ind w:left="283"/>
+        <w:shd w:val="clear" w:color="auto" w:fill="F3F4F6"/>
+      </w:pPr>
+      <w:r>
+        <w:rPr>
+          <w:rFonts w:ascii="Courier New" w:hAnsi="Courier New"/>
+          <w:color w:val="1F2D3D"/>
+          <w:sz w:val="18"/>
+        </w:rPr>
+        <w:t xml:space="preserve">  required String uid,</w:t>
+      </w:r>
+    </w:p>
+    <w:p>
+      <w:pPr>
+        <w:spacing w:before="0" w:after="0"/>
+        <w:ind w:left="283"/>
+        <w:shd w:val="clear" w:color="auto" w:fill="F3F4F6"/>
+      </w:pPr>
+      <w:r>
+        <w:rPr>
+          <w:rFonts w:ascii="Courier New" w:hAnsi="Courier New"/>
+          <w:color w:val="1F2D3D"/>
+          <w:sz w:val="18"/>
+        </w:rPr>
+        <w:t xml:space="preserve">  required String plan,   // 'entrepreneur' | 'mentor' | 'investisseur'</w:t>
+      </w:r>
+    </w:p>
+    <w:p>
+      <w:pPr>
+        <w:spacing w:before="0" w:after="0"/>
+        <w:ind w:left="283"/>
+        <w:shd w:val="clear" w:color="auto" w:fill="F3F4F6"/>
+      </w:pPr>
+      <w:r>
+        <w:rPr>
+          <w:rFonts w:ascii="Courier New" w:hAnsi="Courier New"/>
+          <w:color w:val="1F2D3D"/>
+          <w:sz w:val="18"/>
+        </w:rPr>
+        <w:t>}) async {</w:t>
+      </w:r>
+    </w:p>
+    <w:p>
+      <w:pPr>
+        <w:spacing w:before="0" w:after="0"/>
+        <w:ind w:left="283"/>
+        <w:shd w:val="clear" w:color="auto" w:fill="F3F4F6"/>
+      </w:pPr>
+      <w:r>
+        <w:rPr>
+          <w:rFonts w:ascii="Courier New" w:hAnsi="Courier New"/>
+          <w:color w:val="1F2D3D"/>
+          <w:sz w:val="18"/>
+        </w:rPr>
+        <w:t xml:space="preserve">  await _userRef(uid).update({</w:t>
+      </w:r>
+    </w:p>
+    <w:p>
+      <w:pPr>
+        <w:spacing w:before="0" w:after="0"/>
+        <w:ind w:left="283"/>
+        <w:shd w:val="clear" w:color="auto" w:fill="F3F4F6"/>
+      </w:pPr>
+      <w:r>
+        <w:rPr>
+          <w:rFonts w:ascii="Courier New" w:hAnsi="Courier New"/>
+          <w:color w:val="1F2D3D"/>
+          <w:sz w:val="18"/>
+        </w:rPr>
+        <w:t xml:space="preserve">    'isPremium': true,</w:t>
+      </w:r>
+    </w:p>
+    <w:p>
+      <w:pPr>
+        <w:spacing w:before="0" w:after="0"/>
+        <w:ind w:left="283"/>
+        <w:shd w:val="clear" w:color="auto" w:fill="F3F4F6"/>
+      </w:pPr>
+      <w:r>
+        <w:rPr>
+          <w:rFonts w:ascii="Courier New" w:hAnsi="Courier New"/>
+          <w:color w:val="1F2D3D"/>
+          <w:sz w:val="18"/>
+        </w:rPr>
+        <w:t xml:space="preserve">    'premiumPlan': plan,</w:t>
+      </w:r>
+    </w:p>
+    <w:p>
+      <w:pPr>
+        <w:spacing w:before="0" w:after="0"/>
+        <w:ind w:left="283"/>
+        <w:shd w:val="clear" w:color="auto" w:fill="F3F4F6"/>
+      </w:pPr>
+      <w:r>
+        <w:rPr>
+          <w:rFonts w:ascii="Courier New" w:hAnsi="Courier New"/>
+          <w:color w:val="1F2D3D"/>
+          <w:sz w:val="18"/>
+        </w:rPr>
+        <w:t xml:space="preserve">    'premiumSince': ServerValue.timestamp,</w:t>
+      </w:r>
+    </w:p>
+    <w:p>
+      <w:pPr>
+        <w:spacing w:before="0" w:after="0"/>
+        <w:ind w:left="283"/>
+        <w:shd w:val="clear" w:color="auto" w:fill="F3F4F6"/>
+      </w:pPr>
+      <w:r>
+        <w:rPr>
+          <w:rFonts w:ascii="Courier New" w:hAnsi="Courier New"/>
+          <w:color w:val="1F2D3D"/>
+          <w:sz w:val="18"/>
+        </w:rPr>
+        <w:t xml:space="preserve">  });</w:t>
+      </w:r>
+    </w:p>
+    <w:p>
+      <w:pPr>
+        <w:spacing w:before="0" w:after="0"/>
+        <w:ind w:left="283"/>
+        <w:shd w:val="clear" w:color="auto" w:fill="F3F4F6"/>
+      </w:pPr>
+      <w:r>
+        <w:rPr>
+          <w:rFonts w:ascii="Courier New" w:hAnsi="Courier New"/>
+          <w:color w:val="1F2D3D"/>
+          <w:sz w:val="18"/>
+        </w:rPr>
+        <w:t>}</w:t>
+      </w:r>
+    </w:p>
+    <w:p>
+      <w:pPr>
+        <w:spacing w:after="80"/>
+      </w:pPr>
+    </w:p>
+    <w:p>
+      <w:r>
+        <w:rPr>
+          <w:rFonts w:ascii="Calibri" w:hAnsi="Calibri"/>
+          <w:b/>
+          <w:sz w:val="22"/>
+        </w:rPr>
+        <w:t>Depuis `service_wave.dart` :</w:t>
+      </w:r>
+    </w:p>
+    <w:p>
+      <w:pPr>
+        <w:spacing w:before="0" w:after="0"/>
+        <w:ind w:left="283"/>
+        <w:shd w:val="clear" w:color="auto" w:fill="F3F4F6"/>
+      </w:pPr>
+      <w:r>
+        <w:rPr>
+          <w:rFonts w:ascii="Courier New" w:hAnsi="Courier New"/>
+          <w:color w:val="1F2D3D"/>
+          <w:sz w:val="18"/>
+        </w:rPr>
+        <w:t>// Après que l'utilisateur confirme son paiement Wave</w:t>
+      </w:r>
+    </w:p>
+    <w:p>
+      <w:pPr>
+        <w:spacing w:before="0" w:after="0"/>
+        <w:ind w:left="283"/>
+        <w:shd w:val="clear" w:color="auto" w:fill="F3F4F6"/>
+      </w:pPr>
+      <w:r>
+        <w:rPr>
+          <w:rFonts w:ascii="Courier New" w:hAnsi="Courier New"/>
+          <w:color w:val="1F2D3D"/>
+          <w:sz w:val="18"/>
+        </w:rPr>
+        <w:t>await WaveService.activatePremium(plan);</w:t>
+      </w:r>
+    </w:p>
+    <w:p>
+      <w:pPr>
+        <w:spacing w:before="0" w:after="0"/>
+        <w:ind w:left="283"/>
+        <w:shd w:val="clear" w:color="auto" w:fill="F3F4F6"/>
+      </w:pPr>
+      <w:r>
+        <w:rPr>
+          <w:rFonts w:ascii="Courier New" w:hAnsi="Courier New"/>
+          <w:color w:val="1F2D3D"/>
+          <w:sz w:val="18"/>
+        </w:rPr>
+        <w:t>// → Firebase : users/{uid}/isPremium = true</w:t>
+      </w:r>
+    </w:p>
+    <w:p>
+      <w:pPr>
+        <w:spacing w:after="80"/>
+      </w:pPr>
+    </w:p>
+    <w:p>
+      <w:pPr>
+        <w:spacing w:before="200" w:after="0"/>
+        <w:ind w:left="0"/>
+        <w:shd w:val="clear" w:color="auto" w:fill="FEF3C7"/>
+        <w:pBdr>
+          <w:left w:val="single" w:sz="8" w:space="6" w:color="F59E0B"/>
+        </w:pBdr>
+      </w:pPr>
+      <w:r>
+        <w:rPr>
+          <w:rFonts w:ascii="Calibri" w:hAnsi="Calibri"/>
+          <w:b/>
+          <w:color w:val="924009"/>
+          <w:sz w:val="20"/>
+        </w:rPr>
+        <w:t>📸  📸 CAPTURE D'ÉCRAN — Firebase Console : nœud users/{uid} avec isPremium = true</w:t>
+      </w:r>
+    </w:p>
+    <w:p>
+      <w:pPr>
+        <w:spacing w:before="2835" w:after="240"/>
+        <w:ind w:left="0"/>
+        <w:shd w:val="clear" w:color="auto" w:fill="F9FAFB"/>
+        <w:pBdr>
+          <w:left w:val="single" w:sz="6" w:space="6" w:color="D1D5DB"/>
+        </w:pBdr>
+      </w:pPr>
+      <w:r>
+        <w:rPr>
+          <w:rFonts w:ascii="Calibri" w:hAnsi="Calibri"/>
+          <w:i/>
+          <w:color w:val="ABB5BF"/>
+          <w:sz w:val="18"/>
+        </w:rPr>
+        <w:t>[ Insérer la capture d'écran ici ]</w:t>
+      </w:r>
+    </w:p>
+    <w:p>
+      <w:pPr>
+        <w:pStyle w:val="Heading3"/>
+      </w:pPr>
+      <w:r>
+        <w:t>1.9 DELETE — Déconnexion et nettoyage</w:t>
       </w:r>
     </w:p>
     <w:p>

</xml_diff>

<commit_message>
fix(profil): email éditable + DELETE Firebase documenté dans livrables
- page_modification_profil.dart : email passé de readOnly à éditable
  (copyWith(email:) → DatabaseService.updateUserProfile())
- Livrable 2 : section 1.9 DELETE réécrite avec vrai .remove() Firebase
  (AgendaController.cancel() supprime les nœuds bookedSessions/)
- Livrable 4 : tableau champs modifiables mis à jour (email + téléphone en gras)
- Tous les livrables désormais conformes aux exigences exactes du prof
</commit_message>
<xml_diff>
--- a/livrables/docx/DIAPALER_AFRICA_Livrable2.docx
+++ b/livrables/docx/DIAPALER_AFRICA_Livrable2.docx
@@ -6653,7 +6653,472 @@
         <w:pStyle w:val="Heading3"/>
       </w:pPr>
       <w:r>
-        <w:t>1.9 DELETE — Déconnexion et nettoyage</w:t>
+        <w:t>1.9 DELETE — Suppression d'une session réservée (Firebase `.remove()`)</w:t>
+      </w:r>
+    </w:p>
+    <w:p>
+      <w:r>
+        <w:rPr>
+          <w:rFonts w:ascii="Calibri" w:hAnsi="Calibri"/>
+          <w:sz w:val="22"/>
+        </w:rPr>
+        <w:t xml:space="preserve">L'annulation d'un rendez-vous bilatéral supprime physiquement le nœud Firebase via </w:t>
+      </w:r>
+      <w:r>
+        <w:rPr>
+          <w:rFonts w:ascii="Courier New" w:hAnsi="Courier New"/>
+          <w:color w:val="DC2626"/>
+          <w:sz w:val="20"/>
+        </w:rPr>
+        <w:t>.remove()</w:t>
+      </w:r>
+      <w:r>
+        <w:rPr>
+          <w:rFonts w:ascii="Calibri" w:hAnsi="Calibri"/>
+          <w:sz w:val="22"/>
+        </w:rPr>
+        <w:t xml:space="preserve"> :</w:t>
+      </w:r>
+    </w:p>
+    <w:p>
+      <w:pPr>
+        <w:spacing w:before="0" w:after="0"/>
+        <w:ind w:left="283"/>
+        <w:shd w:val="clear" w:color="auto" w:fill="F3F4F6"/>
+      </w:pPr>
+      <w:r>
+        <w:rPr>
+          <w:rFonts w:ascii="Courier New" w:hAnsi="Courier New"/>
+          <w:color w:val="1F2D3D"/>
+          <w:sz w:val="18"/>
+        </w:rPr>
+        <w:t>// lib/services/service_agenda.dart — AgendaController.cancel()</w:t>
+      </w:r>
+    </w:p>
+    <w:p>
+      <w:pPr>
+        <w:spacing w:before="0" w:after="0"/>
+        <w:ind w:left="283"/>
+        <w:shd w:val="clear" w:color="auto" w:fill="F3F4F6"/>
+      </w:pPr>
+      <w:r>
+        <w:rPr>
+          <w:rFonts w:ascii="Courier New" w:hAnsi="Courier New"/>
+          <w:color w:val="1F2D3D"/>
+          <w:sz w:val="18"/>
+        </w:rPr>
+        <w:t>static Future&lt;void&gt; cancel({</w:t>
+      </w:r>
+    </w:p>
+    <w:p>
+      <w:pPr>
+        <w:spacing w:before="0" w:after="0"/>
+        <w:ind w:left="283"/>
+        <w:shd w:val="clear" w:color="auto" w:fill="F3F4F6"/>
+      </w:pPr>
+      <w:r>
+        <w:rPr>
+          <w:rFonts w:ascii="Courier New" w:hAnsi="Courier New"/>
+          <w:color w:val="1F2D3D"/>
+          <w:sz w:val="18"/>
+        </w:rPr>
+        <w:t xml:space="preserve">  required String userId,</w:t>
+      </w:r>
+    </w:p>
+    <w:p>
+      <w:pPr>
+        <w:spacing w:before="0" w:after="0"/>
+        <w:ind w:left="283"/>
+        <w:shd w:val="clear" w:color="auto" w:fill="F3F4F6"/>
+      </w:pPr>
+      <w:r>
+        <w:rPr>
+          <w:rFonts w:ascii="Courier New" w:hAnsi="Courier New"/>
+          <w:color w:val="1F2D3D"/>
+          <w:sz w:val="18"/>
+        </w:rPr>
+        <w:t xml:space="preserve">  required String userName,</w:t>
+      </w:r>
+    </w:p>
+    <w:p>
+      <w:pPr>
+        <w:spacing w:before="0" w:after="0"/>
+        <w:ind w:left="283"/>
+        <w:shd w:val="clear" w:color="auto" w:fill="F3F4F6"/>
+      </w:pPr>
+      <w:r>
+        <w:rPr>
+          <w:rFonts w:ascii="Courier New" w:hAnsi="Courier New"/>
+          <w:color w:val="1F2D3D"/>
+          <w:sz w:val="18"/>
+        </w:rPr>
+        <w:t xml:space="preserve">  required BookedSession session,</w:t>
+      </w:r>
+    </w:p>
+    <w:p>
+      <w:pPr>
+        <w:spacing w:before="0" w:after="0"/>
+        <w:ind w:left="283"/>
+        <w:shd w:val="clear" w:color="auto" w:fill="F3F4F6"/>
+      </w:pPr>
+      <w:r>
+        <w:rPr>
+          <w:rFonts w:ascii="Courier New" w:hAnsi="Courier New"/>
+          <w:color w:val="1F2D3D"/>
+          <w:sz w:val="18"/>
+        </w:rPr>
+        <w:t xml:space="preserve">  required String reason,</w:t>
+      </w:r>
+    </w:p>
+    <w:p>
+      <w:pPr>
+        <w:spacing w:before="0" w:after="0"/>
+        <w:ind w:left="283"/>
+        <w:shd w:val="clear" w:color="auto" w:fill="F3F4F6"/>
+      </w:pPr>
+      <w:r>
+        <w:rPr>
+          <w:rFonts w:ascii="Courier New" w:hAnsi="Courier New"/>
+          <w:color w:val="1F2D3D"/>
+          <w:sz w:val="18"/>
+        </w:rPr>
+        <w:t>}) async {</w:t>
+      </w:r>
+    </w:p>
+    <w:p>
+      <w:pPr>
+        <w:spacing w:before="0" w:after="0"/>
+        <w:ind w:left="283"/>
+        <w:shd w:val="clear" w:color="auto" w:fill="F3F4F6"/>
+      </w:pPr>
+      <w:r>
+        <w:rPr>
+          <w:rFonts w:ascii="Courier New" w:hAnsi="Courier New"/>
+          <w:color w:val="1F2D3D"/>
+          <w:sz w:val="18"/>
+        </w:rPr>
+        <w:t xml:space="preserve">  // DELETE côté annulant</w:t>
+      </w:r>
+    </w:p>
+    <w:p>
+      <w:pPr>
+        <w:spacing w:before="0" w:after="0"/>
+        <w:ind w:left="283"/>
+        <w:shd w:val="clear" w:color="auto" w:fill="F3F4F6"/>
+      </w:pPr>
+      <w:r>
+        <w:rPr>
+          <w:rFonts w:ascii="Courier New" w:hAnsi="Courier New"/>
+          <w:color w:val="1F2D3D"/>
+          <w:sz w:val="18"/>
+        </w:rPr>
+        <w:t xml:space="preserve">  await _db.child('bookedSessions/$userId/${session.id}').remove();</w:t>
+      </w:r>
+    </w:p>
+    <w:p>
+      <w:pPr>
+        <w:spacing w:before="0" w:after="0"/>
+        <w:ind w:left="283"/>
+        <w:shd w:val="clear" w:color="auto" w:fill="F3F4F6"/>
+      </w:pPr>
+      <w:r>
+        <w:rPr>
+          <w:rFonts w:ascii="Courier New" w:hAnsi="Courier New"/>
+          <w:color w:val="1F2D3D"/>
+          <w:sz w:val="18"/>
+        </w:rPr>
+        <w:t xml:space="preserve"> </w:t>
+      </w:r>
+    </w:p>
+    <w:p>
+      <w:pPr>
+        <w:spacing w:before="0" w:after="0"/>
+        <w:ind w:left="283"/>
+        <w:shd w:val="clear" w:color="auto" w:fill="F3F4F6"/>
+      </w:pPr>
+      <w:r>
+        <w:rPr>
+          <w:rFonts w:ascii="Courier New" w:hAnsi="Courier New"/>
+          <w:color w:val="1F2D3D"/>
+          <w:sz w:val="18"/>
+        </w:rPr>
+        <w:t xml:space="preserve">  // DELETE côté autre partie (si compte Firebase connu)</w:t>
+      </w:r>
+    </w:p>
+    <w:p>
+      <w:pPr>
+        <w:spacing w:before="0" w:after="0"/>
+        <w:ind w:left="283"/>
+        <w:shd w:val="clear" w:color="auto" w:fill="F3F4F6"/>
+      </w:pPr>
+      <w:r>
+        <w:rPr>
+          <w:rFonts w:ascii="Courier New" w:hAnsi="Courier New"/>
+          <w:color w:val="1F2D3D"/>
+          <w:sz w:val="18"/>
+        </w:rPr>
+        <w:t xml:space="preserve">  if (session.otherUid.isNotEmpty) {</w:t>
+      </w:r>
+    </w:p>
+    <w:p>
+      <w:pPr>
+        <w:spacing w:before="0" w:after="0"/>
+        <w:ind w:left="283"/>
+        <w:shd w:val="clear" w:color="auto" w:fill="F3F4F6"/>
+      </w:pPr>
+      <w:r>
+        <w:rPr>
+          <w:rFonts w:ascii="Courier New" w:hAnsi="Courier New"/>
+          <w:color w:val="1F2D3D"/>
+          <w:sz w:val="18"/>
+        </w:rPr>
+        <w:t xml:space="preserve">    await _db.child('bookedSessions/${session.otherUid}/${session.id}').remove();</w:t>
+      </w:r>
+    </w:p>
+    <w:p>
+      <w:pPr>
+        <w:spacing w:before="0" w:after="0"/>
+        <w:ind w:left="283"/>
+        <w:shd w:val="clear" w:color="auto" w:fill="F3F4F6"/>
+      </w:pPr>
+      <w:r>
+        <w:rPr>
+          <w:rFonts w:ascii="Courier New" w:hAnsi="Courier New"/>
+          <w:color w:val="1F2D3D"/>
+          <w:sz w:val="18"/>
+        </w:rPr>
+        <w:t xml:space="preserve">  }</w:t>
+      </w:r>
+    </w:p>
+    <w:p>
+      <w:pPr>
+        <w:spacing w:before="0" w:after="0"/>
+        <w:ind w:left="283"/>
+        <w:shd w:val="clear" w:color="auto" w:fill="F3F4F6"/>
+      </w:pPr>
+      <w:r>
+        <w:rPr>
+          <w:rFonts w:ascii="Courier New" w:hAnsi="Courier New"/>
+          <w:color w:val="1F2D3D"/>
+          <w:sz w:val="18"/>
+        </w:rPr>
+        <w:t xml:space="preserve"> </w:t>
+      </w:r>
+    </w:p>
+    <w:p>
+      <w:pPr>
+        <w:spacing w:before="0" w:after="0"/>
+        <w:ind w:left="283"/>
+        <w:shd w:val="clear" w:color="auto" w:fill="F3F4F6"/>
+      </w:pPr>
+      <w:r>
+        <w:rPr>
+          <w:rFonts w:ascii="Courier New" w:hAnsi="Courier New"/>
+          <w:color w:val="1F2D3D"/>
+          <w:sz w:val="18"/>
+        </w:rPr>
+        <w:t xml:space="preserve">  // Notifications croisées de l'annulation</w:t>
+      </w:r>
+    </w:p>
+    <w:p>
+      <w:pPr>
+        <w:spacing w:before="0" w:after="0"/>
+        <w:ind w:left="283"/>
+        <w:shd w:val="clear" w:color="auto" w:fill="F3F4F6"/>
+      </w:pPr>
+      <w:r>
+        <w:rPr>
+          <w:rFonts w:ascii="Courier New" w:hAnsi="Courier New"/>
+          <w:color w:val="1F2D3D"/>
+          <w:sz w:val="18"/>
+        </w:rPr>
+        <w:t xml:space="preserve">  await NotificationService.addNotification(</w:t>
+      </w:r>
+    </w:p>
+    <w:p>
+      <w:pPr>
+        <w:spacing w:before="0" w:after="0"/>
+        <w:ind w:left="283"/>
+        <w:shd w:val="clear" w:color="auto" w:fill="F3F4F6"/>
+      </w:pPr>
+      <w:r>
+        <w:rPr>
+          <w:rFonts w:ascii="Courier New" w:hAnsi="Courier New"/>
+          <w:color w:val="1F2D3D"/>
+          <w:sz w:val="18"/>
+        </w:rPr>
+        <w:t xml:space="preserve">    title: 'Rendez-vous annulé',</w:t>
+      </w:r>
+    </w:p>
+    <w:p>
+      <w:pPr>
+        <w:spacing w:before="0" w:after="0"/>
+        <w:ind w:left="283"/>
+        <w:shd w:val="clear" w:color="auto" w:fill="F3F4F6"/>
+      </w:pPr>
+      <w:r>
+        <w:rPr>
+          <w:rFonts w:ascii="Courier New" w:hAnsi="Courier New"/>
+          <w:color w:val="1F2D3D"/>
+          <w:sz w:val="18"/>
+        </w:rPr>
+        <w:t xml:space="preserve">    message: 'Session avec ${session.mentorName} annulée — motif : $reason',</w:t>
+      </w:r>
+    </w:p>
+    <w:p>
+      <w:pPr>
+        <w:spacing w:before="0" w:after="0"/>
+        <w:ind w:left="283"/>
+        <w:shd w:val="clear" w:color="auto" w:fill="F3F4F6"/>
+      </w:pPr>
+      <w:r>
+        <w:rPr>
+          <w:rFonts w:ascii="Courier New" w:hAnsi="Courier New"/>
+          <w:color w:val="1F2D3D"/>
+          <w:sz w:val="18"/>
+        </w:rPr>
+        <w:t xml:space="preserve">    type: 'session_cancelled',</w:t>
+      </w:r>
+    </w:p>
+    <w:p>
+      <w:pPr>
+        <w:spacing w:before="0" w:after="0"/>
+        <w:ind w:left="283"/>
+        <w:shd w:val="clear" w:color="auto" w:fill="F3F4F6"/>
+      </w:pPr>
+      <w:r>
+        <w:rPr>
+          <w:rFonts w:ascii="Courier New" w:hAnsi="Courier New"/>
+          <w:color w:val="1F2D3D"/>
+          <w:sz w:val="18"/>
+        </w:rPr>
+        <w:t xml:space="preserve">  );</w:t>
+      </w:r>
+    </w:p>
+    <w:p>
+      <w:pPr>
+        <w:spacing w:before="0" w:after="0"/>
+        <w:ind w:left="283"/>
+        <w:shd w:val="clear" w:color="auto" w:fill="F3F4F6"/>
+      </w:pPr>
+      <w:r>
+        <w:rPr>
+          <w:rFonts w:ascii="Courier New" w:hAnsi="Courier New"/>
+          <w:color w:val="1F2D3D"/>
+          <w:sz w:val="18"/>
+        </w:rPr>
+        <w:t>}</w:t>
+      </w:r>
+    </w:p>
+    <w:p>
+      <w:pPr>
+        <w:spacing w:after="80"/>
+      </w:pPr>
+    </w:p>
+    <w:p>
+      <w:r>
+        <w:rPr>
+          <w:rFonts w:ascii="Calibri" w:hAnsi="Calibri"/>
+          <w:b/>
+          <w:sz w:val="22"/>
+        </w:rPr>
+        <w:t>Nœud supprimé dans Firebase :</w:t>
+      </w:r>
+    </w:p>
+    <w:p>
+      <w:pPr>
+        <w:spacing w:before="0" w:after="0"/>
+        <w:ind w:left="283"/>
+        <w:shd w:val="clear" w:color="auto" w:fill="F3F4F6"/>
+      </w:pPr>
+      <w:r>
+        <w:rPr>
+          <w:rFonts w:ascii="Courier New" w:hAnsi="Courier New"/>
+          <w:color w:val="1F2D3D"/>
+          <w:sz w:val="18"/>
+        </w:rPr>
+        <w:t>bookedSessions/</w:t>
+      </w:r>
+    </w:p>
+    <w:p>
+      <w:pPr>
+        <w:spacing w:before="0" w:after="0"/>
+        <w:ind w:left="283"/>
+        <w:shd w:val="clear" w:color="auto" w:fill="F3F4F6"/>
+      </w:pPr>
+      <w:r>
+        <w:rPr>
+          <w:rFonts w:ascii="Courier New" w:hAnsi="Courier New"/>
+          <w:color w:val="1F2D3D"/>
+          <w:sz w:val="18"/>
+        </w:rPr>
+        <w:t>└── {userId}/</w:t>
+      </w:r>
+    </w:p>
+    <w:p>
+      <w:pPr>
+        <w:spacing w:before="0" w:after="0"/>
+        <w:ind w:left="283"/>
+        <w:shd w:val="clear" w:color="auto" w:fill="F3F4F6"/>
+      </w:pPr>
+      <w:r>
+        <w:rPr>
+          <w:rFonts w:ascii="Courier New" w:hAnsi="Courier New"/>
+          <w:color w:val="1F2D3D"/>
+          <w:sz w:val="18"/>
+        </w:rPr>
+        <w:t xml:space="preserve">    └── {sessionId}  ← .remove() → nœud entièrement effacé</w:t>
+      </w:r>
+    </w:p>
+    <w:p>
+      <w:pPr>
+        <w:spacing w:after="80"/>
+      </w:pPr>
+    </w:p>
+    <w:p>
+      <w:pPr>
+        <w:spacing w:before="200" w:after="0"/>
+        <w:ind w:left="0"/>
+        <w:shd w:val="clear" w:color="auto" w:fill="FEF3C7"/>
+        <w:pBdr>
+          <w:left w:val="single" w:sz="8" w:space="6" w:color="F59E0B"/>
+        </w:pBdr>
+      </w:pPr>
+      <w:r>
+        <w:rPr>
+          <w:rFonts w:ascii="Calibri" w:hAnsi="Calibri"/>
+          <w:b/>
+          <w:color w:val="924009"/>
+          <w:sz w:val="20"/>
+        </w:rPr>
+        <w:t>📸  📸 CAPTURE D'ÉCRAN — Console Firebase : nœud bookedSessions après annulation (nœud disparu)</w:t>
+      </w:r>
+    </w:p>
+    <w:p>
+      <w:pPr>
+        <w:spacing w:before="2835" w:after="240"/>
+        <w:ind w:left="0"/>
+        <w:shd w:val="clear" w:color="auto" w:fill="F9FAFB"/>
+        <w:pBdr>
+          <w:left w:val="single" w:sz="6" w:space="6" w:color="D1D5DB"/>
+        </w:pBdr>
+      </w:pPr>
+      <w:r>
+        <w:rPr>
+          <w:rFonts w:ascii="Calibri" w:hAnsi="Calibri"/>
+          <w:i/>
+          <w:color w:val="ABB5BF"/>
+          <w:sz w:val="18"/>
+        </w:rPr>
+        <w:t>[ Insérer la capture d'écran ici ]</w:t>
+      </w:r>
+    </w:p>
+    <w:p>
+      <w:pPr>
+        <w:pStyle w:val="Heading3"/>
+      </w:pPr>
+      <w:r>
+        <w:t>1.10 DELETE — Déconnexion et nettoyage du cache local</w:t>
       </w:r>
     </w:p>
     <w:p>

</xml_diff>

<commit_message>
feat: DIAPALER AFRICA v1.0 — version finale complète
- isPremium/premiumPlan : modèle + Firebase + cache + badge profil
- WaveService.activatePremium() : badge visible instantanément (ValueNotifier)
- Email éditable dans modification profil → sauvegardé Firebase
- ServicePartage (share_plus) : partage pitch/profil sur réseaux sociaux
- APK release signé 57.9MB — lien : https://drive.google.com/file/d/1BGuJWRnuixcEPl0bMOqY-3E6v-TexXlN
- Livrables 1-6 tous mis à jour et docx regénérés
</commit_message>
<xml_diff>
--- a/livrables/docx/DIAPALER_AFRICA_Livrable2.docx
+++ b/livrables/docx/DIAPALER_AFRICA_Livrable2.docx
@@ -6587,22 +6587,172 @@
           <w:color w:val="1F2D3D"/>
           <w:sz w:val="18"/>
         </w:rPr>
-        <w:t>await WaveService.activatePremium(plan);</w:t>
-      </w:r>
-    </w:p>
-    <w:p>
-      <w:pPr>
-        <w:spacing w:before="0" w:after="0"/>
-        <w:ind w:left="283"/>
-        <w:shd w:val="clear" w:color="auto" w:fill="F3F4F6"/>
-      </w:pPr>
-      <w:r>
-        <w:rPr>
-          <w:rFonts w:ascii="Courier New" w:hAnsi="Courier New"/>
-          <w:color w:val="1F2D3D"/>
-          <w:sz w:val="18"/>
-        </w:rPr>
-        <w:t>// → Firebase : users/{uid}/isPremium = true</w:t>
+        <w:t>static Future&lt;void&gt; activatePremium(PremiumPlan plan) async {</w:t>
+      </w:r>
+    </w:p>
+    <w:p>
+      <w:pPr>
+        <w:spacing w:before="0" w:after="0"/>
+        <w:ind w:left="283"/>
+        <w:shd w:val="clear" w:color="auto" w:fill="F3F4F6"/>
+      </w:pPr>
+      <w:r>
+        <w:rPr>
+          <w:rFonts w:ascii="Courier New" w:hAnsi="Courier New"/>
+          <w:color w:val="1F2D3D"/>
+          <w:sz w:val="18"/>
+        </w:rPr>
+        <w:t xml:space="preserve">  final uid = AuthService.currentUid;</w:t>
+      </w:r>
+    </w:p>
+    <w:p>
+      <w:pPr>
+        <w:spacing w:before="0" w:after="0"/>
+        <w:ind w:left="283"/>
+        <w:shd w:val="clear" w:color="auto" w:fill="F3F4F6"/>
+      </w:pPr>
+      <w:r>
+        <w:rPr>
+          <w:rFonts w:ascii="Courier New" w:hAnsi="Courier New"/>
+          <w:color w:val="1F2D3D"/>
+          <w:sz w:val="18"/>
+        </w:rPr>
+        <w:t xml:space="preserve">  if (uid == null) return;</w:t>
+      </w:r>
+    </w:p>
+    <w:p>
+      <w:pPr>
+        <w:spacing w:before="0" w:after="0"/>
+        <w:ind w:left="283"/>
+        <w:shd w:val="clear" w:color="auto" w:fill="F3F4F6"/>
+      </w:pPr>
+      <w:r>
+        <w:rPr>
+          <w:rFonts w:ascii="Courier New" w:hAnsi="Courier New"/>
+          <w:color w:val="1F2D3D"/>
+          <w:sz w:val="18"/>
+        </w:rPr>
+        <w:t xml:space="preserve">  // 1. Écriture Firebase</w:t>
+      </w:r>
+    </w:p>
+    <w:p>
+      <w:pPr>
+        <w:spacing w:before="0" w:after="0"/>
+        <w:ind w:left="283"/>
+        <w:shd w:val="clear" w:color="auto" w:fill="F3F4F6"/>
+      </w:pPr>
+      <w:r>
+        <w:rPr>
+          <w:rFonts w:ascii="Courier New" w:hAnsi="Courier New"/>
+          <w:color w:val="1F2D3D"/>
+          <w:sz w:val="18"/>
+        </w:rPr>
+        <w:t xml:space="preserve">  await DatabaseService.setPremium(uid: uid, plan: plan.name);</w:t>
+      </w:r>
+    </w:p>
+    <w:p>
+      <w:pPr>
+        <w:spacing w:before="0" w:after="0"/>
+        <w:ind w:left="283"/>
+        <w:shd w:val="clear" w:color="auto" w:fill="F3F4F6"/>
+      </w:pPr>
+      <w:r>
+        <w:rPr>
+          <w:rFonts w:ascii="Courier New" w:hAnsi="Courier New"/>
+          <w:color w:val="1F2D3D"/>
+          <w:sz w:val="18"/>
+        </w:rPr>
+        <w:t xml:space="preserve">  // 2. Mise à jour en mémoire → badge ⭐ visible instantanément</w:t>
+      </w:r>
+    </w:p>
+    <w:p>
+      <w:pPr>
+        <w:spacing w:before="0" w:after="0"/>
+        <w:ind w:left="283"/>
+        <w:shd w:val="clear" w:color="auto" w:fill="F3F4F6"/>
+      </w:pPr>
+      <w:r>
+        <w:rPr>
+          <w:rFonts w:ascii="Courier New" w:hAnsi="Courier New"/>
+          <w:color w:val="1F2D3D"/>
+          <w:sz w:val="18"/>
+        </w:rPr>
+        <w:t xml:space="preserve">  final updated = UserProfileController.profile.value.copyWith(</w:t>
+      </w:r>
+    </w:p>
+    <w:p>
+      <w:pPr>
+        <w:spacing w:before="0" w:after="0"/>
+        <w:ind w:left="283"/>
+        <w:shd w:val="clear" w:color="auto" w:fill="F3F4F6"/>
+      </w:pPr>
+      <w:r>
+        <w:rPr>
+          <w:rFonts w:ascii="Courier New" w:hAnsi="Courier New"/>
+          <w:color w:val="1F2D3D"/>
+          <w:sz w:val="18"/>
+        </w:rPr>
+        <w:t xml:space="preserve">    isPremium: true,</w:t>
+      </w:r>
+    </w:p>
+    <w:p>
+      <w:pPr>
+        <w:spacing w:before="0" w:after="0"/>
+        <w:ind w:left="283"/>
+        <w:shd w:val="clear" w:color="auto" w:fill="F3F4F6"/>
+      </w:pPr>
+      <w:r>
+        <w:rPr>
+          <w:rFonts w:ascii="Courier New" w:hAnsi="Courier New"/>
+          <w:color w:val="1F2D3D"/>
+          <w:sz w:val="18"/>
+        </w:rPr>
+        <w:t xml:space="preserve">    premiumPlan: plan.name,</w:t>
+      </w:r>
+    </w:p>
+    <w:p>
+      <w:pPr>
+        <w:spacing w:before="0" w:after="0"/>
+        <w:ind w:left="283"/>
+        <w:shd w:val="clear" w:color="auto" w:fill="F3F4F6"/>
+      </w:pPr>
+      <w:r>
+        <w:rPr>
+          <w:rFonts w:ascii="Courier New" w:hAnsi="Courier New"/>
+          <w:color w:val="1F2D3D"/>
+          <w:sz w:val="18"/>
+        </w:rPr>
+        <w:t xml:space="preserve">  );</w:t>
+      </w:r>
+    </w:p>
+    <w:p>
+      <w:pPr>
+        <w:spacing w:before="0" w:after="0"/>
+        <w:ind w:left="283"/>
+        <w:shd w:val="clear" w:color="auto" w:fill="F3F4F6"/>
+      </w:pPr>
+      <w:r>
+        <w:rPr>
+          <w:rFonts w:ascii="Courier New" w:hAnsi="Courier New"/>
+          <w:color w:val="1F2D3D"/>
+          <w:sz w:val="18"/>
+        </w:rPr>
+        <w:t xml:space="preserve">  UserProfileController.update(updated); // → cache local + Firebase</w:t>
+      </w:r>
+    </w:p>
+    <w:p>
+      <w:pPr>
+        <w:spacing w:before="0" w:after="0"/>
+        <w:ind w:left="283"/>
+        <w:shd w:val="clear" w:color="auto" w:fill="F3F4F6"/>
+      </w:pPr>
+      <w:r>
+        <w:rPr>
+          <w:rFonts w:ascii="Courier New" w:hAnsi="Courier New"/>
+          <w:color w:val="1F2D3D"/>
+          <w:sz w:val="18"/>
+        </w:rPr>
+        <w:t>}</w:t>
       </w:r>
     </w:p>
     <w:p>

</xml_diff>

<commit_message>
fix(livrables): audit final code↔docs, toutes incohérences corrigées
- L1/L6 : compteur services corrigé 10 → 12 (ajout service_partage + service_wave)
- L2 : DELETE AgendaController.cancel() ajouté au tableau CRUD et conclusion
- L4 : email documenté modifiable + _email controller dans initState
- L5/L6 : taille APK uniformisée 54.2MB → 57.9MB (5 occurrences)
- Régénération complète des 6 docx
</commit_message>
<xml_diff>
--- a/livrables/docx/DIAPALER_AFRICA_Livrable2.docx
+++ b/livrables/docx/DIAPALER_AFRICA_Livrable2.docx
@@ -16493,13 +16493,83 @@
                 <w:rFonts w:ascii="Calibri" w:hAnsi="Calibri"/>
                 <w:sz w:val="20"/>
               </w:rPr>
-              <w:t xml:space="preserve"> session</w:t>
+              <w:t xml:space="preserve"> session réservée</w:t>
             </w:r>
           </w:p>
         </w:tc>
         <w:tc>
           <w:tcPr>
             <w:tcW w:type="dxa" w:w="2351"/>
+          </w:tcPr>
+          <w:p>
+            <w:r>
+              <w:rPr>
+                <w:rFonts w:ascii="Calibri" w:hAnsi="Calibri"/>
+                <w:color w:val="DC2626"/>
+                <w:sz w:val="20"/>
+              </w:rPr>
+              <w:t>AgendaController</w:t>
+            </w:r>
+          </w:p>
+        </w:tc>
+        <w:tc>
+          <w:tcPr>
+            <w:tcW w:type="dxa" w:w="2351"/>
+          </w:tcPr>
+          <w:p>
+            <w:r>
+              <w:rPr>
+                <w:rFonts w:ascii="Calibri" w:hAnsi="Calibri"/>
+                <w:color w:val="DC2626"/>
+                <w:sz w:val="20"/>
+              </w:rPr>
+              <w:t>bookedSessions/{uid}/{id}.remove()</w:t>
+            </w:r>
+          </w:p>
+        </w:tc>
+        <w:tc>
+          <w:tcPr>
+            <w:tcW w:type="dxa" w:w="2351"/>
+          </w:tcPr>
+          <w:p>
+            <w:r>
+              <w:rPr>
+                <w:rFonts w:ascii="Calibri" w:hAnsi="Calibri"/>
+                <w:sz w:val="20"/>
+              </w:rPr>
+              <w:t>Annulation rendez-vous</w:t>
+            </w:r>
+          </w:p>
+        </w:tc>
+      </w:tr>
+      <w:tr>
+        <w:tc>
+          <w:tcPr>
+            <w:tcW w:type="dxa" w:w="2351"/>
+            <w:shd w:val="clear" w:color="auto" w:fill="EFF6FF"/>
+          </w:tcPr>
+          <w:p>
+            <w:r>
+              <w:rPr>
+                <w:rFonts w:ascii="Calibri" w:hAnsi="Calibri"/>
+                <w:b/>
+                <w:sz w:val="20"/>
+              </w:rPr>
+              <w:t>DELETE</w:t>
+            </w:r>
+            <w:r>
+              <w:rPr>
+                <w:rFonts w:ascii="Calibri" w:hAnsi="Calibri"/>
+                <w:sz w:val="20"/>
+              </w:rPr>
+              <w:t xml:space="preserve"> déconnexion</w:t>
+            </w:r>
+          </w:p>
+        </w:tc>
+        <w:tc>
+          <w:tcPr>
+            <w:tcW w:type="dxa" w:w="2351"/>
+            <w:shd w:val="clear" w:color="auto" w:fill="EFF6FF"/>
           </w:tcPr>
           <w:p>
             <w:r>
@@ -16515,6 +16585,7 @@
         <w:tc>
           <w:tcPr>
             <w:tcW w:type="dxa" w:w="2351"/>
+            <w:shd w:val="clear" w:color="auto" w:fill="EFF6FF"/>
           </w:tcPr>
           <w:p>
             <w:r>
@@ -16524,6 +16595,75 @@
                 <w:sz w:val="20"/>
               </w:rPr>
               <w:t>signOut()</w:t>
+            </w:r>
+          </w:p>
+        </w:tc>
+        <w:tc>
+          <w:tcPr>
+            <w:tcW w:type="dxa" w:w="2351"/>
+            <w:shd w:val="clear" w:color="auto" w:fill="EFF6FF"/>
+          </w:tcPr>
+          <w:p>
+            <w:r>
+              <w:rPr>
+                <w:rFonts w:ascii="Calibri" w:hAnsi="Calibri"/>
+                <w:sz w:val="20"/>
+              </w:rPr>
+              <w:t>Déconnexion</w:t>
+            </w:r>
+          </w:p>
+        </w:tc>
+      </w:tr>
+      <w:tr>
+        <w:tc>
+          <w:tcPr>
+            <w:tcW w:type="dxa" w:w="2351"/>
+          </w:tcPr>
+          <w:p>
+            <w:r>
+              <w:rPr>
+                <w:rFonts w:ascii="Calibri" w:hAnsi="Calibri"/>
+                <w:b/>
+                <w:sz w:val="20"/>
+              </w:rPr>
+              <w:t>DELETE</w:t>
+            </w:r>
+            <w:r>
+              <w:rPr>
+                <w:rFonts w:ascii="Calibri" w:hAnsi="Calibri"/>
+                <w:sz w:val="20"/>
+              </w:rPr>
+              <w:t xml:space="preserve"> cache local</w:t>
+            </w:r>
+          </w:p>
+        </w:tc>
+        <w:tc>
+          <w:tcPr>
+            <w:tcW w:type="dxa" w:w="2351"/>
+          </w:tcPr>
+          <w:p>
+            <w:r>
+              <w:rPr>
+                <w:rFonts w:ascii="Calibri" w:hAnsi="Calibri"/>
+                <w:color w:val="DC2626"/>
+                <w:sz w:val="20"/>
+              </w:rPr>
+              <w:t>CacheService</w:t>
+            </w:r>
+          </w:p>
+        </w:tc>
+        <w:tc>
+          <w:tcPr>
+            <w:tcW w:type="dxa" w:w="2351"/>
+          </w:tcPr>
+          <w:p>
+            <w:r>
+              <w:rPr>
+                <w:rFonts w:ascii="Calibri" w:hAnsi="Calibri"/>
+                <w:color w:val="DC2626"/>
+                <w:sz w:val="20"/>
+              </w:rPr>
+              <w:t>prefs.remove(key)</w:t>
             </w:r>
           </w:p>
         </w:tc>
@@ -16555,14 +16695,14 @@
                 <w:b/>
                 <w:sz w:val="20"/>
               </w:rPr>
-              <w:t>DELETE</w:t>
+              <w:t>POST</w:t>
             </w:r>
             <w:r>
               <w:rPr>
                 <w:rFonts w:ascii="Calibri" w:hAnsi="Calibri"/>
                 <w:sz w:val="20"/>
               </w:rPr>
-              <w:t xml:space="preserve"> cache local</w:t>
+              <w:t xml:space="preserve"> message IA</w:t>
             </w:r>
           </w:p>
         </w:tc>
@@ -16578,7 +16718,7 @@
                 <w:color w:val="DC2626"/>
                 <w:sz w:val="20"/>
               </w:rPr>
-              <w:t>CacheService</w:t>
+              <w:t>ChatbotService</w:t>
             </w:r>
           </w:p>
         </w:tc>
@@ -16586,75 +16726,6 @@
           <w:tcPr>
             <w:tcW w:type="dxa" w:w="2351"/>
             <w:shd w:val="clear" w:color="auto" w:fill="EFF6FF"/>
-          </w:tcPr>
-          <w:p>
-            <w:r>
-              <w:rPr>
-                <w:rFonts w:ascii="Calibri" w:hAnsi="Calibri"/>
-                <w:color w:val="DC2626"/>
-                <w:sz w:val="20"/>
-              </w:rPr>
-              <w:t>prefs.remove(key)</w:t>
-            </w:r>
-          </w:p>
-        </w:tc>
-        <w:tc>
-          <w:tcPr>
-            <w:tcW w:type="dxa" w:w="2351"/>
-            <w:shd w:val="clear" w:color="auto" w:fill="EFF6FF"/>
-          </w:tcPr>
-          <w:p>
-            <w:r>
-              <w:rPr>
-                <w:rFonts w:ascii="Calibri" w:hAnsi="Calibri"/>
-                <w:sz w:val="20"/>
-              </w:rPr>
-              <w:t>Déconnexion</w:t>
-            </w:r>
-          </w:p>
-        </w:tc>
-      </w:tr>
-      <w:tr>
-        <w:tc>
-          <w:tcPr>
-            <w:tcW w:type="dxa" w:w="2351"/>
-          </w:tcPr>
-          <w:p>
-            <w:r>
-              <w:rPr>
-                <w:rFonts w:ascii="Calibri" w:hAnsi="Calibri"/>
-                <w:b/>
-                <w:sz w:val="20"/>
-              </w:rPr>
-              <w:t>POST</w:t>
-            </w:r>
-            <w:r>
-              <w:rPr>
-                <w:rFonts w:ascii="Calibri" w:hAnsi="Calibri"/>
-                <w:sz w:val="20"/>
-              </w:rPr>
-              <w:t xml:space="preserve"> message IA</w:t>
-            </w:r>
-          </w:p>
-        </w:tc>
-        <w:tc>
-          <w:tcPr>
-            <w:tcW w:type="dxa" w:w="2351"/>
-          </w:tcPr>
-          <w:p>
-            <w:r>
-              <w:rPr>
-                <w:rFonts w:ascii="Calibri" w:hAnsi="Calibri"/>
-                <w:color w:val="DC2626"/>
-                <w:sz w:val="20"/>
-              </w:rPr>
-              <w:t>ChatbotService</w:t>
-            </w:r>
-          </w:p>
-        </w:tc>
-        <w:tc>
-          <w:tcPr>
-            <w:tcW w:type="dxa" w:w="2351"/>
           </w:tcPr>
           <w:p>
             <w:r>
@@ -16677,6 +16748,7 @@
         <w:tc>
           <w:tcPr>
             <w:tcW w:type="dxa" w:w="2351"/>
+            <w:shd w:val="clear" w:color="auto" w:fill="EFF6FF"/>
           </w:tcPr>
           <w:p>
             <w:r>
@@ -17147,6 +17219,36 @@
                 <w:color w:val="DC2626"/>
                 <w:sz w:val="20"/>
               </w:rPr>
+              <w:t>AgendaController.cancel()</w:t>
+            </w:r>
+            <w:r>
+              <w:rPr>
+                <w:rFonts w:ascii="Calibri" w:hAnsi="Calibri"/>
+                <w:sz w:val="20"/>
+              </w:rPr>
+              <w:t xml:space="preserve"> → </w:t>
+            </w:r>
+            <w:r>
+              <w:rPr>
+                <w:rFonts w:ascii="Calibri" w:hAnsi="Calibri"/>
+                <w:color w:val="DC2626"/>
+                <w:sz w:val="20"/>
+              </w:rPr>
+              <w:t>bookedSessions/{uid}/{id}.remove()</w:t>
+            </w:r>
+            <w:r>
+              <w:rPr>
+                <w:rFonts w:ascii="Calibri" w:hAnsi="Calibri"/>
+                <w:sz w:val="20"/>
+              </w:rPr>
+              <w:t xml:space="preserve"> (Firebase réel) + </w:t>
+            </w:r>
+            <w:r>
+              <w:rPr>
+                <w:rFonts w:ascii="Calibri" w:hAnsi="Calibri"/>
+                <w:color w:val="DC2626"/>
+                <w:sz w:val="20"/>
+              </w:rPr>
               <w:t>signOut()</w:t>
             </w:r>
             <w:r>
@@ -17154,22 +17256,7 @@
                 <w:rFonts w:ascii="Calibri" w:hAnsi="Calibri"/>
                 <w:sz w:val="20"/>
               </w:rPr>
-              <w:t xml:space="preserve"> + </w:t>
-            </w:r>
-            <w:r>
-              <w:rPr>
-                <w:rFonts w:ascii="Calibri" w:hAnsi="Calibri"/>
-                <w:color w:val="DC2626"/>
-                <w:sz w:val="20"/>
-              </w:rPr>
-              <w:t>CacheService.clear()</w:t>
-            </w:r>
-            <w:r>
-              <w:rPr>
-                <w:rFonts w:ascii="Calibri" w:hAnsi="Calibri"/>
-                <w:sz w:val="20"/>
-              </w:rPr>
-              <w:t xml:space="preserve"> (déconnexion)</w:t>
+              <w:t xml:space="preserve"> / cache</w:t>
             </w:r>
           </w:p>
         </w:tc>

</xml_diff>

<commit_message>
fix: audit final complet — 4 bugs code + 9 incohérences livrables
Code: dispose PageController, dispose _email, StreamSubscription listeners
Livrables: nœuds Firebase corrects (bookedSessions/notifications), compteurs
services/packages/nœuds à jour, trees services complets
</commit_message>
<xml_diff>
--- a/livrables/docx/DIAPALER_AFRICA_Livrable2.docx
+++ b/livrables/docx/DIAPALER_AFRICA_Livrable2.docx
@@ -1487,7 +1487,7 @@
                 <w:rFonts w:ascii="Calibri" w:hAnsi="Calibri"/>
                 <w:sz w:val="20"/>
               </w:rPr>
-              <w:t>Profils, pitchs, messages, agenda, demandes mentorat</w:t>
+              <w:t>Profils, pitchs, messages, sessions, demandes mentorat, notifications</w:t>
             </w:r>
           </w:p>
         </w:tc>
@@ -1644,7 +1644,7 @@
                 <w:rFonts w:ascii="Calibri" w:hAnsi="Calibri"/>
                 <w:sz w:val="20"/>
               </w:rPr>
-              <w:t>Profils utilisateurs, pitchs, agenda</w:t>
+              <w:t>Profils utilisateurs, pitchs, Premium</w:t>
             </w:r>
           </w:p>
         </w:tc>
@@ -3414,7 +3414,142 @@
           <w:color w:val="1F2D3D"/>
           <w:sz w:val="18"/>
         </w:rPr>
-        <w:t>└── agenda/</w:t>
+        <w:t>├── bookedSessions/</w:t>
+      </w:r>
+    </w:p>
+    <w:p>
+      <w:pPr>
+        <w:spacing w:before="0" w:after="0"/>
+        <w:ind w:left="283"/>
+        <w:shd w:val="clear" w:color="auto" w:fill="F3F4F6"/>
+      </w:pPr>
+      <w:r>
+        <w:rPr>
+          <w:rFonts w:ascii="Courier New" w:hAnsi="Courier New"/>
+          <w:color w:val="1F2D3D"/>
+          <w:sz w:val="18"/>
+        </w:rPr>
+        <w:t>│   └── {uid}/</w:t>
+      </w:r>
+    </w:p>
+    <w:p>
+      <w:pPr>
+        <w:spacing w:before="0" w:after="0"/>
+        <w:ind w:left="283"/>
+        <w:shd w:val="clear" w:color="auto" w:fill="F3F4F6"/>
+      </w:pPr>
+      <w:r>
+        <w:rPr>
+          <w:rFonts w:ascii="Courier New" w:hAnsi="Courier New"/>
+          <w:color w:val="1F2D3D"/>
+          <w:sz w:val="18"/>
+        </w:rPr>
+        <w:t>│       └── {sessionId}/</w:t>
+      </w:r>
+    </w:p>
+    <w:p>
+      <w:pPr>
+        <w:spacing w:before="0" w:after="0"/>
+        <w:ind w:left="283"/>
+        <w:shd w:val="clear" w:color="auto" w:fill="F3F4F6"/>
+      </w:pPr>
+      <w:r>
+        <w:rPr>
+          <w:rFonts w:ascii="Courier New" w:hAnsi="Courier New"/>
+          <w:color w:val="1F2D3D"/>
+          <w:sz w:val="18"/>
+        </w:rPr>
+        <w:t>│           ├── id              → "1748123456789"</w:t>
+      </w:r>
+    </w:p>
+    <w:p>
+      <w:pPr>
+        <w:spacing w:before="0" w:after="0"/>
+        <w:ind w:left="283"/>
+        <w:shd w:val="clear" w:color="auto" w:fill="F3F4F6"/>
+      </w:pPr>
+      <w:r>
+        <w:rPr>
+          <w:rFonts w:ascii="Courier New" w:hAnsi="Courier New"/>
+          <w:color w:val="1F2D3D"/>
+          <w:sz w:val="18"/>
+        </w:rPr>
+        <w:t>│           ├── mentorName      → "Ibrahima Sall"</w:t>
+      </w:r>
+    </w:p>
+    <w:p>
+      <w:pPr>
+        <w:spacing w:before="0" w:after="0"/>
+        <w:ind w:left="283"/>
+        <w:shd w:val="clear" w:color="auto" w:fill="F3F4F6"/>
+      </w:pPr>
+      <w:r>
+        <w:rPr>
+          <w:rFonts w:ascii="Courier New" w:hAnsi="Courier New"/>
+          <w:color w:val="1F2D3D"/>
+          <w:sz w:val="18"/>
+        </w:rPr>
+        <w:t>│           ├── mentorInitials  → "IS"</w:t>
+      </w:r>
+    </w:p>
+    <w:p>
+      <w:pPr>
+        <w:spacing w:before="0" w:after="0"/>
+        <w:ind w:left="283"/>
+        <w:shd w:val="clear" w:color="auto" w:fill="F3F4F6"/>
+      </w:pPr>
+      <w:r>
+        <w:rPr>
+          <w:rFonts w:ascii="Courier New" w:hAnsi="Courier New"/>
+          <w:color w:val="1F2D3D"/>
+          <w:sz w:val="18"/>
+        </w:rPr>
+        <w:t>│           ├── scheduledAt     → "2025-06-15T10:00:00.000"</w:t>
+      </w:r>
+    </w:p>
+    <w:p>
+      <w:pPr>
+        <w:spacing w:before="0" w:after="0"/>
+        <w:ind w:left="283"/>
+        <w:shd w:val="clear" w:color="auto" w:fill="F3F4F6"/>
+      </w:pPr>
+      <w:r>
+        <w:rPr>
+          <w:rFonts w:ascii="Courier New" w:hAnsi="Courier New"/>
+          <w:color w:val="1F2D3D"/>
+          <w:sz w:val="18"/>
+        </w:rPr>
+        <w:t>│           └── otherUid        → "uid_mentor" (vide si mentor statique)</w:t>
+      </w:r>
+    </w:p>
+    <w:p>
+      <w:pPr>
+        <w:spacing w:before="0" w:after="0"/>
+        <w:ind w:left="283"/>
+        <w:shd w:val="clear" w:color="auto" w:fill="F3F4F6"/>
+      </w:pPr>
+      <w:r>
+        <w:rPr>
+          <w:rFonts w:ascii="Courier New" w:hAnsi="Courier New"/>
+          <w:color w:val="1F2D3D"/>
+          <w:sz w:val="18"/>
+        </w:rPr>
+        <w:t>│</w:t>
+      </w:r>
+    </w:p>
+    <w:p>
+      <w:pPr>
+        <w:spacing w:before="0" w:after="0"/>
+        <w:ind w:left="283"/>
+        <w:shd w:val="clear" w:color="auto" w:fill="F3F4F6"/>
+      </w:pPr>
+      <w:r>
+        <w:rPr>
+          <w:rFonts w:ascii="Courier New" w:hAnsi="Courier New"/>
+          <w:color w:val="1F2D3D"/>
+          <w:sz w:val="18"/>
+        </w:rPr>
+        <w:t>└── notifications/</w:t>
       </w:r>
     </w:p>
     <w:p>
@@ -3444,97 +3579,97 @@
           <w:color w:val="1F2D3D"/>
           <w:sz w:val="18"/>
         </w:rPr>
-        <w:t xml:space="preserve">        └── {eventId}/</w:t>
-      </w:r>
-    </w:p>
-    <w:p>
-      <w:pPr>
-        <w:spacing w:before="0" w:after="0"/>
-        <w:ind w:left="283"/>
-        <w:shd w:val="clear" w:color="auto" w:fill="F3F4F6"/>
-      </w:pPr>
-      <w:r>
-        <w:rPr>
-          <w:rFonts w:ascii="Courier New" w:hAnsi="Courier New"/>
-          <w:color w:val="1F2D3D"/>
-          <w:sz w:val="18"/>
-        </w:rPr>
-        <w:t xml:space="preserve">            ├── id          → "1748123456789"</w:t>
-      </w:r>
-    </w:p>
-    <w:p>
-      <w:pPr>
-        <w:spacing w:before="0" w:after="0"/>
-        <w:ind w:left="283"/>
-        <w:shd w:val="clear" w:color="auto" w:fill="F3F4F6"/>
-      </w:pPr>
-      <w:r>
-        <w:rPr>
-          <w:rFonts w:ascii="Courier New" w:hAnsi="Courier New"/>
-          <w:color w:val="1F2D3D"/>
-          <w:sz w:val="18"/>
-        </w:rPr>
-        <w:t xml:space="preserve">            ├── title       → "Session de mentorat"</w:t>
-      </w:r>
-    </w:p>
-    <w:p>
-      <w:pPr>
-        <w:spacing w:before="0" w:after="0"/>
-        <w:ind w:left="283"/>
-        <w:shd w:val="clear" w:color="auto" w:fill="F3F4F6"/>
-      </w:pPr>
-      <w:r>
-        <w:rPr>
-          <w:rFonts w:ascii="Courier New" w:hAnsi="Courier New"/>
-          <w:color w:val="1F2D3D"/>
-          <w:sz w:val="18"/>
-        </w:rPr>
-        <w:t xml:space="preserve">            ├── date        → "2025-06-15"</w:t>
-      </w:r>
-    </w:p>
-    <w:p>
-      <w:pPr>
-        <w:spacing w:before="0" w:after="0"/>
-        <w:ind w:left="283"/>
-        <w:shd w:val="clear" w:color="auto" w:fill="F3F4F6"/>
-      </w:pPr>
-      <w:r>
-        <w:rPr>
-          <w:rFonts w:ascii="Courier New" w:hAnsi="Courier New"/>
-          <w:color w:val="1F2D3D"/>
-          <w:sz w:val="18"/>
-        </w:rPr>
-        <w:t xml:space="preserve">            ├── time        → "10:00"</w:t>
-      </w:r>
-    </w:p>
-    <w:p>
-      <w:pPr>
-        <w:spacing w:before="0" w:after="0"/>
-        <w:ind w:left="283"/>
-        <w:shd w:val="clear" w:color="auto" w:fill="F3F4F6"/>
-      </w:pPr>
-      <w:r>
-        <w:rPr>
-          <w:rFonts w:ascii="Courier New" w:hAnsi="Courier New"/>
-          <w:color w:val="1F2D3D"/>
-          <w:sz w:val="18"/>
-        </w:rPr>
-        <w:t xml:space="preserve">            ├── type        → "mentorat" | "reunion" | "evenement"</w:t>
-      </w:r>
-    </w:p>
-    <w:p>
-      <w:pPr>
-        <w:spacing w:before="0" w:after="0"/>
-        <w:ind w:left="283"/>
-        <w:shd w:val="clear" w:color="auto" w:fill="F3F4F6"/>
-      </w:pPr>
-      <w:r>
-        <w:rPr>
-          <w:rFonts w:ascii="Courier New" w:hAnsi="Courier New"/>
-          <w:color w:val="1F2D3D"/>
-          <w:sz w:val="18"/>
-        </w:rPr>
-        <w:t xml:space="preserve">            └── description → "Revue du business plan"</w:t>
+        <w:t xml:space="preserve">        └── {notifId}/</w:t>
+      </w:r>
+    </w:p>
+    <w:p>
+      <w:pPr>
+        <w:spacing w:before="0" w:after="0"/>
+        <w:ind w:left="283"/>
+        <w:shd w:val="clear" w:color="auto" w:fill="F3F4F6"/>
+      </w:pPr>
+      <w:r>
+        <w:rPr>
+          <w:rFonts w:ascii="Courier New" w:hAnsi="Courier New"/>
+          <w:color w:val="1F2D3D"/>
+          <w:sz w:val="18"/>
+        </w:rPr>
+        <w:t xml:space="preserve">            ├── id        → "1748123456789"</w:t>
+      </w:r>
+    </w:p>
+    <w:p>
+      <w:pPr>
+        <w:spacing w:before="0" w:after="0"/>
+        <w:ind w:left="283"/>
+        <w:shd w:val="clear" w:color="auto" w:fill="F3F4F6"/>
+      </w:pPr>
+      <w:r>
+        <w:rPr>
+          <w:rFonts w:ascii="Courier New" w:hAnsi="Courier New"/>
+          <w:color w:val="1F2D3D"/>
+          <w:sz w:val="18"/>
+        </w:rPr>
+        <w:t xml:space="preserve">            ├── title     → "Nouveau rendez-vous"</w:t>
+      </w:r>
+    </w:p>
+    <w:p>
+      <w:pPr>
+        <w:spacing w:before="0" w:after="0"/>
+        <w:ind w:left="283"/>
+        <w:shd w:val="clear" w:color="auto" w:fill="F3F4F6"/>
+      </w:pPr>
+      <w:r>
+        <w:rPr>
+          <w:rFonts w:ascii="Courier New" w:hAnsi="Courier New"/>
+          <w:color w:val="1F2D3D"/>
+          <w:sz w:val="18"/>
+        </w:rPr>
+        <w:t xml:space="preserve">            ├── message   → "Ibrahima a réservé une session..."</w:t>
+      </w:r>
+    </w:p>
+    <w:p>
+      <w:pPr>
+        <w:spacing w:before="0" w:after="0"/>
+        <w:ind w:left="283"/>
+        <w:shd w:val="clear" w:color="auto" w:fill="F3F4F6"/>
+      </w:pPr>
+      <w:r>
+        <w:rPr>
+          <w:rFonts w:ascii="Courier New" w:hAnsi="Courier New"/>
+          <w:color w:val="1F2D3D"/>
+          <w:sz w:val="18"/>
+        </w:rPr>
+        <w:t xml:space="preserve">            ├── type      → "session_booked" | "session_cancelled" | "info"</w:t>
+      </w:r>
+    </w:p>
+    <w:p>
+      <w:pPr>
+        <w:spacing w:before="0" w:after="0"/>
+        <w:ind w:left="283"/>
+        <w:shd w:val="clear" w:color="auto" w:fill="F3F4F6"/>
+      </w:pPr>
+      <w:r>
+        <w:rPr>
+          <w:rFonts w:ascii="Courier New" w:hAnsi="Courier New"/>
+          <w:color w:val="1F2D3D"/>
+          <w:sz w:val="18"/>
+        </w:rPr>
+        <w:t xml:space="preserve">            ├── timestamp → "2025-05-24T10:00:00.000"</w:t>
+      </w:r>
+    </w:p>
+    <w:p>
+      <w:pPr>
+        <w:spacing w:before="0" w:after="0"/>
+        <w:ind w:left="283"/>
+        <w:shd w:val="clear" w:color="auto" w:fill="F3F4F6"/>
+      </w:pPr>
+      <w:r>
+        <w:rPr>
+          <w:rFonts w:ascii="Courier New" w:hAnsi="Courier New"/>
+          <w:color w:val="1F2D3D"/>
+          <w:sz w:val="18"/>
+        </w:rPr>
+        <w:t xml:space="preserve">            └── isRead    → false</w:t>
       </w:r>
     </w:p>
     <w:p>
@@ -15582,7 +15717,7 @@
                 <w:rFonts w:ascii="Calibri" w:hAnsi="Calibri"/>
                 <w:sz w:val="20"/>
               </w:rPr>
-              <w:t xml:space="preserve"> événement agenda</w:t>
+              <w:t xml:space="preserve"> session agenda</w:t>
             </w:r>
           </w:p>
         </w:tc>
@@ -15598,7 +15733,7 @@
                 <w:color w:val="DC2626"/>
                 <w:sz w:val="20"/>
               </w:rPr>
-              <w:t>DatabaseService</w:t>
+              <w:t>AgendaController</w:t>
             </w:r>
           </w:p>
         </w:tc>
@@ -15614,7 +15749,7 @@
                 <w:color w:val="DC2626"/>
                 <w:sz w:val="20"/>
               </w:rPr>
-              <w:t>agenda/{uid}/{id}.set()</w:t>
+              <w:t>bookedSessions/{uid}/{id}.set()</w:t>
             </w:r>
           </w:p>
         </w:tc>
@@ -15629,7 +15764,7 @@
                 <w:rFonts w:ascii="Calibri" w:hAnsi="Calibri"/>
                 <w:sz w:val="20"/>
               </w:rPr>
-              <w:t>Ajout agenda</w:t>
+              <w:t>Réservation RDV</w:t>
             </w:r>
           </w:p>
         </w:tc>

</xml_diff>

<commit_message>
fix: corrige numérotation sections L2/L5 et logout 6 étapes dans L2
- L2: table des matières ajout section 1.9 DELETE suppression session
- L2: sérialisation renommée 1.9 → 1.11 (doublon corrigé)
- L2: logout (3 étapes) → (6 étapes) + AgendaController.reset()
- L5: table des matières ajoute sections 10/11/12 manquantes
- L5: sections Wave (12→11) et Déploiement (11→12) remises en ordre
- L5: conclusion section refs corrigées (section 11 Wave, section 12 Déploiement)
- Docx régénérés
</commit_message>
<xml_diff>
--- a/livrables/docx/DIAPALER_AFRICA_Livrable2.docx
+++ b/livrables/docx/DIAPALER_AFRICA_Livrable2.docx
@@ -1126,7 +1126,7 @@
           <w:rFonts w:ascii="Calibri" w:hAnsi="Calibri"/>
           <w:sz w:val="22"/>
         </w:rPr>
-        <w:t>[1.9 DELETE — Déconnexion et nettoyage](#19-delete--déconnexion-et-nettoyage)</w:t>
+        <w:t>[1.9 DELETE — Suppression d'une session réservée](#19-delete--suppression-dune-session-réservée-firebase-remove)</w:t>
       </w:r>
     </w:p>
     <w:p>
@@ -1138,7 +1138,19 @@
           <w:rFonts w:ascii="Calibri" w:hAnsi="Calibri"/>
           <w:sz w:val="22"/>
         </w:rPr>
-        <w:t>[1.10 Sérialisation JSON ↔ Dart](#110-sérialisation-json--dart)</w:t>
+        <w:t>[1.10 DELETE — Déconnexion et nettoyage](#110-delete--déconnexion-et-nettoyage-du-cache-local)</w:t>
+      </w:r>
+    </w:p>
+    <w:p>
+      <w:pPr>
+        <w:pStyle w:val="ListBullet"/>
+      </w:pPr>
+      <w:r>
+        <w:rPr>
+          <w:rFonts w:ascii="Calibri" w:hAnsi="Calibri"/>
+          <w:sz w:val="22"/>
+        </w:rPr>
+        <w:t>[1.11 Sérialisation JSON ↔ Dart](#111-sérialisation-json--dart)</w:t>
       </w:r>
     </w:p>
     <w:p>
@@ -7418,82 +7430,97 @@
           <w:color w:val="1F2D3D"/>
           <w:sz w:val="18"/>
         </w:rPr>
-        <w:t>// feuille_profil.dart — Déconnexion complète (3 étapes)</w:t>
-      </w:r>
-    </w:p>
-    <w:p>
-      <w:pPr>
-        <w:spacing w:before="0" w:after="0"/>
-        <w:ind w:left="283"/>
-        <w:shd w:val="clear" w:color="auto" w:fill="F3F4F6"/>
-      </w:pPr>
-      <w:r>
-        <w:rPr>
-          <w:rFonts w:ascii="Courier New" w:hAnsi="Courier New"/>
-          <w:color w:val="1F2D3D"/>
-          <w:sz w:val="18"/>
-        </w:rPr>
-        <w:t>await CacheService.clear();                // Vide le cache SharedPreferences</w:t>
-      </w:r>
-    </w:p>
-    <w:p>
-      <w:pPr>
-        <w:spacing w:before="0" w:after="0"/>
-        <w:ind w:left="283"/>
-        <w:shd w:val="clear" w:color="auto" w:fill="F3F4F6"/>
-      </w:pPr>
-      <w:r>
-        <w:rPr>
-          <w:rFonts w:ascii="Courier New" w:hAnsi="Courier New"/>
-          <w:color w:val="1F2D3D"/>
-          <w:sz w:val="18"/>
-        </w:rPr>
-        <w:t>NotificationService.reset();              // Vide les notifications en mémoire</w:t>
-      </w:r>
-    </w:p>
-    <w:p>
-      <w:pPr>
-        <w:spacing w:before="0" w:after="0"/>
-        <w:ind w:left="283"/>
-        <w:shd w:val="clear" w:color="auto" w:fill="F3F4F6"/>
-      </w:pPr>
-      <w:r>
-        <w:rPr>
-          <w:rFonts w:ascii="Courier New" w:hAnsi="Courier New"/>
-          <w:color w:val="1F2D3D"/>
-          <w:sz w:val="18"/>
-        </w:rPr>
-        <w:t>UserProfileController.reset();            // Réinitialise le profil en mémoire</w:t>
-      </w:r>
-    </w:p>
-    <w:p>
-      <w:pPr>
-        <w:spacing w:before="0" w:after="0"/>
-        <w:ind w:left="283"/>
-        <w:shd w:val="clear" w:color="auto" w:fill="F3F4F6"/>
-      </w:pPr>
-      <w:r>
-        <w:rPr>
-          <w:rFonts w:ascii="Courier New" w:hAnsi="Courier New"/>
-          <w:color w:val="1F2D3D"/>
-          <w:sz w:val="18"/>
-        </w:rPr>
-        <w:t>appTabIndex.value = 0;                    // Retour à l'onglet Accueil</w:t>
-      </w:r>
-    </w:p>
-    <w:p>
-      <w:pPr>
-        <w:spacing w:before="0" w:after="0"/>
-        <w:ind w:left="283"/>
-        <w:shd w:val="clear" w:color="auto" w:fill="F3F4F6"/>
-      </w:pPr>
-      <w:r>
-        <w:rPr>
-          <w:rFonts w:ascii="Courier New" w:hAnsi="Courier New"/>
-          <w:color w:val="1F2D3D"/>
-          <w:sz w:val="18"/>
-        </w:rPr>
-        <w:t>await AuthService.signOut();             // Révoque la session Firebase Auth</w:t>
+        <w:t>// feuille_profil.dart — Déconnexion complète (6 étapes)</w:t>
+      </w:r>
+    </w:p>
+    <w:p>
+      <w:pPr>
+        <w:spacing w:before="0" w:after="0"/>
+        <w:ind w:left="283"/>
+        <w:shd w:val="clear" w:color="auto" w:fill="F3F4F6"/>
+      </w:pPr>
+      <w:r>
+        <w:rPr>
+          <w:rFonts w:ascii="Courier New" w:hAnsi="Courier New"/>
+          <w:color w:val="1F2D3D"/>
+          <w:sz w:val="18"/>
+        </w:rPr>
+        <w:t>await CacheService.clear();              // 1. Vide le cache SharedPreferences</w:t>
+      </w:r>
+    </w:p>
+    <w:p>
+      <w:pPr>
+        <w:spacing w:before="0" w:after="0"/>
+        <w:ind w:left="283"/>
+        <w:shd w:val="clear" w:color="auto" w:fill="F3F4F6"/>
+      </w:pPr>
+      <w:r>
+        <w:rPr>
+          <w:rFonts w:ascii="Courier New" w:hAnsi="Courier New"/>
+          <w:color w:val="1F2D3D"/>
+          <w:sz w:val="18"/>
+        </w:rPr>
+        <w:t>NotificationService.reset();            // 2. Vide les notifications en mémoire</w:t>
+      </w:r>
+    </w:p>
+    <w:p>
+      <w:pPr>
+        <w:spacing w:before="0" w:after="0"/>
+        <w:ind w:left="283"/>
+        <w:shd w:val="clear" w:color="auto" w:fill="F3F4F6"/>
+      </w:pPr>
+      <w:r>
+        <w:rPr>
+          <w:rFonts w:ascii="Courier New" w:hAnsi="Courier New"/>
+          <w:color w:val="1F2D3D"/>
+          <w:sz w:val="18"/>
+        </w:rPr>
+        <w:t>await AgendaController.reset();         // 3. Vide les sessions agenda en mémoire</w:t>
+      </w:r>
+    </w:p>
+    <w:p>
+      <w:pPr>
+        <w:spacing w:before="0" w:after="0"/>
+        <w:ind w:left="283"/>
+        <w:shd w:val="clear" w:color="auto" w:fill="F3F4F6"/>
+      </w:pPr>
+      <w:r>
+        <w:rPr>
+          <w:rFonts w:ascii="Courier New" w:hAnsi="Courier New"/>
+          <w:color w:val="1F2D3D"/>
+          <w:sz w:val="18"/>
+        </w:rPr>
+        <w:t>UserProfileController.reset();          // 4. Réinitialise le profil en mémoire</w:t>
+      </w:r>
+    </w:p>
+    <w:p>
+      <w:pPr>
+        <w:spacing w:before="0" w:after="0"/>
+        <w:ind w:left="283"/>
+        <w:shd w:val="clear" w:color="auto" w:fill="F3F4F6"/>
+      </w:pPr>
+      <w:r>
+        <w:rPr>
+          <w:rFonts w:ascii="Courier New" w:hAnsi="Courier New"/>
+          <w:color w:val="1F2D3D"/>
+          <w:sz w:val="18"/>
+        </w:rPr>
+        <w:t>appTabIndex.value = 0;                  // 5. Retour à l'onglet Accueil</w:t>
+      </w:r>
+    </w:p>
+    <w:p>
+      <w:pPr>
+        <w:spacing w:before="0" w:after="0"/>
+        <w:ind w:left="283"/>
+        <w:shd w:val="clear" w:color="auto" w:fill="F3F4F6"/>
+      </w:pPr>
+      <w:r>
+        <w:rPr>
+          <w:rFonts w:ascii="Courier New" w:hAnsi="Courier New"/>
+          <w:color w:val="1F2D3D"/>
+          <w:sz w:val="18"/>
+        </w:rPr>
+        <w:t>await AuthService.signOut();           // 6. Révoque la session Firebase Auth</w:t>
       </w:r>
     </w:p>
     <w:p>
@@ -7649,7 +7676,7 @@
         <w:pStyle w:val="Heading3"/>
       </w:pPr>
       <w:r>
-        <w:t>1.9 Sérialisation JSON ↔ Dart</w:t>
+        <w:t>1.11 Sérialisation JSON ↔ Dart</w:t>
       </w:r>
     </w:p>
     <w:p>

</xml_diff>

<commit_message>
fix: corrections finales cohérence livrables après relecture complète
- L2: _fromMap() ajoute isPremium/premiumPlan (badge Premium persistant au redémarrage)
- L3: section déconnexion '5 étapes' → '6 étapes' (intro + conclusion)
- L4: copyWith() ajoute isPremium/premiumPlan (cohérent avec WaveService L5)
- Docx régénérés
</commit_message>
<xml_diff>
--- a/livrables/docx/DIAPALER_AFRICA_Livrable2.docx
+++ b/livrables/docx/DIAPALER_AFRICA_Livrable2.docx
@@ -8967,6 +8967,36 @@
           <w:sz w:val="18"/>
         </w:rPr>
         <w:t xml:space="preserve">    investmentRange: m['investmentRange']?.toString()        ?? '',</w:t>
+      </w:r>
+    </w:p>
+    <w:p>
+      <w:pPr>
+        <w:spacing w:before="0" w:after="0"/>
+        <w:ind w:left="283"/>
+        <w:shd w:val="clear" w:color="auto" w:fill="F3F4F6"/>
+      </w:pPr>
+      <w:r>
+        <w:rPr>
+          <w:rFonts w:ascii="Courier New" w:hAnsi="Courier New"/>
+          <w:color w:val="1F2D3D"/>
+          <w:sz w:val="18"/>
+        </w:rPr>
+        <w:t xml:space="preserve">    isPremium:       m['isPremium'] as bool?                 ?? false,</w:t>
+      </w:r>
+    </w:p>
+    <w:p>
+      <w:pPr>
+        <w:spacing w:before="0" w:after="0"/>
+        <w:ind w:left="283"/>
+        <w:shd w:val="clear" w:color="auto" w:fill="F3F4F6"/>
+      </w:pPr>
+      <w:r>
+        <w:rPr>
+          <w:rFonts w:ascii="Courier New" w:hAnsi="Courier New"/>
+          <w:color w:val="1F2D3D"/>
+          <w:sz w:val="18"/>
+        </w:rPr>
+        <w:t xml:space="preserve">    premiumPlan:     m['premiumPlan']?.toString()            ?? '',</w:t>
       </w:r>
     </w:p>
     <w:p>

</xml_diff>

<commit_message>
docs: docx finaux — Mr Ndiaye / L3GLSIB
</commit_message>
<xml_diff>
--- a/livrables/docx/DIAPALER_AFRICA_Livrable2.docx
+++ b/livrables/docx/DIAPALER_AFRICA_Livrable2.docx
@@ -422,7 +422,7 @@
                 <w:rFonts w:ascii="Times New Roman" w:hAnsi="Times New Roman"/>
                 <w:sz w:val="20"/>
               </w:rPr>
-              <w:t>L3 Genie Informatique</w:t>
+              <w:t>L3GLSIB</w:t>
             </w:r>
           </w:p>
         </w:tc>
@@ -459,7 +459,7 @@
                 <w:rFonts w:ascii="Times New Roman" w:hAnsi="Times New Roman"/>
                 <w:sz w:val="20"/>
               </w:rPr>
-              <w:t>[Nom du Professeur]</w:t>
+              <w:t>Mr Ndiaye</w:t>
             </w:r>
           </w:p>
         </w:tc>
@@ -1165,16 +1165,22 @@
       </w:tblGrid>
       <w:tr>
         <w:trPr>
-          <w:trHeight w:val="3969" w:hRule="exact"/>
+          <w:trHeight w:val="1701" w:hRule="atLeast"/>
         </w:trPr>
         <w:tc>
           <w:tcPr>
             <w:tcW w:type="dxa" w:w="9072"/>
             <w:shd w:val="clear" w:color="auto" w:fill="F0F0F0"/>
+            <w:tcMar>
+              <w:top w:w="113" w:type="dxa"/>
+              <w:left w:w="113" w:type="dxa"/>
+              <w:bottom w:w="113" w:type="dxa"/>
+              <w:right w:w="113" w:type="dxa"/>
+            </w:tcMar>
           </w:tcPr>
           <w:p>
             <w:pPr>
-              <w:spacing w:before="1080"/>
+              <w:spacing w:before="200" w:after="200"/>
               <w:jc w:val="center"/>
             </w:pPr>
             <w:r>
@@ -1630,7 +1636,7 @@
           <w:i w:val="0"/>
           <w:sz w:val="21"/>
         </w:rPr>
-        <w:t>[4. Anthropic Claude API (Chatbot DIALI IA)](#4-anthropic-claude-api-chatbot-diali-ia)</w:t>
+        <w:t>[4. Groq API (Llama 3.1) (Chatbot DIALI IA)](#4-groq-api-llama-31-chatbot-diali-ia)</w:t>
       </w:r>
     </w:p>
     <w:p>
@@ -1975,7 +1981,7 @@
                 <w:i w:val="0"/>
                 <w:sz w:val="19"/>
               </w:rPr>
-              <w:t>Anthropic Claude API</w:t>
+              <w:t>Groq API (Llama 3.1)</w:t>
             </w:r>
           </w:p>
         </w:tc>
@@ -2378,7 +2384,7 @@
                 <w:i w:val="0"/>
                 <w:sz w:val="19"/>
               </w:rPr>
-              <w:t>API REST Anthropic (chatbot DIALI IA)</w:t>
+              <w:t>API REST Groq (chatbot DIALI IA)</w:t>
             </w:r>
           </w:p>
         </w:tc>
@@ -2695,16 +2701,22 @@
       </w:tblGrid>
       <w:tr>
         <w:trPr>
-          <w:trHeight w:val="3969" w:hRule="exact"/>
+          <w:trHeight w:val="1701" w:hRule="atLeast"/>
         </w:trPr>
         <w:tc>
           <w:tcPr>
             <w:tcW w:type="dxa" w:w="9072"/>
             <w:shd w:val="clear" w:color="auto" w:fill="F0F0F0"/>
+            <w:tcMar>
+              <w:top w:w="113" w:type="dxa"/>
+              <w:left w:w="113" w:type="dxa"/>
+              <w:bottom w:w="113" w:type="dxa"/>
+              <w:right w:w="113" w:type="dxa"/>
+            </w:tcMar>
           </w:tcPr>
           <w:p>
             <w:pPr>
-              <w:spacing w:before="1080"/>
+              <w:spacing w:before="200" w:after="200"/>
               <w:jc w:val="center"/>
             </w:pPr>
             <w:r>
@@ -4044,16 +4056,22 @@
       </w:tblGrid>
       <w:tr>
         <w:trPr>
-          <w:trHeight w:val="3969" w:hRule="exact"/>
+          <w:trHeight w:val="1701" w:hRule="atLeast"/>
         </w:trPr>
         <w:tc>
           <w:tcPr>
             <w:tcW w:type="dxa" w:w="9072"/>
             <w:shd w:val="clear" w:color="auto" w:fill="F0F0F0"/>
+            <w:tcMar>
+              <w:top w:w="113" w:type="dxa"/>
+              <w:left w:w="113" w:type="dxa"/>
+              <w:bottom w:w="113" w:type="dxa"/>
+              <w:right w:w="113" w:type="dxa"/>
+            </w:tcMar>
           </w:tcPr>
           <w:p>
             <w:pPr>
-              <w:spacing w:before="1080"/>
+              <w:spacing w:before="200" w:after="200"/>
               <w:jc w:val="center"/>
             </w:pPr>
             <w:r>
@@ -4100,16 +4118,22 @@
       </w:tblGrid>
       <w:tr>
         <w:trPr>
-          <w:trHeight w:val="3969" w:hRule="exact"/>
+          <w:trHeight w:val="1701" w:hRule="atLeast"/>
         </w:trPr>
         <w:tc>
           <w:tcPr>
             <w:tcW w:type="dxa" w:w="9072"/>
             <w:shd w:val="clear" w:color="auto" w:fill="F0F0F0"/>
+            <w:tcMar>
+              <w:top w:w="113" w:type="dxa"/>
+              <w:left w:w="113" w:type="dxa"/>
+              <w:bottom w:w="113" w:type="dxa"/>
+              <w:right w:w="113" w:type="dxa"/>
+            </w:tcMar>
           </w:tcPr>
           <w:p>
             <w:pPr>
-              <w:spacing w:before="1080"/>
+              <w:spacing w:before="200" w:after="200"/>
               <w:jc w:val="center"/>
             </w:pPr>
             <w:r>
@@ -4156,16 +4180,22 @@
       </w:tblGrid>
       <w:tr>
         <w:trPr>
-          <w:trHeight w:val="3969" w:hRule="exact"/>
+          <w:trHeight w:val="1701" w:hRule="atLeast"/>
         </w:trPr>
         <w:tc>
           <w:tcPr>
             <w:tcW w:type="dxa" w:w="9072"/>
             <w:shd w:val="clear" w:color="auto" w:fill="F0F0F0"/>
+            <w:tcMar>
+              <w:top w:w="113" w:type="dxa"/>
+              <w:left w:w="113" w:type="dxa"/>
+              <w:bottom w:w="113" w:type="dxa"/>
+              <w:right w:w="113" w:type="dxa"/>
+            </w:tcMar>
           </w:tcPr>
           <w:p>
             <w:pPr>
-              <w:spacing w:before="1080"/>
+              <w:spacing w:before="200" w:after="200"/>
               <w:jc w:val="center"/>
             </w:pPr>
             <w:r>
@@ -4704,16 +4734,22 @@
       </w:tblGrid>
       <w:tr>
         <w:trPr>
-          <w:trHeight w:val="3969" w:hRule="exact"/>
+          <w:trHeight w:val="1701" w:hRule="atLeast"/>
         </w:trPr>
         <w:tc>
           <w:tcPr>
             <w:tcW w:type="dxa" w:w="9072"/>
             <w:shd w:val="clear" w:color="auto" w:fill="F0F0F0"/>
+            <w:tcMar>
+              <w:top w:w="113" w:type="dxa"/>
+              <w:left w:w="113" w:type="dxa"/>
+              <w:bottom w:w="113" w:type="dxa"/>
+              <w:right w:w="113" w:type="dxa"/>
+            </w:tcMar>
           </w:tcPr>
           <w:p>
             <w:pPr>
-              <w:spacing w:before="1080"/>
+              <w:spacing w:before="200" w:after="200"/>
               <w:jc w:val="center"/>
             </w:pPr>
             <w:r>
@@ -5649,16 +5685,22 @@
       </w:tblGrid>
       <w:tr>
         <w:trPr>
-          <w:trHeight w:val="3969" w:hRule="exact"/>
+          <w:trHeight w:val="1701" w:hRule="atLeast"/>
         </w:trPr>
         <w:tc>
           <w:tcPr>
             <w:tcW w:type="dxa" w:w="9072"/>
             <w:shd w:val="clear" w:color="auto" w:fill="F0F0F0"/>
+            <w:tcMar>
+              <w:top w:w="113" w:type="dxa"/>
+              <w:left w:w="113" w:type="dxa"/>
+              <w:bottom w:w="113" w:type="dxa"/>
+              <w:right w:w="113" w:type="dxa"/>
+            </w:tcMar>
           </w:tcPr>
           <w:p>
             <w:pPr>
-              <w:spacing w:before="1080"/>
+              <w:spacing w:before="200" w:after="200"/>
               <w:jc w:val="center"/>
             </w:pPr>
             <w:r>
@@ -6191,16 +6233,22 @@
       </w:tblGrid>
       <w:tr>
         <w:trPr>
-          <w:trHeight w:val="3969" w:hRule="exact"/>
+          <w:trHeight w:val="1701" w:hRule="atLeast"/>
         </w:trPr>
         <w:tc>
           <w:tcPr>
             <w:tcW w:type="dxa" w:w="9072"/>
             <w:shd w:val="clear" w:color="auto" w:fill="F0F0F0"/>
+            <w:tcMar>
+              <w:top w:w="113" w:type="dxa"/>
+              <w:left w:w="113" w:type="dxa"/>
+              <w:bottom w:w="113" w:type="dxa"/>
+              <w:right w:w="113" w:type="dxa"/>
+            </w:tcMar>
           </w:tcPr>
           <w:p>
             <w:pPr>
-              <w:spacing w:before="1080"/>
+              <w:spacing w:before="200" w:after="200"/>
               <w:jc w:val="center"/>
             </w:pPr>
             <w:r>
@@ -6843,16 +6891,22 @@
       </w:tblGrid>
       <w:tr>
         <w:trPr>
-          <w:trHeight w:val="3969" w:hRule="exact"/>
+          <w:trHeight w:val="1701" w:hRule="atLeast"/>
         </w:trPr>
         <w:tc>
           <w:tcPr>
             <w:tcW w:type="dxa" w:w="9072"/>
             <w:shd w:val="clear" w:color="auto" w:fill="F0F0F0"/>
+            <w:tcMar>
+              <w:top w:w="113" w:type="dxa"/>
+              <w:left w:w="113" w:type="dxa"/>
+              <w:bottom w:w="113" w:type="dxa"/>
+              <w:right w:w="113" w:type="dxa"/>
+            </w:tcMar>
           </w:tcPr>
           <w:p>
             <w:pPr>
-              <w:spacing w:before="1080"/>
+              <w:spacing w:before="200" w:after="200"/>
               <w:jc w:val="center"/>
             </w:pPr>
             <w:r>
@@ -7327,16 +7381,22 @@
       </w:tblGrid>
       <w:tr>
         <w:trPr>
-          <w:trHeight w:val="3969" w:hRule="exact"/>
+          <w:trHeight w:val="1701" w:hRule="atLeast"/>
         </w:trPr>
         <w:tc>
           <w:tcPr>
             <w:tcW w:type="dxa" w:w="9072"/>
             <w:shd w:val="clear" w:color="auto" w:fill="F0F0F0"/>
+            <w:tcMar>
+              <w:top w:w="113" w:type="dxa"/>
+              <w:left w:w="113" w:type="dxa"/>
+              <w:bottom w:w="113" w:type="dxa"/>
+              <w:right w:w="113" w:type="dxa"/>
+            </w:tcMar>
           </w:tcPr>
           <w:p>
             <w:pPr>
-              <w:spacing w:before="1080"/>
+              <w:spacing w:before="200" w:after="200"/>
               <w:jc w:val="center"/>
             </w:pPr>
             <w:r>
@@ -7814,16 +7874,22 @@
       </w:tblGrid>
       <w:tr>
         <w:trPr>
-          <w:trHeight w:val="3969" w:hRule="exact"/>
+          <w:trHeight w:val="1701" w:hRule="atLeast"/>
         </w:trPr>
         <w:tc>
           <w:tcPr>
             <w:tcW w:type="dxa" w:w="9072"/>
             <w:shd w:val="clear" w:color="auto" w:fill="F0F0F0"/>
+            <w:tcMar>
+              <w:top w:w="113" w:type="dxa"/>
+              <w:left w:w="113" w:type="dxa"/>
+              <w:bottom w:w="113" w:type="dxa"/>
+              <w:right w:w="113" w:type="dxa"/>
+            </w:tcMar>
           </w:tcPr>
           <w:p>
             <w:pPr>
-              <w:spacing w:before="1080"/>
+              <w:spacing w:before="200" w:after="200"/>
               <w:jc w:val="center"/>
             </w:pPr>
             <w:r>
@@ -7992,7 +8058,7 @@
                 <w:rFonts w:ascii="Courier New" w:hAnsi="Courier New"/>
                 <w:sz w:val="17"/>
               </w:rPr>
-              <w:t>// Redirection vers l'écran de sélection de rôle</w:t>
+              <w:t>// Redirection vers la page de connexion (pile vidée)</w:t>
             </w:r>
           </w:p>
           <w:p>
@@ -8028,7 +8094,7 @@
                 <w:rFonts w:ascii="Courier New" w:hAnsi="Courier New"/>
                 <w:sz w:val="17"/>
               </w:rPr>
-              <w:t xml:space="preserve">  MaterialPageRoute(builder: (_) =&gt; const RoleSelectionPage()),</w:t>
+              <w:t xml:space="preserve">  MaterialPageRoute(builder: (_) =&gt; const LoginPage()),</w:t>
             </w:r>
           </w:p>
           <w:p>
@@ -8089,16 +8155,22 @@
       </w:tblGrid>
       <w:tr>
         <w:trPr>
-          <w:trHeight w:val="3969" w:hRule="exact"/>
+          <w:trHeight w:val="1701" w:hRule="atLeast"/>
         </w:trPr>
         <w:tc>
           <w:tcPr>
             <w:tcW w:type="dxa" w:w="9072"/>
             <w:shd w:val="clear" w:color="auto" w:fill="F0F0F0"/>
+            <w:tcMar>
+              <w:top w:w="113" w:type="dxa"/>
+              <w:left w:w="113" w:type="dxa"/>
+              <w:bottom w:w="113" w:type="dxa"/>
+              <w:right w:w="113" w:type="dxa"/>
+            </w:tcMar>
           </w:tcPr>
           <w:p>
             <w:pPr>
-              <w:spacing w:before="1080"/>
+              <w:spacing w:before="200" w:after="200"/>
               <w:jc w:val="center"/>
             </w:pPr>
             <w:r>
@@ -8143,6 +8215,74 @@
     </w:p>
     <w:p>
       <w:pPr>
+        <w:spacing w:after="120"/>
+      </w:pPr>
+      <w:r>
+        <w:rPr>
+          <w:rFonts w:ascii="Times New Roman" w:hAnsi="Times New Roman"/>
+          <w:b w:val="0"/>
+          <w:i w:val="0"/>
+          <w:sz w:val="22"/>
+        </w:rPr>
+        <w:t xml:space="preserve">La sérialisation manuelle est nécessaire car Firebase Realtime Database retourne des </w:t>
+      </w:r>
+      <w:r>
+        <w:rPr>
+          <w:rFonts w:ascii="Times New Roman" w:hAnsi="Times New Roman"/>
+          <w:b w:val="0"/>
+          <w:i w:val="0"/>
+          <w:sz w:val="22"/>
+        </w:rPr>
+        <w:t>Map&lt;Object?, Object?&gt;</w:t>
+      </w:r>
+      <w:r>
+        <w:rPr>
+          <w:rFonts w:ascii="Times New Roman" w:hAnsi="Times New Roman"/>
+          <w:b w:val="0"/>
+          <w:i w:val="0"/>
+          <w:sz w:val="22"/>
+        </w:rPr>
+        <w:t xml:space="preserve"> que Dart ne peut pas caster directement. Un cast sécurisé est appliqué sur chaque champ via l'opérateur </w:t>
+      </w:r>
+      <w:r>
+        <w:rPr>
+          <w:rFonts w:ascii="Times New Roman" w:hAnsi="Times New Roman"/>
+          <w:b w:val="0"/>
+          <w:i w:val="0"/>
+          <w:sz w:val="22"/>
+        </w:rPr>
+        <w:t>?.toString()</w:t>
+      </w:r>
+      <w:r>
+        <w:rPr>
+          <w:rFonts w:ascii="Times New Roman" w:hAnsi="Times New Roman"/>
+          <w:b w:val="0"/>
+          <w:i w:val="0"/>
+          <w:sz w:val="22"/>
+        </w:rPr>
+        <w:t xml:space="preserve"> et les casts numériques </w:t>
+      </w:r>
+      <w:r>
+        <w:rPr>
+          <w:rFonts w:ascii="Times New Roman" w:hAnsi="Times New Roman"/>
+          <w:b w:val="0"/>
+          <w:i w:val="0"/>
+          <w:sz w:val="22"/>
+        </w:rPr>
+        <w:t>(v as num?)?.toInt()</w:t>
+      </w:r>
+      <w:r>
+        <w:rPr>
+          <w:rFonts w:ascii="Times New Roman" w:hAnsi="Times New Roman"/>
+          <w:b w:val="0"/>
+          <w:i w:val="0"/>
+          <w:sz w:val="22"/>
+        </w:rPr>
+        <w:t>.</w:t>
+      </w:r>
+    </w:p>
+    <w:p>
+      <w:pPr>
         <w:spacing w:after="0"/>
       </w:pPr>
       <w:r>
@@ -8202,295 +8342,151 @@
                 <w:rFonts w:ascii="Courier New" w:hAnsi="Courier New"/>
                 <w:sz w:val="17"/>
               </w:rPr>
-              <w:t xml:space="preserve">  'firstName':      p.firstName,</w:t>
-            </w:r>
-          </w:p>
-          <w:p>
-            <w:pPr>
-              <w:spacing w:before="0" w:after="0"/>
-            </w:pPr>
-            <w:r>
-              <w:rPr>
-                <w:rFonts w:ascii="Courier New" w:hAnsi="Courier New"/>
-                <w:sz w:val="17"/>
-              </w:rPr>
-              <w:t xml:space="preserve">  'lastName':       p.lastName,</w:t>
-            </w:r>
-          </w:p>
-          <w:p>
-            <w:pPr>
-              <w:spacing w:before="0" w:after="0"/>
-            </w:pPr>
-            <w:r>
-              <w:rPr>
-                <w:rFonts w:ascii="Courier New" w:hAnsi="Courier New"/>
-                <w:sz w:val="17"/>
-              </w:rPr>
-              <w:t xml:space="preserve">  'email':          p.email,</w:t>
-            </w:r>
-          </w:p>
-          <w:p>
-            <w:pPr>
-              <w:spacing w:before="0" w:after="0"/>
-            </w:pPr>
-            <w:r>
-              <w:rPr>
-                <w:rFonts w:ascii="Courier New" w:hAnsi="Courier New"/>
-                <w:sz w:val="17"/>
-              </w:rPr>
-              <w:t xml:space="preserve">  'phone':          p.phone,</w:t>
-            </w:r>
-          </w:p>
-          <w:p>
-            <w:pPr>
-              <w:spacing w:before="0" w:after="0"/>
-            </w:pPr>
-            <w:r>
-              <w:rPr>
-                <w:rFonts w:ascii="Courier New" w:hAnsi="Courier New"/>
-                <w:sz w:val="17"/>
-              </w:rPr>
-              <w:t xml:space="preserve">  'gender':         p.gender.serialized,     // Enum → String</w:t>
-            </w:r>
-          </w:p>
-          <w:p>
-            <w:pPr>
-              <w:spacing w:before="0" w:after="0"/>
-            </w:pPr>
-            <w:r>
-              <w:rPr>
-                <w:rFonts w:ascii="Courier New" w:hAnsi="Courier New"/>
-                <w:sz w:val="17"/>
-              </w:rPr>
-              <w:t xml:space="preserve">  'birthDate':      p.birthDate?.toIso8601String(),</w:t>
-            </w:r>
-          </w:p>
-          <w:p>
-            <w:pPr>
-              <w:spacing w:before="0" w:after="0"/>
-            </w:pPr>
-            <w:r>
-              <w:rPr>
-                <w:rFonts w:ascii="Courier New" w:hAnsi="Courier New"/>
-                <w:sz w:val="17"/>
-              </w:rPr>
-              <w:t xml:space="preserve">  'address':        p.address,</w:t>
-            </w:r>
-          </w:p>
-          <w:p>
-            <w:pPr>
-              <w:spacing w:before="0" w:after="0"/>
-            </w:pPr>
-            <w:r>
-              <w:rPr>
-                <w:rFonts w:ascii="Courier New" w:hAnsi="Courier New"/>
-                <w:sz w:val="17"/>
-              </w:rPr>
-              <w:t xml:space="preserve">  'city':           p.city,</w:t>
-            </w:r>
-          </w:p>
-          <w:p>
-            <w:pPr>
-              <w:spacing w:before="0" w:after="0"/>
-            </w:pPr>
-            <w:r>
-              <w:rPr>
-                <w:rFonts w:ascii="Courier New" w:hAnsi="Courier New"/>
-                <w:sz w:val="17"/>
-              </w:rPr>
-              <w:t xml:space="preserve">  'country':        p.country,</w:t>
-            </w:r>
-          </w:p>
-          <w:p>
-            <w:pPr>
-              <w:spacing w:before="0" w:after="0"/>
-            </w:pPr>
-            <w:r>
-              <w:rPr>
-                <w:rFonts w:ascii="Courier New" w:hAnsi="Courier New"/>
-                <w:sz w:val="17"/>
-              </w:rPr>
-              <w:t xml:space="preserve">  'sector':         p.sector,</w:t>
-            </w:r>
-          </w:p>
-          <w:p>
-            <w:pPr>
-              <w:spacing w:before="0" w:after="0"/>
-            </w:pPr>
-            <w:r>
-              <w:rPr>
-                <w:rFonts w:ascii="Courier New" w:hAnsi="Courier New"/>
-                <w:sz w:val="17"/>
-              </w:rPr>
-              <w:t xml:space="preserve">  'role':           p.role,</w:t>
-            </w:r>
-          </w:p>
-          <w:p>
-            <w:pPr>
-              <w:spacing w:before="0" w:after="0"/>
-            </w:pPr>
-            <w:r>
-              <w:rPr>
-                <w:rFonts w:ascii="Courier New" w:hAnsi="Courier New"/>
-                <w:sz w:val="17"/>
-              </w:rPr>
-              <w:t xml:space="preserve">  'bio':            p.bio,</w:t>
-            </w:r>
-          </w:p>
-          <w:p>
-            <w:pPr>
-              <w:spacing w:before="0" w:after="0"/>
-            </w:pPr>
-            <w:r>
-              <w:rPr>
-                <w:rFonts w:ascii="Courier New" w:hAnsi="Courier New"/>
-                <w:sz w:val="17"/>
-              </w:rPr>
-              <w:t xml:space="preserve">  'linkedin':       p.linkedin,</w:t>
-            </w:r>
-          </w:p>
-          <w:p>
-            <w:pPr>
-              <w:spacing w:before="0" w:after="0"/>
-            </w:pPr>
-            <w:r>
-              <w:rPr>
-                <w:rFonts w:ascii="Courier New" w:hAnsi="Courier New"/>
-                <w:sz w:val="17"/>
-              </w:rPr>
-              <w:t xml:space="preserve">  'photoBase64':    p.photoBase64,</w:t>
-            </w:r>
-          </w:p>
-          <w:p>
-            <w:pPr>
-              <w:spacing w:before="0" w:after="0"/>
-            </w:pPr>
-            <w:r>
-              <w:rPr>
-                <w:rFonts w:ascii="Courier New" w:hAnsi="Courier New"/>
-                <w:sz w:val="17"/>
-              </w:rPr>
-              <w:t xml:space="preserve">  'interests':      p.interests,             // List&lt;String&gt;</w:t>
-            </w:r>
-          </w:p>
-          <w:p>
-            <w:pPr>
-              <w:spacing w:before="0" w:after="0"/>
-            </w:pPr>
-            <w:r>
-              <w:rPr>
-                <w:rFonts w:ascii="Courier New" w:hAnsi="Courier New"/>
-                <w:sz w:val="17"/>
-              </w:rPr>
-              <w:t xml:space="preserve">  'projects':       p.projects.map(_projectToMap).toList(),</w:t>
-            </w:r>
-          </w:p>
-          <w:p>
-            <w:pPr>
-              <w:spacing w:before="0" w:after="0"/>
-            </w:pPr>
-            <w:r>
-              <w:rPr>
-                <w:rFonts w:ascii="Courier New" w:hAnsi="Courier New"/>
-                <w:sz w:val="17"/>
-              </w:rPr>
-              <w:t xml:space="preserve">  'mentorsActive':  p.mentorsActive,</w:t>
-            </w:r>
-          </w:p>
-          <w:p>
-            <w:pPr>
-              <w:spacing w:before="0" w:after="0"/>
-            </w:pPr>
-            <w:r>
-              <w:rPr>
-                <w:rFonts w:ascii="Courier New" w:hAnsi="Courier New"/>
-                <w:sz w:val="17"/>
-              </w:rPr>
-              <w:t xml:space="preserve">  'sessionsCount':  p.sessionsCount,</w:t>
-            </w:r>
-          </w:p>
-          <w:p>
-            <w:pPr>
-              <w:spacing w:before="0" w:after="0"/>
-            </w:pPr>
-            <w:r>
-              <w:rPr>
-                <w:rFonts w:ascii="Courier New" w:hAnsi="Courier New"/>
-                <w:sz w:val="17"/>
-              </w:rPr>
-              <w:t xml:space="preserve">  'favoritesCount': p.favoritesCount,</w:t>
-            </w:r>
-          </w:p>
-          <w:p>
-            <w:pPr>
-              <w:spacing w:before="0" w:after="0"/>
-            </w:pPr>
-            <w:r>
-              <w:rPr>
-                <w:rFonts w:ascii="Courier New" w:hAnsi="Courier New"/>
-                <w:sz w:val="17"/>
-              </w:rPr>
-              <w:t xml:space="preserve">  'score':          p.score,</w:t>
-            </w:r>
-          </w:p>
-          <w:p>
-            <w:pPr>
-              <w:spacing w:before="0" w:after="0"/>
-            </w:pPr>
-            <w:r>
-              <w:rPr>
-                <w:rFonts w:ascii="Courier New" w:hAnsi="Courier New"/>
-                <w:sz w:val="17"/>
-              </w:rPr>
-              <w:t xml:space="preserve">  'yearsExperience': p.yearsExperience,</w:t>
-            </w:r>
-          </w:p>
-          <w:p>
-            <w:pPr>
-              <w:spacing w:before="0" w:after="0"/>
-            </w:pPr>
-            <w:r>
-              <w:rPr>
-                <w:rFonts w:ascii="Courier New" w:hAnsi="Courier New"/>
-                <w:sz w:val="17"/>
-              </w:rPr>
-              <w:t xml:space="preserve">  'investmentRange': p.investmentRange,</w:t>
-            </w:r>
-          </w:p>
-          <w:p>
-            <w:pPr>
-              <w:spacing w:before="0" w:after="0"/>
-            </w:pPr>
-            <w:r>
-              <w:rPr>
-                <w:rFonts w:ascii="Courier New" w:hAnsi="Courier New"/>
-                <w:sz w:val="17"/>
-              </w:rPr>
-              <w:t xml:space="preserve">  'isPremium':      p.isPremium,</w:t>
-            </w:r>
-          </w:p>
-          <w:p>
-            <w:pPr>
-              <w:spacing w:before="0" w:after="0"/>
-            </w:pPr>
-            <w:r>
-              <w:rPr>
-                <w:rFonts w:ascii="Courier New" w:hAnsi="Courier New"/>
-                <w:sz w:val="17"/>
-              </w:rPr>
-              <w:t xml:space="preserve">  'premiumPlan':    p.premiumPlan,</w:t>
-            </w:r>
-          </w:p>
-          <w:p>
-            <w:pPr>
-              <w:spacing w:before="0" w:after="0"/>
-            </w:pPr>
-            <w:r>
-              <w:rPr>
-                <w:rFonts w:ascii="Courier New" w:hAnsi="Courier New"/>
-                <w:sz w:val="17"/>
-              </w:rPr>
-              <w:t xml:space="preserve">  'updatedAt':      ServerValue.timestamp,</w:t>
+              <w:t xml:space="preserve">  'firstName':   p.firstName,</w:t>
+            </w:r>
+          </w:p>
+          <w:p>
+            <w:pPr>
+              <w:spacing w:before="0" w:after="0"/>
+            </w:pPr>
+            <w:r>
+              <w:rPr>
+                <w:rFonts w:ascii="Courier New" w:hAnsi="Courier New"/>
+                <w:sz w:val="17"/>
+              </w:rPr>
+              <w:t xml:space="preserve">  'lastName':    p.lastName,</w:t>
+            </w:r>
+          </w:p>
+          <w:p>
+            <w:pPr>
+              <w:spacing w:before="0" w:after="0"/>
+            </w:pPr>
+            <w:r>
+              <w:rPr>
+                <w:rFonts w:ascii="Courier New" w:hAnsi="Courier New"/>
+                <w:sz w:val="17"/>
+              </w:rPr>
+              <w:t xml:space="preserve">  'email':       p.email,</w:t>
+            </w:r>
+          </w:p>
+          <w:p>
+            <w:pPr>
+              <w:spacing w:before="0" w:after="0"/>
+            </w:pPr>
+            <w:r>
+              <w:rPr>
+                <w:rFonts w:ascii="Courier New" w:hAnsi="Courier New"/>
+                <w:sz w:val="17"/>
+              </w:rPr>
+              <w:t xml:space="preserve">  'role':        p.role,</w:t>
+            </w:r>
+          </w:p>
+          <w:p>
+            <w:pPr>
+              <w:spacing w:before="0" w:after="0"/>
+            </w:pPr>
+            <w:r>
+              <w:rPr>
+                <w:rFonts w:ascii="Courier New" w:hAnsi="Courier New"/>
+                <w:sz w:val="17"/>
+              </w:rPr>
+              <w:t xml:space="preserve">  'city':        p.city,</w:t>
+            </w:r>
+          </w:p>
+          <w:p>
+            <w:pPr>
+              <w:spacing w:before="0" w:after="0"/>
+            </w:pPr>
+            <w:r>
+              <w:rPr>
+                <w:rFonts w:ascii="Courier New" w:hAnsi="Courier New"/>
+                <w:sz w:val="17"/>
+              </w:rPr>
+              <w:t xml:space="preserve">  'sector':      p.sector,</w:t>
+            </w:r>
+          </w:p>
+          <w:p>
+            <w:pPr>
+              <w:spacing w:before="0" w:after="0"/>
+            </w:pPr>
+            <w:r>
+              <w:rPr>
+                <w:rFonts w:ascii="Courier New" w:hAnsi="Courier New"/>
+                <w:sz w:val="17"/>
+              </w:rPr>
+              <w:t xml:space="preserve">  'bio':         p.bio,</w:t>
+            </w:r>
+          </w:p>
+          <w:p>
+            <w:pPr>
+              <w:spacing w:before="0" w:after="0"/>
+            </w:pPr>
+            <w:r>
+              <w:rPr>
+                <w:rFonts w:ascii="Courier New" w:hAnsi="Courier New"/>
+                <w:sz w:val="17"/>
+              </w:rPr>
+              <w:t xml:space="preserve">  'photoBase64': p.photoBase64,</w:t>
+            </w:r>
+          </w:p>
+          <w:p>
+            <w:pPr>
+              <w:spacing w:before="0" w:after="0"/>
+            </w:pPr>
+            <w:r>
+              <w:rPr>
+                <w:rFonts w:ascii="Courier New" w:hAnsi="Courier New"/>
+                <w:sz w:val="17"/>
+              </w:rPr>
+              <w:t xml:space="preserve">  'interests':   p.interests,</w:t>
+            </w:r>
+          </w:p>
+          <w:p>
+            <w:pPr>
+              <w:spacing w:before="0" w:after="0"/>
+            </w:pPr>
+            <w:r>
+              <w:rPr>
+                <w:rFonts w:ascii="Courier New" w:hAnsi="Courier New"/>
+                <w:sz w:val="17"/>
+              </w:rPr>
+              <w:t xml:space="preserve">  'projects':    p.projects.map(_projectToMap).toList(),</w:t>
+            </w:r>
+          </w:p>
+          <w:p>
+            <w:pPr>
+              <w:spacing w:before="0" w:after="0"/>
+            </w:pPr>
+            <w:r>
+              <w:rPr>
+                <w:rFonts w:ascii="Courier New" w:hAnsi="Courier New"/>
+                <w:sz w:val="17"/>
+              </w:rPr>
+              <w:t xml:space="preserve">  'isPremium':   p.isPremium,</w:t>
+            </w:r>
+          </w:p>
+          <w:p>
+            <w:pPr>
+              <w:spacing w:before="0" w:after="0"/>
+            </w:pPr>
+            <w:r>
+              <w:rPr>
+                <w:rFonts w:ascii="Courier New" w:hAnsi="Courier New"/>
+                <w:sz w:val="17"/>
+              </w:rPr>
+              <w:t xml:space="preserve">  'updatedAt':   ServerValue.timestamp,</w:t>
+            </w:r>
+          </w:p>
+          <w:p>
+            <w:pPr>
+              <w:spacing w:before="0" w:after="0"/>
+            </w:pPr>
+            <w:r>
+              <w:rPr>
+                <w:rFonts w:ascii="Courier New" w:hAnsi="Courier New"/>
+                <w:sz w:val="17"/>
+              </w:rPr>
+              <w:t xml:space="preserve">  // ... autres champs (gender, phone, score, etc.)</w:t>
             </w:r>
           </w:p>
           <w:p>
@@ -8519,730 +8515,139 @@
                 <w:rFonts w:ascii="Courier New" w:hAnsi="Courier New"/>
                 <w:sz w:val="17"/>
               </w:rPr>
-              <w:t>// JSON → Dart (lecture depuis Firebase)</w:t>
-            </w:r>
-          </w:p>
-          <w:p>
-            <w:pPr>
-              <w:spacing w:before="0" w:after="0"/>
-            </w:pPr>
-            <w:r>
-              <w:rPr>
-                <w:rFonts w:ascii="Courier New" w:hAnsi="Courier New"/>
-                <w:sz w:val="17"/>
-              </w:rPr>
-              <w:t>// ⚠️ Casting sécurisé obligatoire : Firebase retourne des Map&lt;Object?, Object?&gt;</w:t>
-            </w:r>
-          </w:p>
-          <w:p>
-            <w:pPr>
-              <w:spacing w:before="0" w:after="0"/>
-            </w:pPr>
-            <w:r>
-              <w:rPr>
-                <w:rFonts w:ascii="Courier New" w:hAnsi="Courier New"/>
-                <w:sz w:val="17"/>
-              </w:rPr>
-              <w:t>//    que Dart ne peut pas caster directement en Map&lt;String, dynamic&gt;</w:t>
-            </w:r>
-          </w:p>
-          <w:p>
-            <w:pPr>
-              <w:spacing w:before="0" w:after="0"/>
-            </w:pPr>
-            <w:r>
-              <w:rPr>
-                <w:rFonts w:ascii="Courier New" w:hAnsi="Courier New"/>
-                <w:sz w:val="17"/>
-              </w:rPr>
-              <w:t>static UserProfile _fromMap(Map&lt;String, dynamic&gt; m) {</w:t>
-            </w:r>
-          </w:p>
-          <w:p>
-            <w:pPr>
-              <w:spacing w:before="0" w:after="0"/>
-            </w:pPr>
-            <w:r>
-              <w:rPr>
-                <w:rFonts w:ascii="Courier New" w:hAnsi="Courier New"/>
-                <w:sz w:val="17"/>
-              </w:rPr>
-              <w:t xml:space="preserve">  // Désérialisation sécurisée des listes (Firebase peut retourner List ou Map)</w:t>
-            </w:r>
-          </w:p>
-          <w:p>
-            <w:pPr>
-              <w:spacing w:before="0" w:after="0"/>
-            </w:pPr>
-            <w:r>
-              <w:rPr>
-                <w:rFonts w:ascii="Courier New" w:hAnsi="Courier New"/>
-                <w:sz w:val="17"/>
-              </w:rPr>
-              <w:t xml:space="preserve">  final rawInterests = m['interests'];</w:t>
-            </w:r>
-          </w:p>
-          <w:p>
-            <w:pPr>
-              <w:spacing w:before="0" w:after="0"/>
-            </w:pPr>
-            <w:r>
-              <w:rPr>
-                <w:rFonts w:ascii="Courier New" w:hAnsi="Courier New"/>
-                <w:sz w:val="17"/>
-              </w:rPr>
-              <w:t xml:space="preserve">  final interests = &lt;String&gt;[];</w:t>
-            </w:r>
-          </w:p>
-          <w:p>
-            <w:pPr>
-              <w:spacing w:before="0" w:after="0"/>
-            </w:pPr>
-            <w:r>
-              <w:rPr>
-                <w:rFonts w:ascii="Courier New" w:hAnsi="Courier New"/>
-                <w:sz w:val="17"/>
-              </w:rPr>
-              <w:t xml:space="preserve">  if (rawInterests is List) {</w:t>
-            </w:r>
-          </w:p>
-          <w:p>
-            <w:pPr>
-              <w:spacing w:before="0" w:after="0"/>
-            </w:pPr>
-            <w:r>
-              <w:rPr>
-                <w:rFonts w:ascii="Courier New" w:hAnsi="Courier New"/>
-                <w:sz w:val="17"/>
-              </w:rPr>
-              <w:t xml:space="preserve">    for (final v in rawInterests) interests.add(v.toString());</w:t>
-            </w:r>
-          </w:p>
-          <w:p>
-            <w:pPr>
-              <w:spacing w:before="0" w:after="0"/>
-            </w:pPr>
-            <w:r>
-              <w:rPr>
-                <w:rFonts w:ascii="Courier New" w:hAnsi="Courier New"/>
-                <w:sz w:val="17"/>
-              </w:rPr>
-              <w:t xml:space="preserve">  }</w:t>
-            </w:r>
-          </w:p>
-          <w:p>
-            <w:pPr>
-              <w:spacing w:before="0" w:after="0"/>
-            </w:pPr>
-          </w:p>
-          <w:p>
-            <w:pPr>
-              <w:spacing w:before="0" w:after="0"/>
-            </w:pPr>
-            <w:r>
-              <w:rPr>
-                <w:rFonts w:ascii="Courier New" w:hAnsi="Courier New"/>
-                <w:sz w:val="17"/>
-              </w:rPr>
-              <w:t xml:space="preserve">  // Désérialisation des projets</w:t>
-            </w:r>
-          </w:p>
-          <w:p>
-            <w:pPr>
-              <w:spacing w:before="0" w:after="0"/>
-            </w:pPr>
-            <w:r>
-              <w:rPr>
-                <w:rFonts w:ascii="Courier New" w:hAnsi="Courier New"/>
-                <w:sz w:val="17"/>
-              </w:rPr>
-              <w:t xml:space="preserve">  final rawProjects = m['projects'];</w:t>
-            </w:r>
-          </w:p>
-          <w:p>
-            <w:pPr>
-              <w:spacing w:before="0" w:after="0"/>
-            </w:pPr>
-            <w:r>
-              <w:rPr>
-                <w:rFonts w:ascii="Courier New" w:hAnsi="Courier New"/>
-                <w:sz w:val="17"/>
-              </w:rPr>
-              <w:t xml:space="preserve">  final projects = &lt;Project&gt;[];</w:t>
-            </w:r>
-          </w:p>
-          <w:p>
-            <w:pPr>
-              <w:spacing w:before="0" w:after="0"/>
-            </w:pPr>
-            <w:r>
-              <w:rPr>
-                <w:rFonts w:ascii="Courier New" w:hAnsi="Courier New"/>
-                <w:sz w:val="17"/>
-              </w:rPr>
-              <w:t xml:space="preserve">  if (rawProjects is Map) {</w:t>
-            </w:r>
-          </w:p>
-          <w:p>
-            <w:pPr>
-              <w:spacing w:before="0" w:after="0"/>
-            </w:pPr>
-            <w:r>
-              <w:rPr>
-                <w:rFonts w:ascii="Courier New" w:hAnsi="Courier New"/>
-                <w:sz w:val="17"/>
-              </w:rPr>
-              <w:t xml:space="preserve">    for (final v in rawProjects.values) {</w:t>
-            </w:r>
-          </w:p>
-          <w:p>
-            <w:pPr>
-              <w:spacing w:before="0" w:after="0"/>
-            </w:pPr>
-            <w:r>
-              <w:rPr>
-                <w:rFonts w:ascii="Courier New" w:hAnsi="Courier New"/>
-                <w:sz w:val="17"/>
-              </w:rPr>
-              <w:t xml:space="preserve">      if (v is Map) {</w:t>
-            </w:r>
-          </w:p>
-          <w:p>
-            <w:pPr>
-              <w:spacing w:before="0" w:after="0"/>
-            </w:pPr>
-            <w:r>
-              <w:rPr>
-                <w:rFonts w:ascii="Courier New" w:hAnsi="Courier New"/>
-                <w:sz w:val="17"/>
-              </w:rPr>
-              <w:t xml:space="preserve">        final pm = Map&lt;String, dynamic&gt;.from(v);</w:t>
-            </w:r>
-          </w:p>
-          <w:p>
-            <w:pPr>
-              <w:spacing w:before="0" w:after="0"/>
-            </w:pPr>
-            <w:r>
-              <w:rPr>
-                <w:rFonts w:ascii="Courier New" w:hAnsi="Courier New"/>
-                <w:sz w:val="17"/>
-              </w:rPr>
-              <w:t xml:space="preserve">        projects.add(Project(</w:t>
-            </w:r>
-          </w:p>
-          <w:p>
-            <w:pPr>
-              <w:spacing w:before="0" w:after="0"/>
-            </w:pPr>
-            <w:r>
-              <w:rPr>
-                <w:rFonts w:ascii="Courier New" w:hAnsi="Courier New"/>
-                <w:sz w:val="17"/>
-              </w:rPr>
-              <w:t xml:space="preserve">          id: pm['id']?.toString() ?? '',</w:t>
-            </w:r>
-          </w:p>
-          <w:p>
-            <w:pPr>
-              <w:spacing w:before="0" w:after="0"/>
-            </w:pPr>
-            <w:r>
-              <w:rPr>
-                <w:rFonts w:ascii="Courier New" w:hAnsi="Courier New"/>
-                <w:sz w:val="17"/>
-              </w:rPr>
-              <w:t xml:space="preserve">          name: pm['name']?.toString() ?? '',</w:t>
-            </w:r>
-          </w:p>
-          <w:p>
-            <w:pPr>
-              <w:spacing w:before="0" w:after="0"/>
-            </w:pPr>
-            <w:r>
-              <w:rPr>
-                <w:rFonts w:ascii="Courier New" w:hAnsi="Courier New"/>
-                <w:sz w:val="17"/>
-              </w:rPr>
-              <w:t xml:space="preserve">          description: pm['description']?.toString() ?? '',</w:t>
-            </w:r>
-          </w:p>
-          <w:p>
-            <w:pPr>
-              <w:spacing w:before="0" w:after="0"/>
-            </w:pPr>
-            <w:r>
-              <w:rPr>
-                <w:rFonts w:ascii="Courier New" w:hAnsi="Courier New"/>
-                <w:sz w:val="17"/>
-              </w:rPr>
-              <w:t xml:space="preserve">          sector: pm['sector']?.toString() ?? '',</w:t>
-            </w:r>
-          </w:p>
-          <w:p>
-            <w:pPr>
-              <w:spacing w:before="0" w:after="0"/>
-            </w:pPr>
-            <w:r>
-              <w:rPr>
-                <w:rFonts w:ascii="Courier New" w:hAnsi="Courier New"/>
-                <w:sz w:val="17"/>
-              </w:rPr>
-              <w:t xml:space="preserve">          step: (pm['step'] as num?)?.toInt() ?? 1,</w:t>
-            </w:r>
-          </w:p>
-          <w:p>
-            <w:pPr>
-              <w:spacing w:before="0" w:after="0"/>
-            </w:pPr>
-            <w:r>
-              <w:rPr>
-                <w:rFonts w:ascii="Courier New" w:hAnsi="Courier New"/>
-                <w:sz w:val="17"/>
-              </w:rPr>
-              <w:t xml:space="preserve">          totalSteps: (pm['totalSteps'] as num?)?.toInt() ?? 5,</w:t>
-            </w:r>
-          </w:p>
-          <w:p>
-            <w:pPr>
-              <w:spacing w:before="0" w:after="0"/>
-            </w:pPr>
-            <w:r>
-              <w:rPr>
-                <w:rFonts w:ascii="Courier New" w:hAnsi="Courier New"/>
-                <w:sz w:val="17"/>
-              </w:rPr>
-              <w:t xml:space="preserve">        ));</w:t>
-            </w:r>
-          </w:p>
-          <w:p>
-            <w:pPr>
-              <w:spacing w:before="0" w:after="0"/>
-            </w:pPr>
-            <w:r>
-              <w:rPr>
-                <w:rFonts w:ascii="Courier New" w:hAnsi="Courier New"/>
-                <w:sz w:val="17"/>
-              </w:rPr>
-              <w:t xml:space="preserve">      }</w:t>
-            </w:r>
-          </w:p>
-          <w:p>
-            <w:pPr>
-              <w:spacing w:before="0" w:after="0"/>
-            </w:pPr>
-            <w:r>
-              <w:rPr>
-                <w:rFonts w:ascii="Courier New" w:hAnsi="Courier New"/>
-                <w:sz w:val="17"/>
-              </w:rPr>
-              <w:t xml:space="preserve">    }</w:t>
-            </w:r>
-          </w:p>
-          <w:p>
-            <w:pPr>
-              <w:spacing w:before="0" w:after="0"/>
-            </w:pPr>
-            <w:r>
-              <w:rPr>
-                <w:rFonts w:ascii="Courier New" w:hAnsi="Courier New"/>
-                <w:sz w:val="17"/>
-              </w:rPr>
-              <w:t xml:space="preserve">  }</w:t>
-            </w:r>
-          </w:p>
-          <w:p>
-            <w:pPr>
-              <w:spacing w:before="0" w:after="0"/>
-            </w:pPr>
-          </w:p>
-          <w:p>
-            <w:pPr>
-              <w:spacing w:before="0" w:after="0"/>
-            </w:pPr>
-            <w:r>
-              <w:rPr>
-                <w:rFonts w:ascii="Courier New" w:hAnsi="Courier New"/>
-                <w:sz w:val="17"/>
-              </w:rPr>
-              <w:t xml:space="preserve">  DateTime? birth;</w:t>
-            </w:r>
-          </w:p>
-          <w:p>
-            <w:pPr>
-              <w:spacing w:before="0" w:after="0"/>
-            </w:pPr>
-            <w:r>
-              <w:rPr>
-                <w:rFonts w:ascii="Courier New" w:hAnsi="Courier New"/>
-                <w:sz w:val="17"/>
-              </w:rPr>
-              <w:t xml:space="preserve">  final rawBirth = m['birthDate']?.toString();</w:t>
-            </w:r>
-          </w:p>
-          <w:p>
-            <w:pPr>
-              <w:spacing w:before="0" w:after="0"/>
-            </w:pPr>
-            <w:r>
-              <w:rPr>
-                <w:rFonts w:ascii="Courier New" w:hAnsi="Courier New"/>
-                <w:sz w:val="17"/>
-              </w:rPr>
-              <w:t xml:space="preserve">  if (rawBirth != null &amp;&amp; rawBirth.isNotEmpty) {</w:t>
-            </w:r>
-          </w:p>
-          <w:p>
-            <w:pPr>
-              <w:spacing w:before="0" w:after="0"/>
-            </w:pPr>
-            <w:r>
-              <w:rPr>
-                <w:rFonts w:ascii="Courier New" w:hAnsi="Courier New"/>
-                <w:sz w:val="17"/>
-              </w:rPr>
-              <w:t xml:space="preserve">    birth = DateTime.tryParse(rawBirth);</w:t>
-            </w:r>
-          </w:p>
-          <w:p>
-            <w:pPr>
-              <w:spacing w:before="0" w:after="0"/>
-            </w:pPr>
-            <w:r>
-              <w:rPr>
-                <w:rFonts w:ascii="Courier New" w:hAnsi="Courier New"/>
-                <w:sz w:val="17"/>
-              </w:rPr>
-              <w:t xml:space="preserve">  }</w:t>
-            </w:r>
-          </w:p>
-          <w:p>
-            <w:pPr>
-              <w:spacing w:before="0" w:after="0"/>
-            </w:pPr>
-          </w:p>
-          <w:p>
-            <w:pPr>
-              <w:spacing w:before="0" w:after="0"/>
-            </w:pPr>
-            <w:r>
-              <w:rPr>
-                <w:rFonts w:ascii="Courier New" w:hAnsi="Courier New"/>
-                <w:sz w:val="17"/>
-              </w:rPr>
-              <w:t xml:space="preserve">  return UserProfile(</w:t>
-            </w:r>
-          </w:p>
-          <w:p>
-            <w:pPr>
-              <w:spacing w:before="0" w:after="0"/>
-            </w:pPr>
-            <w:r>
-              <w:rPr>
-                <w:rFonts w:ascii="Courier New" w:hAnsi="Courier New"/>
-                <w:sz w:val="17"/>
-              </w:rPr>
-              <w:t xml:space="preserve">    firstName:      m['firstName']?.toString()  ?? '',</w:t>
-            </w:r>
-          </w:p>
-          <w:p>
-            <w:pPr>
-              <w:spacing w:before="0" w:after="0"/>
-            </w:pPr>
-            <w:r>
-              <w:rPr>
-                <w:rFonts w:ascii="Courier New" w:hAnsi="Courier New"/>
-                <w:sz w:val="17"/>
-              </w:rPr>
-              <w:t xml:space="preserve">    lastName:       m['lastName']?.toString()   ?? '',</w:t>
-            </w:r>
-          </w:p>
-          <w:p>
-            <w:pPr>
-              <w:spacing w:before="0" w:after="0"/>
-            </w:pPr>
-            <w:r>
-              <w:rPr>
-                <w:rFonts w:ascii="Courier New" w:hAnsi="Courier New"/>
-                <w:sz w:val="17"/>
-              </w:rPr>
-              <w:t xml:space="preserve">    email:          m['email']?.toString()       ?? '',</w:t>
-            </w:r>
-          </w:p>
-          <w:p>
-            <w:pPr>
-              <w:spacing w:before="0" w:after="0"/>
-            </w:pPr>
-            <w:r>
-              <w:rPr>
-                <w:rFonts w:ascii="Courier New" w:hAnsi="Courier New"/>
-                <w:sz w:val="17"/>
-              </w:rPr>
-              <w:t xml:space="preserve">    phone:          m['phone']?.toString()       ?? '',</w:t>
-            </w:r>
-          </w:p>
-          <w:p>
-            <w:pPr>
-              <w:spacing w:before="0" w:after="0"/>
-            </w:pPr>
-            <w:r>
-              <w:rPr>
-                <w:rFonts w:ascii="Courier New" w:hAnsi="Courier New"/>
-                <w:sz w:val="17"/>
-              </w:rPr>
-              <w:t xml:space="preserve">    gender:         Gender.fromString(m['gender']?.toString()),</w:t>
-            </w:r>
-          </w:p>
-          <w:p>
-            <w:pPr>
-              <w:spacing w:before="0" w:after="0"/>
-            </w:pPr>
-            <w:r>
-              <w:rPr>
-                <w:rFonts w:ascii="Courier New" w:hAnsi="Courier New"/>
-                <w:sz w:val="17"/>
-              </w:rPr>
-              <w:t xml:space="preserve">    birthDate:      birth,</w:t>
-            </w:r>
-          </w:p>
-          <w:p>
-            <w:pPr>
-              <w:spacing w:before="0" w:after="0"/>
-            </w:pPr>
-            <w:r>
-              <w:rPr>
-                <w:rFonts w:ascii="Courier New" w:hAnsi="Courier New"/>
-                <w:sz w:val="17"/>
-              </w:rPr>
-              <w:t xml:space="preserve">    address:        m['address']?.toString()    ?? '',</w:t>
-            </w:r>
-          </w:p>
-          <w:p>
-            <w:pPr>
-              <w:spacing w:before="0" w:after="0"/>
-            </w:pPr>
-            <w:r>
-              <w:rPr>
-                <w:rFonts w:ascii="Courier New" w:hAnsi="Courier New"/>
-                <w:sz w:val="17"/>
-              </w:rPr>
-              <w:t xml:space="preserve">    city:           m['city']?.toString()       ?? 'Dakar',</w:t>
-            </w:r>
-          </w:p>
-          <w:p>
-            <w:pPr>
-              <w:spacing w:before="0" w:after="0"/>
-            </w:pPr>
-            <w:r>
-              <w:rPr>
-                <w:rFonts w:ascii="Courier New" w:hAnsi="Courier New"/>
-                <w:sz w:val="17"/>
-              </w:rPr>
-              <w:t xml:space="preserve">    country:        m['country']?.toString()    ?? 'Sénégal',</w:t>
-            </w:r>
-          </w:p>
-          <w:p>
-            <w:pPr>
-              <w:spacing w:before="0" w:after="0"/>
-            </w:pPr>
-            <w:r>
-              <w:rPr>
-                <w:rFonts w:ascii="Courier New" w:hAnsi="Courier New"/>
-                <w:sz w:val="17"/>
-              </w:rPr>
-              <w:t xml:space="preserve">    sector:         m['sector']?.toString()     ?? 'Autre',</w:t>
-            </w:r>
-          </w:p>
-          <w:p>
-            <w:pPr>
-              <w:spacing w:before="0" w:after="0"/>
-            </w:pPr>
-            <w:r>
-              <w:rPr>
-                <w:rFonts w:ascii="Courier New" w:hAnsi="Courier New"/>
-                <w:sz w:val="17"/>
-              </w:rPr>
-              <w:t xml:space="preserve">    role:           m['role']?.toString()       ?? 'Entrepreneur',</w:t>
-            </w:r>
-          </w:p>
-          <w:p>
-            <w:pPr>
-              <w:spacing w:before="0" w:after="0"/>
-            </w:pPr>
-            <w:r>
-              <w:rPr>
-                <w:rFonts w:ascii="Courier New" w:hAnsi="Courier New"/>
-                <w:sz w:val="17"/>
-              </w:rPr>
-              <w:t xml:space="preserve">    bio:            m['bio']?.toString()        ?? '',</w:t>
-            </w:r>
-          </w:p>
-          <w:p>
-            <w:pPr>
-              <w:spacing w:before="0" w:after="0"/>
-            </w:pPr>
-            <w:r>
-              <w:rPr>
-                <w:rFonts w:ascii="Courier New" w:hAnsi="Courier New"/>
-                <w:sz w:val="17"/>
-              </w:rPr>
-              <w:t xml:space="preserve">    linkedin:       m['linkedin']?.toString()   ?? '',</w:t>
-            </w:r>
-          </w:p>
-          <w:p>
-            <w:pPr>
-              <w:spacing w:before="0" w:after="0"/>
-            </w:pPr>
-            <w:r>
-              <w:rPr>
-                <w:rFonts w:ascii="Courier New" w:hAnsi="Courier New"/>
-                <w:sz w:val="17"/>
-              </w:rPr>
-              <w:t xml:space="preserve">    photoBase64:    m['photoBase64']?.toString() ?? '',</w:t>
-            </w:r>
-          </w:p>
-          <w:p>
-            <w:pPr>
-              <w:spacing w:before="0" w:after="0"/>
-            </w:pPr>
-            <w:r>
-              <w:rPr>
-                <w:rFonts w:ascii="Courier New" w:hAnsi="Courier New"/>
-                <w:sz w:val="17"/>
-              </w:rPr>
-              <w:t xml:space="preserve">    interests:      interests,</w:t>
-            </w:r>
-          </w:p>
-          <w:p>
-            <w:pPr>
-              <w:spacing w:before="0" w:after="0"/>
-            </w:pPr>
-            <w:r>
-              <w:rPr>
-                <w:rFonts w:ascii="Courier New" w:hAnsi="Courier New"/>
-                <w:sz w:val="17"/>
-              </w:rPr>
-              <w:t xml:space="preserve">    projects:       projects,</w:t>
-            </w:r>
-          </w:p>
-          <w:p>
-            <w:pPr>
-              <w:spacing w:before="0" w:after="0"/>
-            </w:pPr>
-            <w:r>
-              <w:rPr>
-                <w:rFonts w:ascii="Courier New" w:hAnsi="Courier New"/>
-                <w:sz w:val="17"/>
-              </w:rPr>
-              <w:t xml:space="preserve">    mentorsActive:  (m['mentorsActive'] as num?)?.toInt()    ?? 0,</w:t>
-            </w:r>
-          </w:p>
-          <w:p>
-            <w:pPr>
-              <w:spacing w:before="0" w:after="0"/>
-            </w:pPr>
-            <w:r>
-              <w:rPr>
-                <w:rFonts w:ascii="Courier New" w:hAnsi="Courier New"/>
-                <w:sz w:val="17"/>
-              </w:rPr>
-              <w:t xml:space="preserve">    sessionsCount:  (m['sessionsCount'] as num?)?.toInt()    ?? 0,</w:t>
-            </w:r>
-          </w:p>
-          <w:p>
-            <w:pPr>
-              <w:spacing w:before="0" w:after="0"/>
-            </w:pPr>
-            <w:r>
-              <w:rPr>
-                <w:rFonts w:ascii="Courier New" w:hAnsi="Courier New"/>
-                <w:sz w:val="17"/>
-              </w:rPr>
-              <w:t xml:space="preserve">    favoritesCount: (m['favoritesCount'] as num?)?.toInt()   ?? 0,</w:t>
-            </w:r>
-          </w:p>
-          <w:p>
-            <w:pPr>
-              <w:spacing w:before="0" w:after="0"/>
-            </w:pPr>
-            <w:r>
-              <w:rPr>
-                <w:rFonts w:ascii="Courier New" w:hAnsi="Courier New"/>
-                <w:sz w:val="17"/>
-              </w:rPr>
-              <w:t xml:space="preserve">    score:          (m['score'] as num?)?.toDouble()         ?? 0.0,</w:t>
-            </w:r>
-          </w:p>
-          <w:p>
-            <w:pPr>
-              <w:spacing w:before="0" w:after="0"/>
-            </w:pPr>
-            <w:r>
-              <w:rPr>
-                <w:rFonts w:ascii="Courier New" w:hAnsi="Courier New"/>
-                <w:sz w:val="17"/>
-              </w:rPr>
-              <w:t xml:space="preserve">    yearsExperience:(m['yearsExperience'] as num?)?.toInt()  ?? 0,</w:t>
-            </w:r>
-          </w:p>
-          <w:p>
-            <w:pPr>
-              <w:spacing w:before="0" w:after="0"/>
-            </w:pPr>
-            <w:r>
-              <w:rPr>
-                <w:rFonts w:ascii="Courier New" w:hAnsi="Courier New"/>
-                <w:sz w:val="17"/>
-              </w:rPr>
-              <w:t xml:space="preserve">    investmentRange: m['investmentRange']?.toString()        ?? '',</w:t>
-            </w:r>
-          </w:p>
-          <w:p>
-            <w:pPr>
-              <w:spacing w:before="0" w:after="0"/>
-            </w:pPr>
-            <w:r>
-              <w:rPr>
-                <w:rFonts w:ascii="Courier New" w:hAnsi="Courier New"/>
-                <w:sz w:val="17"/>
-              </w:rPr>
-              <w:t xml:space="preserve">    isPremium:       m['isPremium'] as bool?                 ?? false,</w:t>
-            </w:r>
-          </w:p>
-          <w:p>
-            <w:pPr>
-              <w:spacing w:before="0" w:after="0"/>
-            </w:pPr>
-            <w:r>
-              <w:rPr>
-                <w:rFonts w:ascii="Courier New" w:hAnsi="Courier New"/>
-                <w:sz w:val="17"/>
-              </w:rPr>
-              <w:t xml:space="preserve">    premiumPlan:     m['premiumPlan']?.toString()            ?? '',</w:t>
-            </w:r>
-          </w:p>
-          <w:p>
-            <w:pPr>
-              <w:spacing w:before="0" w:after="0"/>
-            </w:pPr>
-            <w:r>
-              <w:rPr>
-                <w:rFonts w:ascii="Courier New" w:hAnsi="Courier New"/>
-                <w:sz w:val="17"/>
-              </w:rPr>
-              <w:t xml:space="preserve">  );</w:t>
-            </w:r>
-          </w:p>
-          <w:p>
-            <w:pPr>
-              <w:spacing w:before="0" w:after="0"/>
-            </w:pPr>
-            <w:r>
-              <w:rPr>
-                <w:rFonts w:ascii="Courier New" w:hAnsi="Courier New"/>
-                <w:sz w:val="17"/>
-              </w:rPr>
-              <w:t>}</w:t>
+              <w:t>// JSON → Dart (lecture depuis Firebase) — cast sécurisé obligatoire</w:t>
+            </w:r>
+          </w:p>
+          <w:p>
+            <w:pPr>
+              <w:spacing w:before="0" w:after="0"/>
+            </w:pPr>
+            <w:r>
+              <w:rPr>
+                <w:rFonts w:ascii="Courier New" w:hAnsi="Courier New"/>
+                <w:sz w:val="17"/>
+              </w:rPr>
+              <w:t>static UserProfile _fromMap(Map&lt;String, dynamic&gt; m) =&gt; UserProfile(</w:t>
+            </w:r>
+          </w:p>
+          <w:p>
+            <w:pPr>
+              <w:spacing w:before="0" w:after="0"/>
+            </w:pPr>
+            <w:r>
+              <w:rPr>
+                <w:rFonts w:ascii="Courier New" w:hAnsi="Courier New"/>
+                <w:sz w:val="17"/>
+              </w:rPr>
+              <w:t xml:space="preserve">  firstName: m['firstName']?.toString() ?? '',</w:t>
+            </w:r>
+          </w:p>
+          <w:p>
+            <w:pPr>
+              <w:spacing w:before="0" w:after="0"/>
+            </w:pPr>
+            <w:r>
+              <w:rPr>
+                <w:rFonts w:ascii="Courier New" w:hAnsi="Courier New"/>
+                <w:sz w:val="17"/>
+              </w:rPr>
+              <w:t xml:space="preserve">  lastName:  m['lastName']?.toString()  ?? '',</w:t>
+            </w:r>
+          </w:p>
+          <w:p>
+            <w:pPr>
+              <w:spacing w:before="0" w:after="0"/>
+            </w:pPr>
+            <w:r>
+              <w:rPr>
+                <w:rFonts w:ascii="Courier New" w:hAnsi="Courier New"/>
+                <w:sz w:val="17"/>
+              </w:rPr>
+              <w:t xml:space="preserve">  email:     m['email']?.toString()     ?? '',</w:t>
+            </w:r>
+          </w:p>
+          <w:p>
+            <w:pPr>
+              <w:spacing w:before="0" w:after="0"/>
+            </w:pPr>
+            <w:r>
+              <w:rPr>
+                <w:rFonts w:ascii="Courier New" w:hAnsi="Courier New"/>
+                <w:sz w:val="17"/>
+              </w:rPr>
+              <w:t xml:space="preserve">  role:      m['role']?.toString()      ?? 'Entrepreneur',</w:t>
+            </w:r>
+          </w:p>
+          <w:p>
+            <w:pPr>
+              <w:spacing w:before="0" w:after="0"/>
+            </w:pPr>
+            <w:r>
+              <w:rPr>
+                <w:rFonts w:ascii="Courier New" w:hAnsi="Courier New"/>
+                <w:sz w:val="17"/>
+              </w:rPr>
+              <w:t xml:space="preserve">  city:      m['city']?.toString()      ?? 'Dakar',</w:t>
+            </w:r>
+          </w:p>
+          <w:p>
+            <w:pPr>
+              <w:spacing w:before="0" w:after="0"/>
+            </w:pPr>
+            <w:r>
+              <w:rPr>
+                <w:rFonts w:ascii="Courier New" w:hAnsi="Courier New"/>
+                <w:sz w:val="17"/>
+              </w:rPr>
+              <w:t xml:space="preserve">  score:     (m['score'] as num?)?.toDouble() ?? 0.0,</w:t>
+            </w:r>
+          </w:p>
+          <w:p>
+            <w:pPr>
+              <w:spacing w:before="0" w:after="0"/>
+            </w:pPr>
+            <w:r>
+              <w:rPr>
+                <w:rFonts w:ascii="Courier New" w:hAnsi="Courier New"/>
+                <w:sz w:val="17"/>
+              </w:rPr>
+              <w:t xml:space="preserve">  interests: _parseList(m['interests']),   // Firebase peut retourner List ou Map</w:t>
+            </w:r>
+          </w:p>
+          <w:p>
+            <w:pPr>
+              <w:spacing w:before="0" w:after="0"/>
+            </w:pPr>
+            <w:r>
+              <w:rPr>
+                <w:rFonts w:ascii="Courier New" w:hAnsi="Courier New"/>
+                <w:sz w:val="17"/>
+              </w:rPr>
+              <w:t xml:space="preserve">  projects:  _parseProjects(m['projects']),</w:t>
+            </w:r>
+          </w:p>
+          <w:p>
+            <w:pPr>
+              <w:spacing w:before="0" w:after="0"/>
+            </w:pPr>
+            <w:r>
+              <w:rPr>
+                <w:rFonts w:ascii="Courier New" w:hAnsi="Courier New"/>
+                <w:sz w:val="17"/>
+              </w:rPr>
+              <w:t xml:space="preserve">  // ... autres champs</w:t>
+            </w:r>
+          </w:p>
+          <w:p>
+            <w:pPr>
+              <w:spacing w:before="0" w:after="0"/>
+            </w:pPr>
+            <w:r>
+              <w:rPr>
+                <w:rFonts w:ascii="Courier New" w:hAnsi="Courier New"/>
+                <w:sz w:val="17"/>
+              </w:rPr>
+              <w:t>);</w:t>
             </w:r>
           </w:p>
         </w:tc>
@@ -10128,16 +9533,22 @@
       </w:tblGrid>
       <w:tr>
         <w:trPr>
-          <w:trHeight w:val="3969" w:hRule="exact"/>
+          <w:trHeight w:val="1701" w:hRule="atLeast"/>
         </w:trPr>
         <w:tc>
           <w:tcPr>
             <w:tcW w:type="dxa" w:w="9072"/>
             <w:shd w:val="clear" w:color="auto" w:fill="F0F0F0"/>
+            <w:tcMar>
+              <w:top w:w="113" w:type="dxa"/>
+              <w:left w:w="113" w:type="dxa"/>
+              <w:bottom w:w="113" w:type="dxa"/>
+              <w:right w:w="113" w:type="dxa"/>
+            </w:tcMar>
           </w:tcPr>
           <w:p>
             <w:pPr>
-              <w:spacing w:before="1080"/>
+              <w:spacing w:before="200" w:after="200"/>
               <w:jc w:val="center"/>
             </w:pPr>
             <w:r>
@@ -10182,6 +9593,74 @@
     </w:p>
     <w:p>
       <w:pPr>
+        <w:spacing w:after="120"/>
+      </w:pPr>
+      <w:r>
+        <w:rPr>
+          <w:rFonts w:ascii="Times New Roman" w:hAnsi="Times New Roman"/>
+          <w:b w:val="0"/>
+          <w:i w:val="0"/>
+          <w:sz w:val="22"/>
+        </w:rPr>
+        <w:t xml:space="preserve">L'envoi d'un message écrit dans </w:t>
+      </w:r>
+      <w:r>
+        <w:rPr>
+          <w:rFonts w:ascii="Times New Roman" w:hAnsi="Times New Roman"/>
+          <w:b w:val="0"/>
+          <w:i w:val="0"/>
+          <w:sz w:val="22"/>
+        </w:rPr>
+        <w:t>messages/{conv}/{id}</w:t>
+      </w:r>
+      <w:r>
+        <w:rPr>
+          <w:rFonts w:ascii="Times New Roman" w:hAnsi="Times New Roman"/>
+          <w:b w:val="0"/>
+          <w:i w:val="0"/>
+          <w:sz w:val="22"/>
+        </w:rPr>
+        <w:t xml:space="preserve"> puis met à jour le compteur de non lus dans </w:t>
+      </w:r>
+      <w:r>
+        <w:rPr>
+          <w:rFonts w:ascii="Times New Roman" w:hAnsi="Times New Roman"/>
+          <w:b w:val="0"/>
+          <w:i w:val="0"/>
+          <w:sz w:val="22"/>
+        </w:rPr>
+        <w:t>conversations/{conv}</w:t>
+      </w:r>
+      <w:r>
+        <w:rPr>
+          <w:rFonts w:ascii="Times New Roman" w:hAnsi="Times New Roman"/>
+          <w:b w:val="0"/>
+          <w:i w:val="0"/>
+          <w:sz w:val="22"/>
+        </w:rPr>
+        <w:t>. La lecture utilise le WebSocket Firebase (</w:t>
+      </w:r>
+      <w:r>
+        <w:rPr>
+          <w:rFonts w:ascii="Times New Roman" w:hAnsi="Times New Roman"/>
+          <w:b w:val="0"/>
+          <w:i w:val="0"/>
+          <w:sz w:val="22"/>
+        </w:rPr>
+        <w:t>.onValue</w:t>
+      </w:r>
+      <w:r>
+        <w:rPr>
+          <w:rFonts w:ascii="Times New Roman" w:hAnsi="Times New Roman"/>
+          <w:b w:val="0"/>
+          <w:i w:val="0"/>
+          <w:sz w:val="22"/>
+        </w:rPr>
+        <w:t>) pour une synchronisation instantanée.</w:t>
+      </w:r>
+    </w:p>
+    <w:p>
+      <w:pPr>
         <w:spacing w:after="0"/>
       </w:pPr>
       <w:r>
@@ -10217,103 +9696,19 @@
                 <w:rFonts w:ascii="Courier New" w:hAnsi="Courier New"/>
                 <w:sz w:val="17"/>
               </w:rPr>
-              <w:t>// ── CREATE : Envoyer un message + mise à jour de la conversation</w:t>
-            </w:r>
-          </w:p>
-          <w:p>
-            <w:pPr>
-              <w:spacing w:before="0" w:after="0"/>
-            </w:pPr>
-            <w:r>
-              <w:rPr>
-                <w:rFonts w:ascii="Courier New" w:hAnsi="Courier New"/>
-                <w:sz w:val="17"/>
-              </w:rPr>
-              <w:t>static Future&lt;void&gt; sendMessage({</w:t>
-            </w:r>
-          </w:p>
-          <w:p>
-            <w:pPr>
-              <w:spacing w:before="0" w:after="0"/>
-            </w:pPr>
-            <w:r>
-              <w:rPr>
-                <w:rFonts w:ascii="Courier New" w:hAnsi="Courier New"/>
-                <w:sz w:val="17"/>
-              </w:rPr>
-              <w:t xml:space="preserve">  required String conversationId,</w:t>
-            </w:r>
-          </w:p>
-          <w:p>
-            <w:pPr>
-              <w:spacing w:before="0" w:after="0"/>
-            </w:pPr>
-            <w:r>
-              <w:rPr>
-                <w:rFonts w:ascii="Courier New" w:hAnsi="Courier New"/>
-                <w:sz w:val="17"/>
-              </w:rPr>
-              <w:t xml:space="preserve">  required String senderId,</w:t>
-            </w:r>
-          </w:p>
-          <w:p>
-            <w:pPr>
-              <w:spacing w:before="0" w:after="0"/>
-            </w:pPr>
-            <w:r>
-              <w:rPr>
-                <w:rFonts w:ascii="Courier New" w:hAnsi="Courier New"/>
-                <w:sz w:val="17"/>
-              </w:rPr>
-              <w:t xml:space="preserve">  required String senderName,</w:t>
-            </w:r>
-          </w:p>
-          <w:p>
-            <w:pPr>
-              <w:spacing w:before="0" w:after="0"/>
-            </w:pPr>
-            <w:r>
-              <w:rPr>
-                <w:rFonts w:ascii="Courier New" w:hAnsi="Courier New"/>
-                <w:sz w:val="17"/>
-              </w:rPr>
-              <w:t xml:space="preserve">  required String recipientId,</w:t>
-            </w:r>
-          </w:p>
-          <w:p>
-            <w:pPr>
-              <w:spacing w:before="0" w:after="0"/>
-            </w:pPr>
-            <w:r>
-              <w:rPr>
-                <w:rFonts w:ascii="Courier New" w:hAnsi="Courier New"/>
-                <w:sz w:val="17"/>
-              </w:rPr>
-              <w:t xml:space="preserve">  required String recipientName,</w:t>
-            </w:r>
-          </w:p>
-          <w:p>
-            <w:pPr>
-              <w:spacing w:before="0" w:after="0"/>
-            </w:pPr>
-            <w:r>
-              <w:rPr>
-                <w:rFonts w:ascii="Courier New" w:hAnsi="Courier New"/>
-                <w:sz w:val="17"/>
-              </w:rPr>
-              <w:t xml:space="preserve">  required String text,</w:t>
-            </w:r>
-          </w:p>
-          <w:p>
-            <w:pPr>
-              <w:spacing w:before="0" w:after="0"/>
-            </w:pPr>
-            <w:r>
-              <w:rPr>
-                <w:rFonts w:ascii="Courier New" w:hAnsi="Courier New"/>
-                <w:sz w:val="17"/>
-              </w:rPr>
-              <w:t>}) async {</w:t>
+              <w:t>// ── CREATE : Envoyer un message</w:t>
+            </w:r>
+          </w:p>
+          <w:p>
+            <w:pPr>
+              <w:spacing w:before="0" w:after="0"/>
+            </w:pPr>
+            <w:r>
+              <w:rPr>
+                <w:rFonts w:ascii="Courier New" w:hAnsi="Courier New"/>
+                <w:sz w:val="17"/>
+              </w:rPr>
+              <w:t>static Future&lt;void&gt; sendMessage({...}) async {</w:t>
             </w:r>
           </w:p>
           <w:p>
@@ -10337,334 +9732,103 @@
                 <w:rFonts w:ascii="Courier New" w:hAnsi="Courier New"/>
                 <w:sz w:val="17"/>
               </w:rPr>
-              <w:t xml:space="preserve">  final now = DateTime.now();</w:t>
-            </w:r>
-          </w:p>
-          <w:p>
-            <w:pPr>
-              <w:spacing w:before="0" w:after="0"/>
-            </w:pPr>
-          </w:p>
-          <w:p>
-            <w:pPr>
-              <w:spacing w:before="0" w:after="0"/>
-            </w:pPr>
-            <w:r>
-              <w:rPr>
-                <w:rFonts w:ascii="Courier New" w:hAnsi="Courier New"/>
-                <w:sz w:val="17"/>
-              </w:rPr>
-              <w:t xml:space="preserve">  // 1. Écriture dans messages/{conversationId}/{msgId}</w:t>
-            </w:r>
-          </w:p>
-          <w:p>
-            <w:pPr>
-              <w:spacing w:before="0" w:after="0"/>
-            </w:pPr>
-            <w:r>
-              <w:rPr>
-                <w:rFonts w:ascii="Courier New" w:hAnsi="Courier New"/>
-                <w:sz w:val="17"/>
-              </w:rPr>
-              <w:t xml:space="preserve">  final message = ChatMessage(</w:t>
-            </w:r>
-          </w:p>
-          <w:p>
-            <w:pPr>
-              <w:spacing w:before="0" w:after="0"/>
-            </w:pPr>
-            <w:r>
-              <w:rPr>
-                <w:rFonts w:ascii="Courier New" w:hAnsi="Courier New"/>
-                <w:sz w:val="17"/>
-              </w:rPr>
-              <w:t xml:space="preserve">    id: msgId,</w:t>
-            </w:r>
-          </w:p>
-          <w:p>
-            <w:pPr>
-              <w:spacing w:before="0" w:after="0"/>
-            </w:pPr>
-            <w:r>
-              <w:rPr>
-                <w:rFonts w:ascii="Courier New" w:hAnsi="Courier New"/>
-                <w:sz w:val="17"/>
-              </w:rPr>
-              <w:t xml:space="preserve">    senderId: senderId,</w:t>
-            </w:r>
-          </w:p>
-          <w:p>
-            <w:pPr>
-              <w:spacing w:before="0" w:after="0"/>
-            </w:pPr>
-            <w:r>
-              <w:rPr>
-                <w:rFonts w:ascii="Courier New" w:hAnsi="Courier New"/>
-                <w:sz w:val="17"/>
-              </w:rPr>
-              <w:t xml:space="preserve">    senderName: senderName,</w:t>
-            </w:r>
-          </w:p>
-          <w:p>
-            <w:pPr>
-              <w:spacing w:before="0" w:after="0"/>
-            </w:pPr>
-            <w:r>
-              <w:rPr>
-                <w:rFonts w:ascii="Courier New" w:hAnsi="Courier New"/>
-                <w:sz w:val="17"/>
-              </w:rPr>
-              <w:t xml:space="preserve">    recipientId: recipientId,</w:t>
-            </w:r>
-          </w:p>
-          <w:p>
-            <w:pPr>
-              <w:spacing w:before="0" w:after="0"/>
-            </w:pPr>
-            <w:r>
-              <w:rPr>
-                <w:rFonts w:ascii="Courier New" w:hAnsi="Courier New"/>
-                <w:sz w:val="17"/>
-              </w:rPr>
-              <w:t xml:space="preserve">    text: text,</w:t>
-            </w:r>
-          </w:p>
-          <w:p>
-            <w:pPr>
-              <w:spacing w:before="0" w:after="0"/>
-            </w:pPr>
-            <w:r>
-              <w:rPr>
-                <w:rFonts w:ascii="Courier New" w:hAnsi="Courier New"/>
-                <w:sz w:val="17"/>
-              </w:rPr>
-              <w:t xml:space="preserve">    timestamp: now,</w:t>
-            </w:r>
-          </w:p>
-          <w:p>
-            <w:pPr>
-              <w:spacing w:before="0" w:after="0"/>
-            </w:pPr>
-            <w:r>
-              <w:rPr>
-                <w:rFonts w:ascii="Courier New" w:hAnsi="Courier New"/>
-                <w:sz w:val="17"/>
-              </w:rPr>
-              <w:t xml:space="preserve">    isRead: false,</w:t>
-            </w:r>
-          </w:p>
-          <w:p>
-            <w:pPr>
-              <w:spacing w:before="0" w:after="0"/>
-            </w:pPr>
-            <w:r>
-              <w:rPr>
-                <w:rFonts w:ascii="Courier New" w:hAnsi="Courier New"/>
-                <w:sz w:val="17"/>
-              </w:rPr>
-              <w:t xml:space="preserve">  );</w:t>
-            </w:r>
-          </w:p>
-          <w:p>
-            <w:pPr>
-              <w:spacing w:before="0" w:after="0"/>
-            </w:pPr>
-            <w:r>
-              <w:rPr>
-                <w:rFonts w:ascii="Courier New" w:hAnsi="Courier New"/>
-                <w:sz w:val="17"/>
-              </w:rPr>
-              <w:t xml:space="preserve">  await _db.child('messages/$conversationId/$msgId').set(message.toJson());</w:t>
-            </w:r>
-          </w:p>
-          <w:p>
-            <w:pPr>
-              <w:spacing w:before="0" w:after="0"/>
-            </w:pPr>
-          </w:p>
-          <w:p>
-            <w:pPr>
-              <w:spacing w:before="0" w:after="0"/>
-            </w:pPr>
-            <w:r>
-              <w:rPr>
-                <w:rFonts w:ascii="Courier New" w:hAnsi="Courier New"/>
-                <w:sz w:val="17"/>
-              </w:rPr>
-              <w:t xml:space="preserve">  // 2. Mise à jour de conversations/ (compteur non lus + dernier message)</w:t>
-            </w:r>
-          </w:p>
-          <w:p>
-            <w:pPr>
-              <w:spacing w:before="0" w:after="0"/>
-            </w:pPr>
-            <w:r>
-              <w:rPr>
-                <w:rFonts w:ascii="Courier New" w:hAnsi="Courier New"/>
-                <w:sz w:val="17"/>
-              </w:rPr>
-              <w:t xml:space="preserve">  final ids = [senderId, recipientId]..sort();</w:t>
-            </w:r>
-          </w:p>
-          <w:p>
-            <w:pPr>
-              <w:spacing w:before="0" w:after="0"/>
-            </w:pPr>
-            <w:r>
-              <w:rPr>
-                <w:rFonts w:ascii="Courier New" w:hAnsi="Courier New"/>
-                <w:sz w:val="17"/>
-              </w:rPr>
-              <w:t xml:space="preserve">  final countSnap =</w:t>
-            </w:r>
-          </w:p>
-          <w:p>
-            <w:pPr>
-              <w:spacing w:before="0" w:after="0"/>
-            </w:pPr>
-            <w:r>
-              <w:rPr>
-                <w:rFonts w:ascii="Courier New" w:hAnsi="Courier New"/>
-                <w:sz w:val="17"/>
-              </w:rPr>
-              <w:t xml:space="preserve">      await _db.child('conversations/$conversationId/unreadCount').get();</w:t>
-            </w:r>
-          </w:p>
-          <w:p>
-            <w:pPr>
-              <w:spacing w:before="0" w:after="0"/>
-            </w:pPr>
-            <w:r>
-              <w:rPr>
-                <w:rFonts w:ascii="Courier New" w:hAnsi="Courier New"/>
-                <w:sz w:val="17"/>
-              </w:rPr>
-              <w:t xml:space="preserve">  final prevUnread = countSnap.value is int ? (countSnap.value as int) : 0;</w:t>
-            </w:r>
-          </w:p>
-          <w:p>
-            <w:pPr>
-              <w:spacing w:before="0" w:after="0"/>
-            </w:pPr>
-          </w:p>
-          <w:p>
-            <w:pPr>
-              <w:spacing w:before="0" w:after="0"/>
-            </w:pPr>
-            <w:r>
-              <w:rPr>
-                <w:rFonts w:ascii="Courier New" w:hAnsi="Courier New"/>
-                <w:sz w:val="17"/>
-              </w:rPr>
-              <w:t xml:space="preserve">  await _db.child('conversations/$conversationId').set(Conversation(</w:t>
-            </w:r>
-          </w:p>
-          <w:p>
-            <w:pPr>
-              <w:spacing w:before="0" w:after="0"/>
-            </w:pPr>
-            <w:r>
-              <w:rPr>
-                <w:rFonts w:ascii="Courier New" w:hAnsi="Courier New"/>
-                <w:sz w:val="17"/>
-              </w:rPr>
-              <w:t xml:space="preserve">    id: conversationId,</w:t>
-            </w:r>
-          </w:p>
-          <w:p>
-            <w:pPr>
-              <w:spacing w:before="0" w:after="0"/>
-            </w:pPr>
-            <w:r>
-              <w:rPr>
-                <w:rFonts w:ascii="Courier New" w:hAnsi="Courier New"/>
-                <w:sz w:val="17"/>
-              </w:rPr>
-              <w:t xml:space="preserve">    user1Id: ids[0],</w:t>
-            </w:r>
-          </w:p>
-          <w:p>
-            <w:pPr>
-              <w:spacing w:before="0" w:after="0"/>
-            </w:pPr>
-            <w:r>
-              <w:rPr>
-                <w:rFonts w:ascii="Courier New" w:hAnsi="Courier New"/>
-                <w:sz w:val="17"/>
-              </w:rPr>
-              <w:t xml:space="preserve">    user2Id: ids[1],</w:t>
-            </w:r>
-          </w:p>
-          <w:p>
-            <w:pPr>
-              <w:spacing w:before="0" w:after="0"/>
-            </w:pPr>
-            <w:r>
-              <w:rPr>
-                <w:rFonts w:ascii="Courier New" w:hAnsi="Courier New"/>
-                <w:sz w:val="17"/>
-              </w:rPr>
-              <w:t xml:space="preserve">    user1Name: ids[0] == senderId ? senderName : recipientName,</w:t>
-            </w:r>
-          </w:p>
-          <w:p>
-            <w:pPr>
-              <w:spacing w:before="0" w:after="0"/>
-            </w:pPr>
-            <w:r>
-              <w:rPr>
-                <w:rFonts w:ascii="Courier New" w:hAnsi="Courier New"/>
-                <w:sz w:val="17"/>
-              </w:rPr>
-              <w:t xml:space="preserve">    user2Name: ids[0] == senderId ? recipientName : senderName,</w:t>
-            </w:r>
-          </w:p>
-          <w:p>
-            <w:pPr>
-              <w:spacing w:before="0" w:after="0"/>
-            </w:pPr>
-            <w:r>
-              <w:rPr>
-                <w:rFonts w:ascii="Courier New" w:hAnsi="Courier New"/>
-                <w:sz w:val="17"/>
-              </w:rPr>
-              <w:t xml:space="preserve">    lastMessage: text,</w:t>
-            </w:r>
-          </w:p>
-          <w:p>
-            <w:pPr>
-              <w:spacing w:before="0" w:after="0"/>
-            </w:pPr>
-            <w:r>
-              <w:rPr>
-                <w:rFonts w:ascii="Courier New" w:hAnsi="Courier New"/>
-                <w:sz w:val="17"/>
-              </w:rPr>
-              <w:t xml:space="preserve">    lastMessageTime: now,</w:t>
-            </w:r>
-          </w:p>
-          <w:p>
-            <w:pPr>
-              <w:spacing w:before="0" w:after="0"/>
-            </w:pPr>
-            <w:r>
-              <w:rPr>
-                <w:rFonts w:ascii="Courier New" w:hAnsi="Courier New"/>
-                <w:sz w:val="17"/>
-              </w:rPr>
-              <w:t xml:space="preserve">    unreadCount: prevUnread + 1,</w:t>
-            </w:r>
-          </w:p>
-          <w:p>
-            <w:pPr>
-              <w:spacing w:before="0" w:after="0"/>
-            </w:pPr>
-            <w:r>
-              <w:rPr>
-                <w:rFonts w:ascii="Courier New" w:hAnsi="Courier New"/>
-                <w:sz w:val="17"/>
-              </w:rPr>
-              <w:t xml:space="preserve">  ).toJson());</w:t>
+              <w:t xml:space="preserve">  await _db.child('messages/$conversationId/$msgId').set(</w:t>
+            </w:r>
+          </w:p>
+          <w:p>
+            <w:pPr>
+              <w:spacing w:before="0" w:after="0"/>
+            </w:pPr>
+            <w:r>
+              <w:rPr>
+                <w:rFonts w:ascii="Courier New" w:hAnsi="Courier New"/>
+                <w:sz w:val="17"/>
+              </w:rPr>
+              <w:t xml:space="preserve">    ChatMessage(id: msgId, senderId: senderId, text: text,</w:t>
+            </w:r>
+          </w:p>
+          <w:p>
+            <w:pPr>
+              <w:spacing w:before="0" w:after="0"/>
+            </w:pPr>
+            <w:r>
+              <w:rPr>
+                <w:rFonts w:ascii="Courier New" w:hAnsi="Courier New"/>
+                <w:sz w:val="17"/>
+              </w:rPr>
+              <w:t xml:space="preserve">                timestamp: DateTime.now(), isRead: false).toJson());</w:t>
+            </w:r>
+          </w:p>
+          <w:p>
+            <w:pPr>
+              <w:spacing w:before="0" w:after="0"/>
+            </w:pPr>
+            <w:r>
+              <w:rPr>
+                <w:rFonts w:ascii="Courier New" w:hAnsi="Courier New"/>
+                <w:sz w:val="17"/>
+              </w:rPr>
+              <w:t xml:space="preserve">  // Mise à jour de la conversation (dernier message + compteur non lus)</w:t>
+            </w:r>
+          </w:p>
+          <w:p>
+            <w:pPr>
+              <w:spacing w:before="0" w:after="0"/>
+            </w:pPr>
+            <w:r>
+              <w:rPr>
+                <w:rFonts w:ascii="Courier New" w:hAnsi="Courier New"/>
+                <w:sz w:val="17"/>
+              </w:rPr>
+              <w:t xml:space="preserve">  await _db.child('conversations/$conversationId').update({</w:t>
+            </w:r>
+          </w:p>
+          <w:p>
+            <w:pPr>
+              <w:spacing w:before="0" w:after="0"/>
+            </w:pPr>
+            <w:r>
+              <w:rPr>
+                <w:rFonts w:ascii="Courier New" w:hAnsi="Courier New"/>
+                <w:sz w:val="17"/>
+              </w:rPr>
+              <w:t xml:space="preserve">    'lastMessage': text,</w:t>
+            </w:r>
+          </w:p>
+          <w:p>
+            <w:pPr>
+              <w:spacing w:before="0" w:after="0"/>
+            </w:pPr>
+            <w:r>
+              <w:rPr>
+                <w:rFonts w:ascii="Courier New" w:hAnsi="Courier New"/>
+                <w:sz w:val="17"/>
+              </w:rPr>
+              <w:t xml:space="preserve">    'lastMessageTime': DateTime.now().toIso8601String(),</w:t>
+            </w:r>
+          </w:p>
+          <w:p>
+            <w:pPr>
+              <w:spacing w:before="0" w:after="0"/>
+            </w:pPr>
+            <w:r>
+              <w:rPr>
+                <w:rFonts w:ascii="Courier New" w:hAnsi="Courier New"/>
+                <w:sz w:val="17"/>
+              </w:rPr>
+              <w:t xml:space="preserve">    'unreadCount': ServerValue.increment(1),</w:t>
+            </w:r>
+          </w:p>
+          <w:p>
+            <w:pPr>
+              <w:spacing w:before="0" w:after="0"/>
+            </w:pPr>
+            <w:r>
+              <w:rPr>
+                <w:rFonts w:ascii="Courier New" w:hAnsi="Courier New"/>
+                <w:sz w:val="17"/>
+              </w:rPr>
+              <w:t xml:space="preserve">  });</w:t>
             </w:r>
           </w:p>
           <w:p>
@@ -10693,7 +9857,7 @@
                 <w:rFonts w:ascii="Courier New" w:hAnsi="Courier New"/>
                 <w:sz w:val="17"/>
               </w:rPr>
-              <w:t>// ── READ (stream) : Messages d'une conversation (WebSocket)</w:t>
+              <w:t>// ── READ (stream) : Messages temps réel + conversations d'un utilisateur</w:t>
             </w:r>
           </w:p>
           <w:p>
@@ -10765,43 +9929,19 @@
                 <w:rFonts w:ascii="Courier New" w:hAnsi="Courier New"/>
                 <w:sz w:val="17"/>
               </w:rPr>
-              <w:t xml:space="preserve">        .map&lt;ChatMessage&gt;((v) =&gt;</w:t>
-            </w:r>
-          </w:p>
-          <w:p>
-            <w:pPr>
-              <w:spacing w:before="0" w:after="0"/>
-            </w:pPr>
-            <w:r>
-              <w:rPr>
-                <w:rFonts w:ascii="Courier New" w:hAnsi="Courier New"/>
-                <w:sz w:val="17"/>
-              </w:rPr>
-              <w:t xml:space="preserve">            ChatMessage.fromJson(Map&lt;String, dynamic&gt;.from(v as Map)))</w:t>
-            </w:r>
-          </w:p>
-          <w:p>
-            <w:pPr>
-              <w:spacing w:before="0" w:after="0"/>
-            </w:pPr>
-            <w:r>
-              <w:rPr>
-                <w:rFonts w:ascii="Courier New" w:hAnsi="Courier New"/>
-                <w:sz w:val="17"/>
-              </w:rPr>
-              <w:t xml:space="preserve">        .toList()</w:t>
-            </w:r>
-          </w:p>
-          <w:p>
-            <w:pPr>
-              <w:spacing w:before="0" w:after="0"/>
-            </w:pPr>
-            <w:r>
-              <w:rPr>
-                <w:rFonts w:ascii="Courier New" w:hAnsi="Courier New"/>
-                <w:sz w:val="17"/>
-              </w:rPr>
-              <w:t xml:space="preserve">      ..sort((a, b) =&gt; a.timestamp.compareTo(b.timestamp));</w:t>
+              <w:t xml:space="preserve">        .map&lt;ChatMessage&gt;((v) =&gt; ChatMessage.fromJson(Map&lt;String, dynamic&gt;.from(v as Map)))</w:t>
+            </w:r>
+          </w:p>
+          <w:p>
+            <w:pPr>
+              <w:spacing w:before="0" w:after="0"/>
+            </w:pPr>
+            <w:r>
+              <w:rPr>
+                <w:rFonts w:ascii="Courier New" w:hAnsi="Courier New"/>
+                <w:sz w:val="17"/>
+              </w:rPr>
+              <w:t xml:space="preserve">        .toList()..sort((a, b) =&gt; a.timestamp.compareTo(b.timestamp));</w:t>
             </w:r>
           </w:p>
           <w:p>
@@ -10814,309 +9954,6 @@
                 <w:sz w:val="17"/>
               </w:rPr>
               <w:t xml:space="preserve">  });</w:t>
-            </w:r>
-          </w:p>
-          <w:p>
-            <w:pPr>
-              <w:spacing w:before="0" w:after="0"/>
-            </w:pPr>
-            <w:r>
-              <w:rPr>
-                <w:rFonts w:ascii="Courier New" w:hAnsi="Courier New"/>
-                <w:sz w:val="17"/>
-              </w:rPr>
-              <w:t>}</w:t>
-            </w:r>
-          </w:p>
-          <w:p>
-            <w:pPr>
-              <w:spacing w:before="0" w:after="0"/>
-            </w:pPr>
-          </w:p>
-          <w:p>
-            <w:pPr>
-              <w:spacing w:before="0" w:after="0"/>
-            </w:pPr>
-            <w:r>
-              <w:rPr>
-                <w:rFonts w:ascii="Courier New" w:hAnsi="Courier New"/>
-                <w:sz w:val="17"/>
-              </w:rPr>
-              <w:t>// ── READ (stream) : Toutes les conversations d'un utilisateur</w:t>
-            </w:r>
-          </w:p>
-          <w:p>
-            <w:pPr>
-              <w:spacing w:before="0" w:after="0"/>
-            </w:pPr>
-            <w:r>
-              <w:rPr>
-                <w:rFonts w:ascii="Courier New" w:hAnsi="Courier New"/>
-                <w:sz w:val="17"/>
-              </w:rPr>
-              <w:t>static Stream&lt;List&lt;Conversation&gt;&gt; getConversations(String userId) {</w:t>
-            </w:r>
-          </w:p>
-          <w:p>
-            <w:pPr>
-              <w:spacing w:before="0" w:after="0"/>
-            </w:pPr>
-            <w:r>
-              <w:rPr>
-                <w:rFonts w:ascii="Courier New" w:hAnsi="Courier New"/>
-                <w:sz w:val="17"/>
-              </w:rPr>
-              <w:t xml:space="preserve">  return _db.child('conversations').onValue.map((event) {</w:t>
-            </w:r>
-          </w:p>
-          <w:p>
-            <w:pPr>
-              <w:spacing w:before="0" w:after="0"/>
-            </w:pPr>
-            <w:r>
-              <w:rPr>
-                <w:rFonts w:ascii="Courier New" w:hAnsi="Courier New"/>
-                <w:sz w:val="17"/>
-              </w:rPr>
-              <w:t xml:space="preserve">    final data = event.snapshot.value as Map?;</w:t>
-            </w:r>
-          </w:p>
-          <w:p>
-            <w:pPr>
-              <w:spacing w:before="0" w:after="0"/>
-            </w:pPr>
-            <w:r>
-              <w:rPr>
-                <w:rFonts w:ascii="Courier New" w:hAnsi="Courier New"/>
-                <w:sz w:val="17"/>
-              </w:rPr>
-              <w:t xml:space="preserve">    if (data == null) return [];</w:t>
-            </w:r>
-          </w:p>
-          <w:p>
-            <w:pPr>
-              <w:spacing w:before="0" w:after="0"/>
-            </w:pPr>
-            <w:r>
-              <w:rPr>
-                <w:rFonts w:ascii="Courier New" w:hAnsi="Courier New"/>
-                <w:sz w:val="17"/>
-              </w:rPr>
-              <w:t xml:space="preserve">    return data.values</w:t>
-            </w:r>
-          </w:p>
-          <w:p>
-            <w:pPr>
-              <w:spacing w:before="0" w:after="0"/>
-            </w:pPr>
-            <w:r>
-              <w:rPr>
-                <w:rFonts w:ascii="Courier New" w:hAnsi="Courier New"/>
-                <w:sz w:val="17"/>
-              </w:rPr>
-              <w:t xml:space="preserve">        .where((v) =&gt; v is Map &amp;&amp;</w:t>
-            </w:r>
-          </w:p>
-          <w:p>
-            <w:pPr>
-              <w:spacing w:before="0" w:after="0"/>
-            </w:pPr>
-            <w:r>
-              <w:rPr>
-                <w:rFonts w:ascii="Courier New" w:hAnsi="Courier New"/>
-                <w:sz w:val="17"/>
-              </w:rPr>
-              <w:t xml:space="preserve">            (v['user1Id'] == userId || v['user2Id'] == userId))</w:t>
-            </w:r>
-          </w:p>
-          <w:p>
-            <w:pPr>
-              <w:spacing w:before="0" w:after="0"/>
-            </w:pPr>
-            <w:r>
-              <w:rPr>
-                <w:rFonts w:ascii="Courier New" w:hAnsi="Courier New"/>
-                <w:sz w:val="17"/>
-              </w:rPr>
-              <w:t xml:space="preserve">        .map&lt;Conversation&gt;((v) =&gt;</w:t>
-            </w:r>
-          </w:p>
-          <w:p>
-            <w:pPr>
-              <w:spacing w:before="0" w:after="0"/>
-            </w:pPr>
-            <w:r>
-              <w:rPr>
-                <w:rFonts w:ascii="Courier New" w:hAnsi="Courier New"/>
-                <w:sz w:val="17"/>
-              </w:rPr>
-              <w:t xml:space="preserve">            Conversation.fromJson(Map&lt;String, dynamic&gt;.from(v as Map)))</w:t>
-            </w:r>
-          </w:p>
-          <w:p>
-            <w:pPr>
-              <w:spacing w:before="0" w:after="0"/>
-            </w:pPr>
-            <w:r>
-              <w:rPr>
-                <w:rFonts w:ascii="Courier New" w:hAnsi="Courier New"/>
-                <w:sz w:val="17"/>
-              </w:rPr>
-              <w:t xml:space="preserve">        .toList()</w:t>
-            </w:r>
-          </w:p>
-          <w:p>
-            <w:pPr>
-              <w:spacing w:before="0" w:after="0"/>
-            </w:pPr>
-            <w:r>
-              <w:rPr>
-                <w:rFonts w:ascii="Courier New" w:hAnsi="Courier New"/>
-                <w:sz w:val="17"/>
-              </w:rPr>
-              <w:t xml:space="preserve">      ..sort((a, b) =&gt; b.lastMessageTime.compareTo(a.lastMessageTime));</w:t>
-            </w:r>
-          </w:p>
-          <w:p>
-            <w:pPr>
-              <w:spacing w:before="0" w:after="0"/>
-            </w:pPr>
-            <w:r>
-              <w:rPr>
-                <w:rFonts w:ascii="Courier New" w:hAnsi="Courier New"/>
-                <w:sz w:val="17"/>
-              </w:rPr>
-              <w:t xml:space="preserve">  });</w:t>
-            </w:r>
-          </w:p>
-          <w:p>
-            <w:pPr>
-              <w:spacing w:before="0" w:after="0"/>
-            </w:pPr>
-            <w:r>
-              <w:rPr>
-                <w:rFonts w:ascii="Courier New" w:hAnsi="Courier New"/>
-                <w:sz w:val="17"/>
-              </w:rPr>
-              <w:t>}</w:t>
-            </w:r>
-          </w:p>
-          <w:p>
-            <w:pPr>
-              <w:spacing w:before="0" w:after="0"/>
-            </w:pPr>
-          </w:p>
-          <w:p>
-            <w:pPr>
-              <w:spacing w:before="0" w:after="0"/>
-            </w:pPr>
-            <w:r>
-              <w:rPr>
-                <w:rFonts w:ascii="Courier New" w:hAnsi="Courier New"/>
-                <w:sz w:val="17"/>
-              </w:rPr>
-              <w:t>// ── UPDATE : Marquer la conversation comme lue (réinitialise le compteur)</w:t>
-            </w:r>
-          </w:p>
-          <w:p>
-            <w:pPr>
-              <w:spacing w:before="0" w:after="0"/>
-            </w:pPr>
-            <w:r>
-              <w:rPr>
-                <w:rFonts w:ascii="Courier New" w:hAnsi="Courier New"/>
-                <w:sz w:val="17"/>
-              </w:rPr>
-              <w:t>static Future&lt;void&gt; markConversationAsRead(String conversationId) async {</w:t>
-            </w:r>
-          </w:p>
-          <w:p>
-            <w:pPr>
-              <w:spacing w:before="0" w:after="0"/>
-            </w:pPr>
-            <w:r>
-              <w:rPr>
-                <w:rFonts w:ascii="Courier New" w:hAnsi="Courier New"/>
-                <w:sz w:val="17"/>
-              </w:rPr>
-              <w:t xml:space="preserve">  await _db.child('conversations/$conversationId')</w:t>
-            </w:r>
-          </w:p>
-          <w:p>
-            <w:pPr>
-              <w:spacing w:before="0" w:after="0"/>
-            </w:pPr>
-            <w:r>
-              <w:rPr>
-                <w:rFonts w:ascii="Courier New" w:hAnsi="Courier New"/>
-                <w:sz w:val="17"/>
-              </w:rPr>
-              <w:t xml:space="preserve">      .update({'unreadCount': 0});</w:t>
-            </w:r>
-          </w:p>
-          <w:p>
-            <w:pPr>
-              <w:spacing w:before="0" w:after="0"/>
-            </w:pPr>
-            <w:r>
-              <w:rPr>
-                <w:rFonts w:ascii="Courier New" w:hAnsi="Courier New"/>
-                <w:sz w:val="17"/>
-              </w:rPr>
-              <w:t>}</w:t>
-            </w:r>
-          </w:p>
-          <w:p>
-            <w:pPr>
-              <w:spacing w:before="0" w:after="0"/>
-            </w:pPr>
-          </w:p>
-          <w:p>
-            <w:pPr>
-              <w:spacing w:before="0" w:after="0"/>
-            </w:pPr>
-            <w:r>
-              <w:rPr>
-                <w:rFonts w:ascii="Courier New" w:hAnsi="Courier New"/>
-                <w:sz w:val="17"/>
-              </w:rPr>
-              <w:t>// ── Génère un ID de conversation déterministe entre deux utilisateurs</w:t>
-            </w:r>
-          </w:p>
-          <w:p>
-            <w:pPr>
-              <w:spacing w:before="0" w:after="0"/>
-            </w:pPr>
-            <w:r>
-              <w:rPr>
-                <w:rFonts w:ascii="Courier New" w:hAnsi="Courier New"/>
-                <w:sz w:val="17"/>
-              </w:rPr>
-              <w:t>static String generateConversationId(String userId1, String userId2) {</w:t>
-            </w:r>
-          </w:p>
-          <w:p>
-            <w:pPr>
-              <w:spacing w:before="0" w:after="0"/>
-            </w:pPr>
-            <w:r>
-              <w:rPr>
-                <w:rFonts w:ascii="Courier New" w:hAnsi="Courier New"/>
-                <w:sz w:val="17"/>
-              </w:rPr>
-              <w:t xml:space="preserve">  final ids = [userId1, userId2]..sort(); // Tri alphabétique pour cohérence</w:t>
-            </w:r>
-          </w:p>
-          <w:p>
-            <w:pPr>
-              <w:spacing w:before="0" w:after="0"/>
-            </w:pPr>
-            <w:r>
-              <w:rPr>
-                <w:rFonts w:ascii="Courier New" w:hAnsi="Courier New"/>
-                <w:sz w:val="17"/>
-              </w:rPr>
-              <w:t xml:space="preserve">  return '${ids[0]}-${ids[1]}';</w:t>
             </w:r>
           </w:p>
           <w:p>
@@ -11165,16 +10002,22 @@
       </w:tblGrid>
       <w:tr>
         <w:trPr>
-          <w:trHeight w:val="3969" w:hRule="exact"/>
+          <w:trHeight w:val="1701" w:hRule="atLeast"/>
         </w:trPr>
         <w:tc>
           <w:tcPr>
             <w:tcW w:type="dxa" w:w="9072"/>
             <w:shd w:val="clear" w:color="auto" w:fill="F0F0F0"/>
+            <w:tcMar>
+              <w:top w:w="113" w:type="dxa"/>
+              <w:left w:w="113" w:type="dxa"/>
+              <w:bottom w:w="113" w:type="dxa"/>
+              <w:right w:w="113" w:type="dxa"/>
+            </w:tcMar>
           </w:tcPr>
           <w:p>
             <w:pPr>
-              <w:spacing w:before="1080"/>
+              <w:spacing w:before="200" w:after="200"/>
               <w:jc w:val="center"/>
             </w:pPr>
             <w:r>
@@ -11221,16 +10064,22 @@
       </w:tblGrid>
       <w:tr>
         <w:trPr>
-          <w:trHeight w:val="3969" w:hRule="exact"/>
+          <w:trHeight w:val="1701" w:hRule="atLeast"/>
         </w:trPr>
         <w:tc>
           <w:tcPr>
             <w:tcW w:type="dxa" w:w="9072"/>
             <w:shd w:val="clear" w:color="auto" w:fill="F0F0F0"/>
+            <w:tcMar>
+              <w:top w:w="113" w:type="dxa"/>
+              <w:left w:w="113" w:type="dxa"/>
+              <w:bottom w:w="113" w:type="dxa"/>
+              <w:right w:w="113" w:type="dxa"/>
+            </w:tcMar>
           </w:tcPr>
           <w:p>
             <w:pPr>
-              <w:spacing w:before="1080"/>
+              <w:spacing w:before="200" w:after="200"/>
               <w:jc w:val="center"/>
             </w:pPr>
             <w:r>
@@ -11310,168 +10159,84 @@
                 <w:rFonts w:ascii="Courier New" w:hAnsi="Courier New"/>
                 <w:sz w:val="17"/>
               </w:rPr>
-              <w:t>// ── READ (stream) : Disponibilités d'un mentor</w:t>
-            </w:r>
-          </w:p>
-          <w:p>
-            <w:pPr>
-              <w:spacing w:before="0" w:after="0"/>
-            </w:pPr>
-            <w:r>
-              <w:rPr>
-                <w:rFonts w:ascii="Courier New" w:hAnsi="Courier New"/>
-                <w:sz w:val="17"/>
-              </w:rPr>
-              <w:t>static Stream&lt;Availability?&gt; getAvailability(String userId) {</w:t>
-            </w:r>
-          </w:p>
-          <w:p>
-            <w:pPr>
-              <w:spacing w:before="0" w:after="0"/>
-            </w:pPr>
-            <w:r>
-              <w:rPr>
-                <w:rFonts w:ascii="Courier New" w:hAnsi="Courier New"/>
-                <w:sz w:val="17"/>
-              </w:rPr>
-              <w:t xml:space="preserve">  return _db.child('availability/$userId').onValue.map((event) {</w:t>
-            </w:r>
-          </w:p>
-          <w:p>
-            <w:pPr>
-              <w:spacing w:before="0" w:after="0"/>
-            </w:pPr>
-            <w:r>
-              <w:rPr>
-                <w:rFonts w:ascii="Courier New" w:hAnsi="Courier New"/>
-                <w:sz w:val="17"/>
-              </w:rPr>
-              <w:t xml:space="preserve">    final data = event.snapshot.value as Map?;</w:t>
-            </w:r>
-          </w:p>
-          <w:p>
-            <w:pPr>
-              <w:spacing w:before="0" w:after="0"/>
-            </w:pPr>
-            <w:r>
-              <w:rPr>
-                <w:rFonts w:ascii="Courier New" w:hAnsi="Courier New"/>
-                <w:sz w:val="17"/>
-              </w:rPr>
-              <w:t xml:space="preserve">    if (data == null) return null;</w:t>
-            </w:r>
-          </w:p>
-          <w:p>
-            <w:pPr>
-              <w:spacing w:before="0" w:after="0"/>
-            </w:pPr>
-            <w:r>
-              <w:rPr>
-                <w:rFonts w:ascii="Courier New" w:hAnsi="Courier New"/>
-                <w:sz w:val="17"/>
-              </w:rPr>
-              <w:t xml:space="preserve">    return Availability.fromJson(Map&lt;String, dynamic&gt;.from(data));</w:t>
-            </w:r>
-          </w:p>
-          <w:p>
-            <w:pPr>
-              <w:spacing w:before="0" w:after="0"/>
-            </w:pPr>
-            <w:r>
-              <w:rPr>
-                <w:rFonts w:ascii="Courier New" w:hAnsi="Courier New"/>
-                <w:sz w:val="17"/>
-              </w:rPr>
-              <w:t xml:space="preserve">  });</w:t>
-            </w:r>
-          </w:p>
-          <w:p>
-            <w:pPr>
-              <w:spacing w:before="0" w:after="0"/>
-            </w:pPr>
-            <w:r>
-              <w:rPr>
-                <w:rFonts w:ascii="Courier New" w:hAnsi="Courier New"/>
-                <w:sz w:val="17"/>
-              </w:rPr>
-              <w:t>}</w:t>
-            </w:r>
-          </w:p>
-          <w:p>
-            <w:pPr>
-              <w:spacing w:before="0" w:after="0"/>
-            </w:pPr>
-          </w:p>
-          <w:p>
-            <w:pPr>
-              <w:spacing w:before="0" w:after="0"/>
-            </w:pPr>
-            <w:r>
-              <w:rPr>
-                <w:rFonts w:ascii="Courier New" w:hAnsi="Courier New"/>
-                <w:sz w:val="17"/>
-              </w:rPr>
-              <w:t>// ── UPDATE : Mettre à jour les disponibilités</w:t>
-            </w:r>
-          </w:p>
-          <w:p>
-            <w:pPr>
-              <w:spacing w:before="0" w:after="0"/>
-            </w:pPr>
-            <w:r>
-              <w:rPr>
-                <w:rFonts w:ascii="Courier New" w:hAnsi="Courier New"/>
-                <w:sz w:val="17"/>
-              </w:rPr>
-              <w:t>static Future&lt;void&gt; updateAvailability(Availability availability) async {</w:t>
-            </w:r>
-          </w:p>
-          <w:p>
-            <w:pPr>
-              <w:spacing w:before="0" w:after="0"/>
-            </w:pPr>
-            <w:r>
-              <w:rPr>
-                <w:rFonts w:ascii="Courier New" w:hAnsi="Courier New"/>
-                <w:sz w:val="17"/>
-              </w:rPr>
-              <w:t xml:space="preserve">  await _db</w:t>
-            </w:r>
-          </w:p>
-          <w:p>
-            <w:pPr>
-              <w:spacing w:before="0" w:after="0"/>
-            </w:pPr>
-            <w:r>
-              <w:rPr>
-                <w:rFonts w:ascii="Courier New" w:hAnsi="Courier New"/>
-                <w:sz w:val="17"/>
-              </w:rPr>
-              <w:t xml:space="preserve">      .child('availability/${availability.userId}')</w:t>
-            </w:r>
-          </w:p>
-          <w:p>
-            <w:pPr>
-              <w:spacing w:before="0" w:after="0"/>
-            </w:pPr>
-            <w:r>
-              <w:rPr>
-                <w:rFonts w:ascii="Courier New" w:hAnsi="Courier New"/>
-                <w:sz w:val="17"/>
-              </w:rPr>
-              <w:t xml:space="preserve">      .set(availability.toJson());</w:t>
-            </w:r>
-          </w:p>
-          <w:p>
-            <w:pPr>
-              <w:spacing w:before="0" w:after="0"/>
-            </w:pPr>
-            <w:r>
-              <w:rPr>
-                <w:rFonts w:ascii="Courier New" w:hAnsi="Courier New"/>
-                <w:sz w:val="17"/>
-              </w:rPr>
-              <w:t>}</w:t>
+              <w:t>static Stream&lt;Availability?&gt; getAvailability(String userId) =&gt;</w:t>
+            </w:r>
+          </w:p>
+          <w:p>
+            <w:pPr>
+              <w:spacing w:before="0" w:after="0"/>
+            </w:pPr>
+            <w:r>
+              <w:rPr>
+                <w:rFonts w:ascii="Courier New" w:hAnsi="Courier New"/>
+                <w:sz w:val="17"/>
+              </w:rPr>
+              <w:t xml:space="preserve">    _db.child('availability/$userId').onValue.map((e) {</w:t>
+            </w:r>
+          </w:p>
+          <w:p>
+            <w:pPr>
+              <w:spacing w:before="0" w:after="0"/>
+            </w:pPr>
+            <w:r>
+              <w:rPr>
+                <w:rFonts w:ascii="Courier New" w:hAnsi="Courier New"/>
+                <w:sz w:val="17"/>
+              </w:rPr>
+              <w:t xml:space="preserve">      final data = e.snapshot.value as Map?;</w:t>
+            </w:r>
+          </w:p>
+          <w:p>
+            <w:pPr>
+              <w:spacing w:before="0" w:after="0"/>
+            </w:pPr>
+            <w:r>
+              <w:rPr>
+                <w:rFonts w:ascii="Courier New" w:hAnsi="Courier New"/>
+                <w:sz w:val="17"/>
+              </w:rPr>
+              <w:t xml:space="preserve">      return data == null ? null : Availability.fromJson(Map&lt;String, dynamic&gt;.from(data));</w:t>
+            </w:r>
+          </w:p>
+          <w:p>
+            <w:pPr>
+              <w:spacing w:before="0" w:after="0"/>
+            </w:pPr>
+            <w:r>
+              <w:rPr>
+                <w:rFonts w:ascii="Courier New" w:hAnsi="Courier New"/>
+                <w:sz w:val="17"/>
+              </w:rPr>
+              <w:t xml:space="preserve">    });</w:t>
+            </w:r>
+          </w:p>
+          <w:p>
+            <w:pPr>
+              <w:spacing w:before="0" w:after="0"/>
+            </w:pPr>
+          </w:p>
+          <w:p>
+            <w:pPr>
+              <w:spacing w:before="0" w:after="0"/>
+            </w:pPr>
+            <w:r>
+              <w:rPr>
+                <w:rFonts w:ascii="Courier New" w:hAnsi="Courier New"/>
+                <w:sz w:val="17"/>
+              </w:rPr>
+              <w:t>static Future&lt;void&gt; updateAvailability(Availability a) =&gt;</w:t>
+            </w:r>
+          </w:p>
+          <w:p>
+            <w:pPr>
+              <w:spacing w:before="0" w:after="0"/>
+            </w:pPr>
+            <w:r>
+              <w:rPr>
+                <w:rFonts w:ascii="Courier New" w:hAnsi="Courier New"/>
+                <w:sz w:val="17"/>
+              </w:rPr>
+              <w:t xml:space="preserve">    _db.child('availability/${a.userId}').set(a.toJson());</w:t>
             </w:r>
           </w:p>
         </w:tc>
@@ -11508,16 +10273,22 @@
       </w:tblGrid>
       <w:tr>
         <w:trPr>
-          <w:trHeight w:val="3969" w:hRule="exact"/>
+          <w:trHeight w:val="1701" w:hRule="atLeast"/>
         </w:trPr>
         <w:tc>
           <w:tcPr>
             <w:tcW w:type="dxa" w:w="9072"/>
             <w:shd w:val="clear" w:color="auto" w:fill="F0F0F0"/>
+            <w:tcMar>
+              <w:top w:w="113" w:type="dxa"/>
+              <w:left w:w="113" w:type="dxa"/>
+              <w:bottom w:w="113" w:type="dxa"/>
+              <w:right w:w="113" w:type="dxa"/>
+            </w:tcMar>
           </w:tcPr>
           <w:p>
             <w:pPr>
-              <w:spacing w:before="1080"/>
+              <w:spacing w:before="200" w:after="200"/>
               <w:jc w:val="center"/>
             </w:pPr>
             <w:r>
@@ -11607,25 +10378,7 @@
           <w:i w:val="0"/>
           <w:sz w:val="22"/>
         </w:rPr>
-        <w:t xml:space="preserve"> lit en temps réel les membres DIAPALER (mentors + investisseurs) inscrits via </w:t>
-      </w:r>
-      <w:r>
-        <w:rPr>
-          <w:rFonts w:ascii="Times New Roman" w:hAnsi="Times New Roman"/>
-          <w:b w:val="0"/>
-          <w:i w:val="0"/>
-          <w:sz w:val="22"/>
-        </w:rPr>
-        <w:t>SignUpPage</w:t>
-      </w:r>
-      <w:r>
-        <w:rPr>
-          <w:rFonts w:ascii="Times New Roman" w:hAnsi="Times New Roman"/>
-          <w:b w:val="0"/>
-          <w:i w:val="0"/>
-          <w:sz w:val="22"/>
-        </w:rPr>
-        <w:t xml:space="preserve"> pour les afficher dans la page Matching au-dessus des profils pré-chargés.</w:t>
+        <w:t xml:space="preserve"> lit les membres DIAPALER inscrits (Mentor + Investisseur uniquement) depuis Firebase et les affiche dans la page Matching au-dessus des 100+ profils statiques, avec un badge "Membre DIAPALER" distinctif.</w:t>
       </w:r>
     </w:p>
     <w:p>
@@ -11665,59 +10418,6 @@
                 <w:rFonts w:ascii="Courier New" w:hAnsi="Courier New"/>
                 <w:sz w:val="17"/>
               </w:rPr>
-              <w:t>// lib/services/service_utilisateurs.dart</w:t>
-            </w:r>
-          </w:p>
-          <w:p>
-            <w:pPr>
-              <w:spacing w:before="0" w:after="0"/>
-            </w:pPr>
-            <w:r>
-              <w:rPr>
-                <w:rFonts w:ascii="Courier New" w:hAnsi="Courier New"/>
-                <w:sz w:val="17"/>
-              </w:rPr>
-              <w:t>import 'package:firebase_database/firebase_database.dart';</w:t>
-            </w:r>
-          </w:p>
-          <w:p>
-            <w:pPr>
-              <w:spacing w:before="0" w:after="0"/>
-            </w:pPr>
-            <w:r>
-              <w:rPr>
-                <w:rFonts w:ascii="Courier New" w:hAnsi="Courier New"/>
-                <w:sz w:val="17"/>
-              </w:rPr>
-              <w:t>import '../data/donnees_mentors.dart';</w:t>
-            </w:r>
-          </w:p>
-          <w:p>
-            <w:pPr>
-              <w:spacing w:before="0" w:after="0"/>
-            </w:pPr>
-            <w:r>
-              <w:rPr>
-                <w:rFonts w:ascii="Courier New" w:hAnsi="Courier New"/>
-                <w:sz w:val="17"/>
-              </w:rPr>
-              <w:t>import 'service_authentification.dart';</w:t>
-            </w:r>
-          </w:p>
-          <w:p>
-            <w:pPr>
-              <w:spacing w:before="0" w:after="0"/>
-            </w:pPr>
-          </w:p>
-          <w:p>
-            <w:pPr>
-              <w:spacing w:before="0" w:after="0"/>
-            </w:pPr>
-            <w:r>
-              <w:rPr>
-                <w:rFonts w:ascii="Courier New" w:hAnsi="Courier New"/>
-                <w:sz w:val="17"/>
-              </w:rPr>
               <w:t>class UsersService {</w:t>
             </w:r>
           </w:p>
@@ -11730,47 +10430,6 @@
                 <w:rFonts w:ascii="Courier New" w:hAnsi="Courier New"/>
                 <w:sz w:val="17"/>
               </w:rPr>
-              <w:t xml:space="preserve">  static FirebaseDatabase get _db =&gt; FirebaseDatabase.instance;</w:t>
-            </w:r>
-          </w:p>
-          <w:p>
-            <w:pPr>
-              <w:spacing w:before="0" w:after="0"/>
-            </w:pPr>
-          </w:p>
-          <w:p>
-            <w:pPr>
-              <w:spacing w:before="0" w:after="0"/>
-            </w:pPr>
-            <w:r>
-              <w:rPr>
-                <w:rFonts w:ascii="Courier New" w:hAnsi="Courier New"/>
-                <w:sz w:val="17"/>
-              </w:rPr>
-              <w:t xml:space="preserve">  /// Récupère les membres inscrits (Mentor + Investisseur uniquement).</w:t>
-            </w:r>
-          </w:p>
-          <w:p>
-            <w:pPr>
-              <w:spacing w:before="0" w:after="0"/>
-            </w:pPr>
-            <w:r>
-              <w:rPr>
-                <w:rFonts w:ascii="Courier New" w:hAnsi="Courier New"/>
-                <w:sz w:val="17"/>
-              </w:rPr>
-              <w:t xml:space="preserve">  /// L'utilisateur courant est exclu de la liste.</w:t>
-            </w:r>
-          </w:p>
-          <w:p>
-            <w:pPr>
-              <w:spacing w:before="0" w:after="0"/>
-            </w:pPr>
-            <w:r>
-              <w:rPr>
-                <w:rFonts w:ascii="Courier New" w:hAnsi="Courier New"/>
-                <w:sz w:val="17"/>
-              </w:rPr>
               <w:t xml:space="preserve">  static Future&lt;List&lt;Mentor&gt;&gt; listMembers() async {</w:t>
             </w:r>
           </w:p>
@@ -11783,7 +10442,7 @@
                 <w:rFonts w:ascii="Courier New" w:hAnsi="Courier New"/>
                 <w:sz w:val="17"/>
               </w:rPr>
-              <w:t xml:space="preserve">    final snap = await _db.ref('users').get();</w:t>
+              <w:t xml:space="preserve">    final snap = await FirebaseDatabase.instance.ref('users').get();</w:t>
             </w:r>
           </w:p>
           <w:p>
@@ -11802,23 +10461,6 @@
             <w:pPr>
               <w:spacing w:before="0" w:after="0"/>
             </w:pPr>
-          </w:p>
-          <w:p>
-            <w:pPr>
-              <w:spacing w:before="0" w:after="0"/>
-            </w:pPr>
-            <w:r>
-              <w:rPr>
-                <w:rFonts w:ascii="Courier New" w:hAnsi="Courier New"/>
-                <w:sz w:val="17"/>
-              </w:rPr>
-              <w:t xml:space="preserve">    // Cast sécurisé : Firebase retourne Map&lt;Object?, Object?&gt;</w:t>
-            </w:r>
-          </w:p>
-          <w:p>
-            <w:pPr>
-              <w:spacing w:before="0" w:after="0"/>
-            </w:pPr>
             <w:r>
               <w:rPr>
                 <w:rFonts w:ascii="Courier New" w:hAnsi="Courier New"/>
@@ -11843,11 +10485,6 @@
             <w:pPr>
               <w:spacing w:before="0" w:after="0"/>
             </w:pPr>
-          </w:p>
-          <w:p>
-            <w:pPr>
-              <w:spacing w:before="0" w:after="0"/>
-            </w:pPr>
             <w:r>
               <w:rPr>
                 <w:rFonts w:ascii="Courier New" w:hAnsi="Courier New"/>
@@ -11877,84 +10514,31 @@
                 <w:rFonts w:ascii="Courier New" w:hAnsi="Courier New"/>
                 <w:sz w:val="17"/>
               </w:rPr>
-              <w:t xml:space="preserve">      final uid = entry.key;</w:t>
-            </w:r>
-          </w:p>
-          <w:p>
-            <w:pPr>
-              <w:spacing w:before="0" w:after="0"/>
-            </w:pPr>
-            <w:r>
-              <w:rPr>
-                <w:rFonts w:ascii="Courier New" w:hAnsi="Courier New"/>
-                <w:sz w:val="17"/>
-              </w:rPr>
-              <w:t xml:space="preserve">      if (uid == currentUid) continue;           // Exclure soi-même</w:t>
-            </w:r>
-          </w:p>
-          <w:p>
-            <w:pPr>
-              <w:spacing w:before="0" w:after="0"/>
-            </w:pPr>
-            <w:r>
-              <w:rPr>
-                <w:rFonts w:ascii="Courier New" w:hAnsi="Courier New"/>
-                <w:sz w:val="17"/>
-              </w:rPr>
-              <w:t xml:space="preserve">      final raw = entry.value;</w:t>
-            </w:r>
-          </w:p>
-          <w:p>
-            <w:pPr>
-              <w:spacing w:before="0" w:after="0"/>
-            </w:pPr>
-            <w:r>
-              <w:rPr>
-                <w:rFonts w:ascii="Courier New" w:hAnsi="Courier New"/>
-                <w:sz w:val="17"/>
-              </w:rPr>
-              <w:t xml:space="preserve">      if (raw is! Map) continue;</w:t>
-            </w:r>
-          </w:p>
-          <w:p>
-            <w:pPr>
-              <w:spacing w:before="0" w:after="0"/>
-            </w:pPr>
-            <w:r>
-              <w:rPr>
-                <w:rFonts w:ascii="Courier New" w:hAnsi="Courier New"/>
-                <w:sz w:val="17"/>
-              </w:rPr>
-              <w:t xml:space="preserve">      final m = Map&lt;String, dynamic&gt;.from(raw);</w:t>
-            </w:r>
-          </w:p>
-          <w:p>
-            <w:pPr>
-              <w:spacing w:before="0" w:after="0"/>
-            </w:pPr>
-          </w:p>
-          <w:p>
-            <w:pPr>
-              <w:spacing w:before="0" w:after="0"/>
-            </w:pPr>
-            <w:r>
-              <w:rPr>
-                <w:rFonts w:ascii="Courier New" w:hAnsi="Courier New"/>
-                <w:sz w:val="17"/>
-              </w:rPr>
-              <w:t xml:space="preserve">      // Filtrer : uniquement Mentor et Investisseur</w:t>
-            </w:r>
-          </w:p>
-          <w:p>
-            <w:pPr>
-              <w:spacing w:before="0" w:after="0"/>
-            </w:pPr>
-            <w:r>
-              <w:rPr>
-                <w:rFonts w:ascii="Courier New" w:hAnsi="Courier New"/>
-                <w:sz w:val="17"/>
-              </w:rPr>
-              <w:t xml:space="preserve">      final role = (m['role']?.toString() ?? '').trim();</w:t>
+              <w:t xml:space="preserve">      if (entry.key == currentUid) continue;        // Exclure soi-même</w:t>
+            </w:r>
+          </w:p>
+          <w:p>
+            <w:pPr>
+              <w:spacing w:before="0" w:after="0"/>
+            </w:pPr>
+            <w:r>
+              <w:rPr>
+                <w:rFonts w:ascii="Courier New" w:hAnsi="Courier New"/>
+                <w:sz w:val="17"/>
+              </w:rPr>
+              <w:t xml:space="preserve">      final m = Map&lt;String, dynamic&gt;.from(entry.value as Map);</w:t>
+            </w:r>
+          </w:p>
+          <w:p>
+            <w:pPr>
+              <w:spacing w:before="0" w:after="0"/>
+            </w:pPr>
+            <w:r>
+              <w:rPr>
+                <w:rFonts w:ascii="Courier New" w:hAnsi="Courier New"/>
+                <w:sz w:val="17"/>
+              </w:rPr>
+              <w:t xml:space="preserve">      final role = m['role']?.toString() ?? '';</w:t>
             </w:r>
           </w:p>
           <w:p>
@@ -11973,76 +10557,6 @@
             <w:pPr>
               <w:spacing w:before="0" w:after="0"/>
             </w:pPr>
-          </w:p>
-          <w:p>
-            <w:pPr>
-              <w:spacing w:before="0" w:after="0"/>
-            </w:pPr>
-            <w:r>
-              <w:rPr>
-                <w:rFonts w:ascii="Courier New" w:hAnsi="Courier New"/>
-                <w:sz w:val="17"/>
-              </w:rPr>
-              <w:t xml:space="preserve">      final firstName = m['firstName']?.toString() ?? '';</w:t>
-            </w:r>
-          </w:p>
-          <w:p>
-            <w:pPr>
-              <w:spacing w:before="0" w:after="0"/>
-            </w:pPr>
-            <w:r>
-              <w:rPr>
-                <w:rFonts w:ascii="Courier New" w:hAnsi="Courier New"/>
-                <w:sz w:val="17"/>
-              </w:rPr>
-              <w:t xml:space="preserve">      final lastName  = m['lastName']?.toString()  ?? '';</w:t>
-            </w:r>
-          </w:p>
-          <w:p>
-            <w:pPr>
-              <w:spacing w:before="0" w:after="0"/>
-            </w:pPr>
-            <w:r>
-              <w:rPr>
-                <w:rFonts w:ascii="Courier New" w:hAnsi="Courier New"/>
-                <w:sz w:val="17"/>
-              </w:rPr>
-              <w:t xml:space="preserve">      final fullName  = '$firstName $lastName'.trim();</w:t>
-            </w:r>
-          </w:p>
-          <w:p>
-            <w:pPr>
-              <w:spacing w:before="0" w:after="0"/>
-            </w:pPr>
-            <w:r>
-              <w:rPr>
-                <w:rFonts w:ascii="Courier New" w:hAnsi="Courier New"/>
-                <w:sz w:val="17"/>
-              </w:rPr>
-              <w:t xml:space="preserve">      if (fullName.isEmpty) continue;</w:t>
-            </w:r>
-          </w:p>
-          <w:p>
-            <w:pPr>
-              <w:spacing w:before="0" w:after="0"/>
-            </w:pPr>
-          </w:p>
-          <w:p>
-            <w:pPr>
-              <w:spacing w:before="0" w:after="0"/>
-            </w:pPr>
-            <w:r>
-              <w:rPr>
-                <w:rFonts w:ascii="Courier New" w:hAnsi="Courier New"/>
-                <w:sz w:val="17"/>
-              </w:rPr>
-              <w:t xml:space="preserve">      // Construire le Mentor avec les données réelles Firebase</w:t>
-            </w:r>
-          </w:p>
-          <w:p>
-            <w:pPr>
-              <w:spacing w:before="0" w:after="0"/>
-            </w:pPr>
             <w:r>
               <w:rPr>
                 <w:rFonts w:ascii="Courier New" w:hAnsi="Courier New"/>
@@ -12060,67 +10574,55 @@
                 <w:rFonts w:ascii="Courier New" w:hAnsi="Courier New"/>
                 <w:sz w:val="17"/>
               </w:rPr>
-              <w:t xml:space="preserve">        uid:        uid,</w:t>
-            </w:r>
-          </w:p>
-          <w:p>
-            <w:pPr>
-              <w:spacing w:before="0" w:after="0"/>
-            </w:pPr>
-            <w:r>
-              <w:rPr>
-                <w:rFonts w:ascii="Courier New" w:hAnsi="Courier New"/>
-                <w:sz w:val="17"/>
-              </w:rPr>
-              <w:t xml:space="preserve">        name:       fullName,</w:t>
-            </w:r>
-          </w:p>
-          <w:p>
-            <w:pPr>
-              <w:spacing w:before="0" w:after="0"/>
-            </w:pPr>
-            <w:r>
-              <w:rPr>
-                <w:rFonts w:ascii="Courier New" w:hAnsi="Courier New"/>
-                <w:sz w:val="17"/>
-              </w:rPr>
-              <w:t xml:space="preserve">        title:      m['bio']?.toString().split('\n').first ?? role,</w:t>
-            </w:r>
-          </w:p>
-          <w:p>
-            <w:pPr>
-              <w:spacing w:before="0" w:after="0"/>
-            </w:pPr>
-            <w:r>
-              <w:rPr>
-                <w:rFonts w:ascii="Courier New" w:hAnsi="Courier New"/>
-                <w:sz w:val="17"/>
-              </w:rPr>
-              <w:t xml:space="preserve">        city:       m['city']?.toString() ?? 'Dakar',</w:t>
-            </w:r>
-          </w:p>
-          <w:p>
-            <w:pPr>
-              <w:spacing w:before="0" w:after="0"/>
-            </w:pPr>
-            <w:r>
-              <w:rPr>
-                <w:rFonts w:ascii="Courier New" w:hAnsi="Courier New"/>
-                <w:sz w:val="17"/>
-              </w:rPr>
-              <w:t xml:space="preserve">        sectors:    _parseInterests(m['interests']),</w:t>
-            </w:r>
-          </w:p>
-          <w:p>
-            <w:pPr>
-              <w:spacing w:before="0" w:after="0"/>
-            </w:pPr>
-            <w:r>
-              <w:rPr>
-                <w:rFonts w:ascii="Courier New" w:hAnsi="Courier New"/>
-                <w:sz w:val="17"/>
-              </w:rPr>
-              <w:t xml:space="preserve">        role:       role,</w:t>
+              <w:t xml:space="preserve">        uid: entry.key,</w:t>
+            </w:r>
+          </w:p>
+          <w:p>
+            <w:pPr>
+              <w:spacing w:before="0" w:after="0"/>
+            </w:pPr>
+            <w:r>
+              <w:rPr>
+                <w:rFonts w:ascii="Courier New" w:hAnsi="Courier New"/>
+                <w:sz w:val="17"/>
+              </w:rPr>
+              <w:t xml:space="preserve">        name: '${m['firstName']} ${m['lastName']}'.trim(),</w:t>
+            </w:r>
+          </w:p>
+          <w:p>
+            <w:pPr>
+              <w:spacing w:before="0" w:after="0"/>
+            </w:pPr>
+            <w:r>
+              <w:rPr>
+                <w:rFonts w:ascii="Courier New" w:hAnsi="Courier New"/>
+                <w:sz w:val="17"/>
+              </w:rPr>
+              <w:t xml:space="preserve">        city: m['city']?.toString() ?? 'Dakar',</w:t>
+            </w:r>
+          </w:p>
+          <w:p>
+            <w:pPr>
+              <w:spacing w:before="0" w:after="0"/>
+            </w:pPr>
+            <w:r>
+              <w:rPr>
+                <w:rFonts w:ascii="Courier New" w:hAnsi="Courier New"/>
+                <w:sz w:val="17"/>
+              </w:rPr>
+              <w:t xml:space="preserve">        role: role,</w:t>
+            </w:r>
+          </w:p>
+          <w:p>
+            <w:pPr>
+              <w:spacing w:before="0" w:after="0"/>
+            </w:pPr>
+            <w:r>
+              <w:rPr>
+                <w:rFonts w:ascii="Courier New" w:hAnsi="Courier New"/>
+                <w:sz w:val="17"/>
+              </w:rPr>
+              <w:t xml:space="preserve">        sectors: _parseInterests(m['interests']),</w:t>
             </w:r>
           </w:p>
           <w:p>
@@ -12144,30 +10646,6 @@
                 <w:rFonts w:ascii="Courier New" w:hAnsi="Courier New"/>
                 <w:sz w:val="17"/>
               </w:rPr>
-              <w:t xml:space="preserve">        compatibility: 80,   // Score par défaut pour un membre vérifié</w:t>
-            </w:r>
-          </w:p>
-          <w:p>
-            <w:pPr>
-              <w:spacing w:before="0" w:after="0"/>
-            </w:pPr>
-            <w:r>
-              <w:rPr>
-                <w:rFonts w:ascii="Courier New" w:hAnsi="Courier New"/>
-                <w:sz w:val="17"/>
-              </w:rPr>
-              <w:t xml:space="preserve">        // ...autres champs</w:t>
-            </w:r>
-          </w:p>
-          <w:p>
-            <w:pPr>
-              <w:spacing w:before="0" w:after="0"/>
-            </w:pPr>
-            <w:r>
-              <w:rPr>
-                <w:rFonts w:ascii="Courier New" w:hAnsi="Courier New"/>
-                <w:sz w:val="17"/>
-              </w:rPr>
               <w:t xml:space="preserve">      ));</w:t>
             </w:r>
           </w:p>
@@ -12205,364 +10683,6 @@
                 <w:sz w:val="17"/>
               </w:rPr>
               <w:t xml:space="preserve">  }</w:t>
-            </w:r>
-          </w:p>
-          <w:p>
-            <w:pPr>
-              <w:spacing w:before="0" w:after="0"/>
-            </w:pPr>
-            <w:r>
-              <w:rPr>
-                <w:rFonts w:ascii="Courier New" w:hAnsi="Courier New"/>
-                <w:sz w:val="17"/>
-              </w:rPr>
-              <w:t>}</w:t>
-            </w:r>
-          </w:p>
-        </w:tc>
-      </w:tr>
-    </w:tbl>
-    <w:p>
-      <w:pPr>
-        <w:spacing w:after="80"/>
-      </w:pPr>
-    </w:p>
-    <w:p>
-      <w:pPr>
-        <w:spacing w:after="120"/>
-      </w:pPr>
-      <w:r>
-        <w:rPr>
-          <w:rFonts w:ascii="Times New Roman" w:hAnsi="Times New Roman"/>
-          <w:b w:val="0"/>
-          <w:i w:val="0"/>
-          <w:sz w:val="22"/>
-        </w:rPr>
-        <w:t>Intégration dans `page_matching.dart` :</w:t>
-      </w:r>
-    </w:p>
-    <w:p>
-      <w:pPr>
-        <w:spacing w:after="0"/>
-      </w:pPr>
-      <w:r>
-        <w:rPr>
-          <w:rFonts w:ascii="Times New Roman" w:hAnsi="Times New Roman"/>
-          <w:b/>
-          <w:sz w:val="16"/>
-        </w:rPr>
-        <w:t>DART</w:t>
-      </w:r>
-    </w:p>
-    <w:tbl>
-      <w:tblPr>
-        <w:tblStyle w:val="TableGrid"/>
-        <w:tblW w:type="auto" w:w="0"/>
-        <w:tblLook w:firstColumn="1" w:firstRow="1" w:lastColumn="0" w:lastRow="0" w:noHBand="0" w:noVBand="1" w:val="04A0"/>
-      </w:tblPr>
-      <w:tblGrid>
-        <w:gridCol w:w="9072"/>
-      </w:tblGrid>
-      <w:tr>
-        <w:tc>
-          <w:tcPr>
-            <w:tcW w:type="dxa" w:w="9072"/>
-            <w:shd w:val="clear" w:color="auto" w:fill="F2F2F2"/>
-          </w:tcPr>
-          <w:p>
-            <w:pPr>
-              <w:spacing w:before="0" w:after="0"/>
-            </w:pPr>
-            <w:r>
-              <w:rPr>
-                <w:rFonts w:ascii="Courier New" w:hAnsi="Courier New"/>
-                <w:sz w:val="17"/>
-              </w:rPr>
-              <w:t>// Les membres réels sont chargés au démarrage et placés EN TÊTE de liste</w:t>
-            </w:r>
-          </w:p>
-          <w:p>
-            <w:pPr>
-              <w:spacing w:before="0" w:after="0"/>
-            </w:pPr>
-            <w:r>
-              <w:rPr>
-                <w:rFonts w:ascii="Courier New" w:hAnsi="Courier New"/>
-                <w:sz w:val="17"/>
-              </w:rPr>
-              <w:t>// avec un badge "Membre DIAPALER" distinctif</w:t>
-            </w:r>
-          </w:p>
-          <w:p>
-            <w:pPr>
-              <w:spacing w:before="0" w:after="0"/>
-            </w:pPr>
-          </w:p>
-          <w:p>
-            <w:pPr>
-              <w:spacing w:before="0" w:after="0"/>
-            </w:pPr>
-            <w:r>
-              <w:rPr>
-                <w:rFonts w:ascii="Courier New" w:hAnsi="Courier New"/>
-                <w:sz w:val="17"/>
-              </w:rPr>
-              <w:t>List&lt;Mentor&gt; _members = const [];  // Membres Firebase</w:t>
-            </w:r>
-          </w:p>
-          <w:p>
-            <w:pPr>
-              <w:spacing w:before="0" w:after="0"/>
-            </w:pPr>
-            <w:r>
-              <w:rPr>
-                <w:rFonts w:ascii="Courier New" w:hAnsi="Courier New"/>
-                <w:sz w:val="17"/>
-              </w:rPr>
-              <w:t>bool _loadingMembers = true;</w:t>
-            </w:r>
-          </w:p>
-          <w:p>
-            <w:pPr>
-              <w:spacing w:before="0" w:after="0"/>
-            </w:pPr>
-          </w:p>
-          <w:p>
-            <w:pPr>
-              <w:spacing w:before="0" w:after="0"/>
-            </w:pPr>
-            <w:r>
-              <w:rPr>
-                <w:rFonts w:ascii="Courier New" w:hAnsi="Courier New"/>
-                <w:sz w:val="17"/>
-              </w:rPr>
-              <w:t>@override</w:t>
-            </w:r>
-          </w:p>
-          <w:p>
-            <w:pPr>
-              <w:spacing w:before="0" w:after="0"/>
-            </w:pPr>
-            <w:r>
-              <w:rPr>
-                <w:rFonts w:ascii="Courier New" w:hAnsi="Courier New"/>
-                <w:sz w:val="17"/>
-              </w:rPr>
-              <w:t>void initState() {</w:t>
-            </w:r>
-          </w:p>
-          <w:p>
-            <w:pPr>
-              <w:spacing w:before="0" w:after="0"/>
-            </w:pPr>
-            <w:r>
-              <w:rPr>
-                <w:rFonts w:ascii="Courier New" w:hAnsi="Courier New"/>
-                <w:sz w:val="17"/>
-              </w:rPr>
-              <w:t xml:space="preserve">  super.initState();</w:t>
-            </w:r>
-          </w:p>
-          <w:p>
-            <w:pPr>
-              <w:spacing w:before="0" w:after="0"/>
-            </w:pPr>
-            <w:r>
-              <w:rPr>
-                <w:rFonts w:ascii="Courier New" w:hAnsi="Courier New"/>
-                <w:sz w:val="17"/>
-              </w:rPr>
-              <w:t xml:space="preserve">  _loadMembers();  // Charge les membres DIAPALER depuis Firebase</w:t>
-            </w:r>
-          </w:p>
-          <w:p>
-            <w:pPr>
-              <w:spacing w:before="0" w:after="0"/>
-            </w:pPr>
-            <w:r>
-              <w:rPr>
-                <w:rFonts w:ascii="Courier New" w:hAnsi="Courier New"/>
-                <w:sz w:val="17"/>
-              </w:rPr>
-              <w:t>}</w:t>
-            </w:r>
-          </w:p>
-          <w:p>
-            <w:pPr>
-              <w:spacing w:before="0" w:after="0"/>
-            </w:pPr>
-          </w:p>
-          <w:p>
-            <w:pPr>
-              <w:spacing w:before="0" w:after="0"/>
-            </w:pPr>
-            <w:r>
-              <w:rPr>
-                <w:rFonts w:ascii="Courier New" w:hAnsi="Courier New"/>
-                <w:sz w:val="17"/>
-              </w:rPr>
-              <w:t>Future&lt;void&gt; _loadMembers() async {</w:t>
-            </w:r>
-          </w:p>
-          <w:p>
-            <w:pPr>
-              <w:spacing w:before="0" w:after="0"/>
-            </w:pPr>
-            <w:r>
-              <w:rPr>
-                <w:rFonts w:ascii="Courier New" w:hAnsi="Courier New"/>
-                <w:sz w:val="17"/>
-              </w:rPr>
-              <w:t xml:space="preserve">  try {</w:t>
-            </w:r>
-          </w:p>
-          <w:p>
-            <w:pPr>
-              <w:spacing w:before="0" w:after="0"/>
-            </w:pPr>
-            <w:r>
-              <w:rPr>
-                <w:rFonts w:ascii="Courier New" w:hAnsi="Courier New"/>
-                <w:sz w:val="17"/>
-              </w:rPr>
-              <w:t xml:space="preserve">    final members = await UsersService.listMembers();</w:t>
-            </w:r>
-          </w:p>
-          <w:p>
-            <w:pPr>
-              <w:spacing w:before="0" w:after="0"/>
-            </w:pPr>
-            <w:r>
-              <w:rPr>
-                <w:rFonts w:ascii="Courier New" w:hAnsi="Courier New"/>
-                <w:sz w:val="17"/>
-              </w:rPr>
-              <w:t xml:space="preserve">    if (!mounted) return;</w:t>
-            </w:r>
-          </w:p>
-          <w:p>
-            <w:pPr>
-              <w:spacing w:before="0" w:after="0"/>
-            </w:pPr>
-            <w:r>
-              <w:rPr>
-                <w:rFonts w:ascii="Courier New" w:hAnsi="Courier New"/>
-                <w:sz w:val="17"/>
-              </w:rPr>
-              <w:t xml:space="preserve">    setState(() { _members = members; _loadingMembers = false; });</w:t>
-            </w:r>
-          </w:p>
-          <w:p>
-            <w:pPr>
-              <w:spacing w:before="0" w:after="0"/>
-            </w:pPr>
-            <w:r>
-              <w:rPr>
-                <w:rFonts w:ascii="Courier New" w:hAnsi="Courier New"/>
-                <w:sz w:val="17"/>
-              </w:rPr>
-              <w:t xml:space="preserve">  } catch (_) {</w:t>
-            </w:r>
-          </w:p>
-          <w:p>
-            <w:pPr>
-              <w:spacing w:before="0" w:after="0"/>
-            </w:pPr>
-            <w:r>
-              <w:rPr>
-                <w:rFonts w:ascii="Courier New" w:hAnsi="Courier New"/>
-                <w:sz w:val="17"/>
-              </w:rPr>
-              <w:t xml:space="preserve">    if (!mounted) return;</w:t>
-            </w:r>
-          </w:p>
-          <w:p>
-            <w:pPr>
-              <w:spacing w:before="0" w:after="0"/>
-            </w:pPr>
-            <w:r>
-              <w:rPr>
-                <w:rFonts w:ascii="Courier New" w:hAnsi="Courier New"/>
-                <w:sz w:val="17"/>
-              </w:rPr>
-              <w:t xml:space="preserve">    setState(() =&gt; _loadingMembers = false);</w:t>
-            </w:r>
-          </w:p>
-          <w:p>
-            <w:pPr>
-              <w:spacing w:before="0" w:after="0"/>
-            </w:pPr>
-            <w:r>
-              <w:rPr>
-                <w:rFonts w:ascii="Courier New" w:hAnsi="Courier New"/>
-                <w:sz w:val="17"/>
-              </w:rPr>
-              <w:t xml:space="preserve">  }</w:t>
-            </w:r>
-          </w:p>
-          <w:p>
-            <w:pPr>
-              <w:spacing w:before="0" w:after="0"/>
-            </w:pPr>
-            <w:r>
-              <w:rPr>
-                <w:rFonts w:ascii="Courier New" w:hAnsi="Courier New"/>
-                <w:sz w:val="17"/>
-              </w:rPr>
-              <w:t>}</w:t>
-            </w:r>
-          </w:p>
-          <w:p>
-            <w:pPr>
-              <w:spacing w:before="0" w:after="0"/>
-            </w:pPr>
-          </w:p>
-          <w:p>
-            <w:pPr>
-              <w:spacing w:before="0" w:after="0"/>
-            </w:pPr>
-            <w:r>
-              <w:rPr>
-                <w:rFonts w:ascii="Courier New" w:hAnsi="Courier New"/>
-                <w:sz w:val="17"/>
-              </w:rPr>
-              <w:t>// Fusion : membres Firebase (badge DIAPALER) + profils statiques sénégalais</w:t>
-            </w:r>
-          </w:p>
-          <w:p>
-            <w:pPr>
-              <w:spacing w:before="0" w:after="0"/>
-            </w:pPr>
-            <w:r>
-              <w:rPr>
-                <w:rFonts w:ascii="Courier New" w:hAnsi="Courier New"/>
-                <w:sz w:val="17"/>
-              </w:rPr>
-              <w:t>List&lt;Mentor&gt; get _filtered {</w:t>
-            </w:r>
-          </w:p>
-          <w:p>
-            <w:pPr>
-              <w:spacing w:before="0" w:after="0"/>
-            </w:pPr>
-            <w:r>
-              <w:rPr>
-                <w:rFonts w:ascii="Courier New" w:hAnsi="Courier New"/>
-                <w:sz w:val="17"/>
-              </w:rPr>
-              <w:t xml:space="preserve">  final all = [..._members, ...mentors]; // Membres réels en priorité</w:t>
-            </w:r>
-          </w:p>
-          <w:p>
-            <w:pPr>
-              <w:spacing w:before="0" w:after="0"/>
-            </w:pPr>
-            <w:r>
-              <w:rPr>
-                <w:rFonts w:ascii="Courier New" w:hAnsi="Courier New"/>
-                <w:sz w:val="17"/>
-              </w:rPr>
-              <w:t xml:space="preserve">  // Filtrage + tri...</w:t>
             </w:r>
           </w:p>
           <w:p>
@@ -12611,16 +10731,22 @@
       </w:tblGrid>
       <w:tr>
         <w:trPr>
-          <w:trHeight w:val="3969" w:hRule="exact"/>
+          <w:trHeight w:val="1701" w:hRule="atLeast"/>
         </w:trPr>
         <w:tc>
           <w:tcPr>
             <w:tcW w:type="dxa" w:w="9072"/>
             <w:shd w:val="clear" w:color="auto" w:fill="F0F0F0"/>
+            <w:tcMar>
+              <w:top w:w="113" w:type="dxa"/>
+              <w:left w:w="113" w:type="dxa"/>
+              <w:bottom w:w="113" w:type="dxa"/>
+              <w:right w:w="113" w:type="dxa"/>
+            </w:tcMar>
           </w:tcPr>
           <w:p>
             <w:pPr>
-              <w:spacing w:before="1080"/>
+              <w:spacing w:before="200" w:after="200"/>
               <w:jc w:val="center"/>
             </w:pPr>
             <w:r>
@@ -12660,7 +10786,7 @@
           <w:i w:val="0"/>
           <w:sz w:val="26"/>
         </w:rPr>
-        <w:t>4. Anthropic Claude API (Chatbot DIALI IA)</w:t>
+        <w:t>4. Groq API — Llama 3.1 (Chatbot DIALI IA)</w:t>
       </w:r>
     </w:p>
     <w:p>
@@ -12706,7 +10832,7 @@
           <w:i w:val="0"/>
           <w:sz w:val="22"/>
         </w:rPr>
-        <w:t xml:space="preserve">, la clé API Anthropic n'est </w:t>
+        <w:t xml:space="preserve">, la clé API Groq n'est </w:t>
       </w:r>
       <w:r>
         <w:rPr>
@@ -12865,19 +10991,19 @@
                 <w:rFonts w:ascii="Courier New" w:hAnsi="Courier New"/>
                 <w:sz w:val="17"/>
               </w:rPr>
-              <w:t xml:space="preserve">                                         │  Anthropic Messages API      │</w:t>
-            </w:r>
-          </w:p>
-          <w:p>
-            <w:pPr>
-              <w:spacing w:before="0" w:after="0"/>
-            </w:pPr>
-            <w:r>
-              <w:rPr>
-                <w:rFonts w:ascii="Courier New" w:hAnsi="Courier New"/>
-                <w:sz w:val="17"/>
-              </w:rPr>
-              <w:t xml:space="preserve">                                         │  claude-haiku-4-5-20251001  │</w:t>
+              <w:t xml:space="preserve">                                         │  Groq Chat Completions API      │</w:t>
+            </w:r>
+          </w:p>
+          <w:p>
+            <w:pPr>
+              <w:spacing w:before="0" w:after="0"/>
+            </w:pPr>
+            <w:r>
+              <w:rPr>
+                <w:rFonts w:ascii="Courier New" w:hAnsi="Courier New"/>
+                <w:sz w:val="17"/>
+              </w:rPr>
+              <w:t xml:space="preserve">                                         │  llama-3.1-8b-instant  │</w:t>
             </w:r>
           </w:p>
           <w:p>
@@ -12992,7 +11118,7 @@
                 <w:i w:val="0"/>
                 <w:sz w:val="19"/>
               </w:rPr>
-              <w:t>Anthropic Messages API (via proxy)</w:t>
+              <w:t>Groq Chat Completions API (via proxy)</w:t>
             </w:r>
           </w:p>
         </w:tc>
@@ -13118,7 +11244,7 @@
                 <w:i w:val="0"/>
                 <w:sz w:val="19"/>
               </w:rPr>
-              <w:t>claude-haiku-4-5-20251001</w:t>
+              <w:t>llama-3.1-8b-instant</w:t>
             </w:r>
           </w:p>
         </w:tc>
@@ -13454,7 +11580,7 @@
                 <w:rFonts w:ascii="Courier New" w:hAnsi="Courier New"/>
                 <w:sz w:val="17"/>
               </w:rPr>
-              <w:t xml:space="preserve">  /// Proxy Cloudflare Worker — la clé Anthropic est côté serveur (sécurité).</w:t>
+              <w:t xml:space="preserve">  /// Proxy Cloudflare Worker — la clé Groq est côté serveur (sécurité).</w:t>
             </w:r>
           </w:p>
           <w:p>
@@ -13495,7 +11621,7 @@
                 <w:rFonts w:ascii="Courier New" w:hAnsi="Courier New"/>
                 <w:sz w:val="17"/>
               </w:rPr>
-              <w:t xml:space="preserve">  static const _model = 'claude-haiku-4-5-20251001';</w:t>
+              <w:t xml:space="preserve">  static const _model = 'llama-3.1-8b-instant';</w:t>
             </w:r>
           </w:p>
           <w:p>
@@ -13808,7 +11934,7 @@
                 <w:rFonts w:ascii="Courier New" w:hAnsi="Courier New"/>
                 <w:sz w:val="17"/>
               </w:rPr>
-              <w:t xml:space="preserve">  /// Envoie la conversation au proxy → Anthropic et retourne la réponse texte.</w:t>
+              <w:t xml:space="preserve">  /// Envoie la conversation au proxy → Groq et retourne la réponse texte.</w:t>
             </w:r>
           </w:p>
           <w:p>
@@ -14504,7 +12630,7 @@
                 <w:rFonts w:ascii="Courier New" w:hAnsi="Courier New"/>
                 <w:sz w:val="17"/>
               </w:rPr>
-              <w:t xml:space="preserve">      // Appel HTTP POST → proxy Cloudflare → Anthropic API</w:t>
+              <w:t xml:space="preserve">      // Appel HTTP POST → proxy Cloudflare → Groq API</w:t>
             </w:r>
           </w:p>
           <w:p>
@@ -14793,16 +12919,22 @@
       </w:tblGrid>
       <w:tr>
         <w:trPr>
-          <w:trHeight w:val="3969" w:hRule="exact"/>
+          <w:trHeight w:val="1701" w:hRule="atLeast"/>
         </w:trPr>
         <w:tc>
           <w:tcPr>
             <w:tcW w:type="dxa" w:w="9072"/>
             <w:shd w:val="clear" w:color="auto" w:fill="F0F0F0"/>
+            <w:tcMar>
+              <w:top w:w="113" w:type="dxa"/>
+              <w:left w:w="113" w:type="dxa"/>
+              <w:bottom w:w="113" w:type="dxa"/>
+              <w:right w:w="113" w:type="dxa"/>
+            </w:tcMar>
           </w:tcPr>
           <w:p>
             <w:pPr>
-              <w:spacing w:before="1080"/>
+              <w:spacing w:before="200" w:after="200"/>
               <w:jc w:val="center"/>
             </w:pPr>
             <w:r>
@@ -14849,16 +12981,22 @@
       </w:tblGrid>
       <w:tr>
         <w:trPr>
-          <w:trHeight w:val="3969" w:hRule="exact"/>
+          <w:trHeight w:val="1701" w:hRule="atLeast"/>
         </w:trPr>
         <w:tc>
           <w:tcPr>
             <w:tcW w:type="dxa" w:w="9072"/>
             <w:shd w:val="clear" w:color="auto" w:fill="F0F0F0"/>
+            <w:tcMar>
+              <w:top w:w="113" w:type="dxa"/>
+              <w:left w:w="113" w:type="dxa"/>
+              <w:bottom w:w="113" w:type="dxa"/>
+              <w:right w:w="113" w:type="dxa"/>
+            </w:tcMar>
           </w:tcPr>
           <w:p>
             <w:pPr>
-              <w:spacing w:before="1080"/>
+              <w:spacing w:before="200" w:after="200"/>
               <w:jc w:val="center"/>
             </w:pPr>
             <w:r>
@@ -16886,7 +15024,7 @@
                 <w:i w:val="0"/>
                 <w:sz w:val="19"/>
               </w:rPr>
-              <w:t>/v1/messages</w:t>
+              <w:t xml:space="preserve">proxy </w:t>
             </w:r>
             <w:r>
               <w:rPr>
@@ -16895,7 +15033,25 @@
                 <w:i w:val="0"/>
                 <w:sz w:val="19"/>
               </w:rPr>
-              <w:t xml:space="preserve"> (HTTP POST)</w:t>
+              <w:t>/chat</w:t>
+            </w:r>
+            <w:r>
+              <w:rPr>
+                <w:rFonts w:ascii="Times New Roman" w:hAnsi="Times New Roman"/>
+                <w:b w:val="0"/>
+                <w:i w:val="0"/>
+                <w:sz w:val="19"/>
+              </w:rPr>
+              <w:t xml:space="preserve"> → Groq </w:t>
+            </w:r>
+            <w:r>
+              <w:rPr>
+                <w:rFonts w:ascii="Times New Roman" w:hAnsi="Times New Roman"/>
+                <w:b w:val="0"/>
+                <w:i w:val="0"/>
+                <w:sz w:val="19"/>
+              </w:rPr>
+              <w:t>/openai/v1/chat/completions</w:t>
             </w:r>
           </w:p>
         </w:tc>
@@ -16952,16 +15108,22 @@
       </w:tblGrid>
       <w:tr>
         <w:trPr>
-          <w:trHeight w:val="3969" w:hRule="exact"/>
+          <w:trHeight w:val="1701" w:hRule="atLeast"/>
         </w:trPr>
         <w:tc>
           <w:tcPr>
             <w:tcW w:type="dxa" w:w="9072"/>
             <w:shd w:val="clear" w:color="auto" w:fill="F0F0F0"/>
+            <w:tcMar>
+              <w:top w:w="113" w:type="dxa"/>
+              <w:left w:w="113" w:type="dxa"/>
+              <w:bottom w:w="113" w:type="dxa"/>
+              <w:right w:w="113" w:type="dxa"/>
+            </w:tcMar>
           </w:tcPr>
           <w:p>
             <w:pPr>
-              <w:spacing w:before="1080"/>
+              <w:spacing w:before="200" w:after="200"/>
               <w:jc w:val="center"/>
             </w:pPr>
             <w:r>
@@ -17132,7 +15294,7 @@
                 <w:i w:val="0"/>
                 <w:sz w:val="19"/>
               </w:rPr>
-              <w:t>Firebase Realtime Database + Anthropic Claude</w:t>
+              <w:t>Firebase Realtime Database + Meta Llama 3.1 via Groq</w:t>
             </w:r>
           </w:p>
         </w:tc>
@@ -17915,7 +16077,7 @@
                 <w:i w:val="0"/>
                 <w:sz w:val="19"/>
               </w:rPr>
-              <w:t>API Anthropic Claude via HTTP REST</w:t>
+              <w:t>API Meta Llama 3.1 via Groq via HTTP REST</w:t>
             </w:r>
           </w:p>
         </w:tc>

</xml_diff>

<commit_message>
feat: send request, interactions broadcast, seed demo, livrables
</commit_message>
<xml_diff>
--- a/livrables/docx/DIAPALER_AFRICA_Livrable2.docx
+++ b/livrables/docx/DIAPALER_AFRICA_Livrable2.docx
@@ -962,24 +962,46 @@
         <w:t>📸  📸 [Insérer ici le logo de l'ESP et/ou une capture de l'application]</w:t>
       </w:r>
     </w:p>
-    <w:p>
-      <w:pPr>
-        <w:spacing w:before="2835" w:after="240"/>
-        <w:ind w:left="0"/>
-        <w:shd w:val="clear" w:color="auto" w:fill="F9FAFB"/>
-        <w:pBdr>
-          <w:left w:val="single" w:sz="6" w:space="6" w:color="D1D5DB"/>
-        </w:pBdr>
-      </w:pPr>
-      <w:r>
-        <w:rPr>
-          <w:rFonts w:ascii="Calibri" w:hAnsi="Calibri"/>
-          <w:i/>
-          <w:color w:val="ABB5BF"/>
-          <w:sz w:val="18"/>
-        </w:rPr>
-        <w:t>[ Insérer la capture d'écran ici ]</w:t>
-      </w:r>
+    <w:tbl>
+      <w:tblPr>
+        <w:tblStyle w:val="TableGrid"/>
+        <w:tblW w:type="auto" w:w="0"/>
+        <w:tblLook w:firstColumn="1" w:firstRow="1" w:lastColumn="0" w:lastRow="0" w:noHBand="0" w:noVBand="1" w:val="04A0"/>
+      </w:tblPr>
+      <w:tblGrid>
+        <w:gridCol w:w="9406"/>
+      </w:tblGrid>
+      <w:tr>
+        <w:trPr>
+          <w:trHeight w:val="3969" w:hRule="atLeast"/>
+        </w:trPr>
+        <w:tc>
+          <w:tcPr>
+            <w:tcW w:type="dxa" w:w="9406"/>
+            <w:shd w:val="clear" w:color="auto" w:fill="F9FAFB"/>
+          </w:tcPr>
+          <w:p>
+            <w:pPr>
+              <w:spacing w:before="1587"/>
+              <w:jc w:val="center"/>
+            </w:pPr>
+            <w:r>
+              <w:rPr>
+                <w:rFonts w:ascii="Calibri" w:hAnsi="Calibri"/>
+                <w:i/>
+                <w:color w:val="ABB5BF"/>
+                <w:sz w:val="18"/>
+              </w:rPr>
+              <w:t>[ Insérer la capture d'écran ici ]</w:t>
+            </w:r>
+          </w:p>
+        </w:tc>
+      </w:tr>
+    </w:tbl>
+    <w:p>
+      <w:pPr>
+        <w:spacing w:after="240"/>
+      </w:pPr>
     </w:p>
     <w:p>
       <w:pPr>
@@ -1925,6 +1947,30 @@
       <w:r>
         <w:rPr>
           <w:rFonts w:ascii="Calibri" w:hAnsi="Calibri"/>
+          <w:sz w:val="22"/>
+        </w:rPr>
+        <w:t xml:space="preserve">Pour stocker et synchroniser les données de DIAPALER AFRICA, nous avons retenu Firebase Realtime Database. Ce choix s'explique par trois avantages majeurs : les WebSockets natifs permettent une synchronisation en temps réel sans polling, la structure JSON hiérarchique s'adapte parfaitement à notre modèle de données, et l'intégration Flutter via le package </w:t>
+      </w:r>
+      <w:r>
+        <w:rPr>
+          <w:rFonts w:ascii="Courier New" w:hAnsi="Courier New"/>
+          <w:color w:val="DC2626"/>
+          <w:sz w:val="20"/>
+        </w:rPr>
+        <w:t>firebase_database</w:t>
+      </w:r>
+      <w:r>
+        <w:rPr>
+          <w:rFonts w:ascii="Calibri" w:hAnsi="Calibri"/>
+          <w:sz w:val="22"/>
+        </w:rPr>
+        <w:t xml:space="preserve"> est très mature. Contrairement à une API REST classique, chaque changement de données est immédiatement répercuté sur tous les appareils connectés, ce qui est indispensable pour la messagerie et les notifications de DIAPALER.</w:t>
+      </w:r>
+    </w:p>
+    <w:p>
+      <w:r>
+        <w:rPr>
+          <w:rFonts w:ascii="Calibri" w:hAnsi="Calibri"/>
           <w:b/>
           <w:sz w:val="22"/>
         </w:rPr>
@@ -2112,31 +2158,77 @@
         <w:t>📸  📸 CAPTURE D'ÉCRAN — Console Firebase : projet DIAPALER AFRICA</w:t>
       </w:r>
     </w:p>
-    <w:p>
-      <w:pPr>
-        <w:spacing w:before="2835" w:after="240"/>
-        <w:ind w:left="0"/>
-        <w:shd w:val="clear" w:color="auto" w:fill="F9FAFB"/>
-        <w:pBdr>
-          <w:left w:val="single" w:sz="6" w:space="6" w:color="D1D5DB"/>
-        </w:pBdr>
-      </w:pPr>
+    <w:tbl>
+      <w:tblPr>
+        <w:tblStyle w:val="TableGrid"/>
+        <w:tblW w:type="auto" w:w="0"/>
+        <w:tblLook w:firstColumn="1" w:firstRow="1" w:lastColumn="0" w:lastRow="0" w:noHBand="0" w:noVBand="1" w:val="04A0"/>
+      </w:tblPr>
+      <w:tblGrid>
+        <w:gridCol w:w="9406"/>
+      </w:tblGrid>
+      <w:tr>
+        <w:trPr>
+          <w:trHeight w:val="3969" w:hRule="atLeast"/>
+        </w:trPr>
+        <w:tc>
+          <w:tcPr>
+            <w:tcW w:type="dxa" w:w="9406"/>
+            <w:shd w:val="clear" w:color="auto" w:fill="F9FAFB"/>
+          </w:tcPr>
+          <w:p>
+            <w:pPr>
+              <w:spacing w:before="1587"/>
+              <w:jc w:val="center"/>
+            </w:pPr>
+            <w:r>
+              <w:rPr>
+                <w:rFonts w:ascii="Calibri" w:hAnsi="Calibri"/>
+                <w:i/>
+                <w:color w:val="ABB5BF"/>
+                <w:sz w:val="18"/>
+              </w:rPr>
+              <w:t>[ Insérer la capture d'écran ici ]</w:t>
+            </w:r>
+          </w:p>
+        </w:tc>
+      </w:tr>
+    </w:tbl>
+    <w:p>
+      <w:pPr>
+        <w:spacing w:after="240"/>
+      </w:pPr>
+    </w:p>
+    <w:p>
+      <w:pPr>
+        <w:pStyle w:val="Heading3"/>
+      </w:pPr>
+      <w:r>
+        <w:t>1.2 Structure complète de la base de données</w:t>
+      </w:r>
+    </w:p>
+    <w:p>
       <w:r>
         <w:rPr>
           <w:rFonts w:ascii="Calibri" w:hAnsi="Calibri"/>
-          <w:i/>
-          <w:color w:val="ABB5BF"/>
-          <w:sz w:val="18"/>
-        </w:rPr>
-        <w:t>[ Insérer la capture d'écran ici ]</w:t>
-      </w:r>
-    </w:p>
-    <w:p>
-      <w:pPr>
-        <w:pStyle w:val="Heading3"/>
-      </w:pPr>
-      <w:r>
-        <w:t>1.2 Structure complète de la base de données</w:t>
+          <w:sz w:val="22"/>
+        </w:rPr>
+        <w:t xml:space="preserve">Avant d'écrire une seule ligne de code, nous avons conçu l'arborescence JSON de Firebase en partant des besoins fonctionnels : chaque écran de l'application correspond à un nœud distinct. Cette organisation « a plat » (dénormalisée) est volontaire — Firebase recommande d'éviter les données trop imbriquées pour garantir des requêtes rapides. Par exemple, les pitchs sont séparés des profils utilisateurs pour que la page d'accueil puisse lire </w:t>
+      </w:r>
+      <w:r>
+        <w:rPr>
+          <w:rFonts w:ascii="Courier New" w:hAnsi="Courier New"/>
+          <w:color w:val="DC2626"/>
+          <w:sz w:val="20"/>
+        </w:rPr>
+        <w:t>pitches/</w:t>
+      </w:r>
+      <w:r>
+        <w:rPr>
+          <w:rFonts w:ascii="Calibri" w:hAnsi="Calibri"/>
+          <w:sz w:val="22"/>
+        </w:rPr>
+        <w:t xml:space="preserve"> sans avoir à parcourir chaque profil.</w:t>
       </w:r>
     </w:p>
     <w:p>
@@ -4308,24 +4400,46 @@
         <w:t>📸  📸 CAPTURE D'ÉCRAN — Console Firebase : nœud users/ avec un profil</w:t>
       </w:r>
     </w:p>
-    <w:p>
-      <w:pPr>
-        <w:spacing w:before="2835" w:after="240"/>
-        <w:ind w:left="0"/>
-        <w:shd w:val="clear" w:color="auto" w:fill="F9FAFB"/>
-        <w:pBdr>
-          <w:left w:val="single" w:sz="6" w:space="6" w:color="D1D5DB"/>
-        </w:pBdr>
-      </w:pPr>
-      <w:r>
-        <w:rPr>
-          <w:rFonts w:ascii="Calibri" w:hAnsi="Calibri"/>
-          <w:i/>
-          <w:color w:val="ABB5BF"/>
-          <w:sz w:val="18"/>
-        </w:rPr>
-        <w:t>[ Insérer la capture d'écran ici ]</w:t>
-      </w:r>
+    <w:tbl>
+      <w:tblPr>
+        <w:tblStyle w:val="TableGrid"/>
+        <w:tblW w:type="auto" w:w="0"/>
+        <w:tblLook w:firstColumn="1" w:firstRow="1" w:lastColumn="0" w:lastRow="0" w:noHBand="0" w:noVBand="1" w:val="04A0"/>
+      </w:tblPr>
+      <w:tblGrid>
+        <w:gridCol w:w="9406"/>
+      </w:tblGrid>
+      <w:tr>
+        <w:trPr>
+          <w:trHeight w:val="3969" w:hRule="atLeast"/>
+        </w:trPr>
+        <w:tc>
+          <w:tcPr>
+            <w:tcW w:type="dxa" w:w="9406"/>
+            <w:shd w:val="clear" w:color="auto" w:fill="F9FAFB"/>
+          </w:tcPr>
+          <w:p>
+            <w:pPr>
+              <w:spacing w:before="1587"/>
+              <w:jc w:val="center"/>
+            </w:pPr>
+            <w:r>
+              <w:rPr>
+                <w:rFonts w:ascii="Calibri" w:hAnsi="Calibri"/>
+                <w:i/>
+                <w:color w:val="ABB5BF"/>
+                <w:sz w:val="18"/>
+              </w:rPr>
+              <w:t>[ Insérer la capture d'écran ici ]</w:t>
+            </w:r>
+          </w:p>
+        </w:tc>
+      </w:tr>
+    </w:tbl>
+    <w:p>
+      <w:pPr>
+        <w:spacing w:after="240"/>
+      </w:pPr>
     </w:p>
     <w:p>
       <w:pPr>
@@ -4346,24 +4460,46 @@
         <w:t>📸  📸 CAPTURE D'ÉCRAN — Console Firebase : nœud pitches/ avec des pitchs publiés</w:t>
       </w:r>
     </w:p>
-    <w:p>
-      <w:pPr>
-        <w:spacing w:before="2835" w:after="240"/>
-        <w:ind w:left="0"/>
-        <w:shd w:val="clear" w:color="auto" w:fill="F9FAFB"/>
-        <w:pBdr>
-          <w:left w:val="single" w:sz="6" w:space="6" w:color="D1D5DB"/>
-        </w:pBdr>
-      </w:pPr>
-      <w:r>
-        <w:rPr>
-          <w:rFonts w:ascii="Calibri" w:hAnsi="Calibri"/>
-          <w:i/>
-          <w:color w:val="ABB5BF"/>
-          <w:sz w:val="18"/>
-        </w:rPr>
-        <w:t>[ Insérer la capture d'écran ici ]</w:t>
-      </w:r>
+    <w:tbl>
+      <w:tblPr>
+        <w:tblStyle w:val="TableGrid"/>
+        <w:tblW w:type="auto" w:w="0"/>
+        <w:tblLook w:firstColumn="1" w:firstRow="1" w:lastColumn="0" w:lastRow="0" w:noHBand="0" w:noVBand="1" w:val="04A0"/>
+      </w:tblPr>
+      <w:tblGrid>
+        <w:gridCol w:w="9406"/>
+      </w:tblGrid>
+      <w:tr>
+        <w:trPr>
+          <w:trHeight w:val="3969" w:hRule="atLeast"/>
+        </w:trPr>
+        <w:tc>
+          <w:tcPr>
+            <w:tcW w:type="dxa" w:w="9406"/>
+            <w:shd w:val="clear" w:color="auto" w:fill="F9FAFB"/>
+          </w:tcPr>
+          <w:p>
+            <w:pPr>
+              <w:spacing w:before="1587"/>
+              <w:jc w:val="center"/>
+            </w:pPr>
+            <w:r>
+              <w:rPr>
+                <w:rFonts w:ascii="Calibri" w:hAnsi="Calibri"/>
+                <w:i/>
+                <w:color w:val="ABB5BF"/>
+                <w:sz w:val="18"/>
+              </w:rPr>
+              <w:t>[ Insérer la capture d'écran ici ]</w:t>
+            </w:r>
+          </w:p>
+        </w:tc>
+      </w:tr>
+    </w:tbl>
+    <w:p>
+      <w:pPr>
+        <w:spacing w:after="240"/>
+      </w:pPr>
     </w:p>
     <w:p>
       <w:pPr>
@@ -4384,31 +4520,107 @@
         <w:t>📸  📸 CAPTURE D'ÉCRAN — Console Firebase : nœud messages/ et conversations/</w:t>
       </w:r>
     </w:p>
-    <w:p>
-      <w:pPr>
-        <w:spacing w:before="2835" w:after="240"/>
-        <w:ind w:left="0"/>
-        <w:shd w:val="clear" w:color="auto" w:fill="F9FAFB"/>
-        <w:pBdr>
-          <w:left w:val="single" w:sz="6" w:space="6" w:color="D1D5DB"/>
-        </w:pBdr>
-      </w:pPr>
+    <w:tbl>
+      <w:tblPr>
+        <w:tblStyle w:val="TableGrid"/>
+        <w:tblW w:type="auto" w:w="0"/>
+        <w:tblLook w:firstColumn="1" w:firstRow="1" w:lastColumn="0" w:lastRow="0" w:noHBand="0" w:noVBand="1" w:val="04A0"/>
+      </w:tblPr>
+      <w:tblGrid>
+        <w:gridCol w:w="9406"/>
+      </w:tblGrid>
+      <w:tr>
+        <w:trPr>
+          <w:trHeight w:val="3969" w:hRule="atLeast"/>
+        </w:trPr>
+        <w:tc>
+          <w:tcPr>
+            <w:tcW w:type="dxa" w:w="9406"/>
+            <w:shd w:val="clear" w:color="auto" w:fill="F9FAFB"/>
+          </w:tcPr>
+          <w:p>
+            <w:pPr>
+              <w:spacing w:before="1587"/>
+              <w:jc w:val="center"/>
+            </w:pPr>
+            <w:r>
+              <w:rPr>
+                <w:rFonts w:ascii="Calibri" w:hAnsi="Calibri"/>
+                <w:i/>
+                <w:color w:val="ABB5BF"/>
+                <w:sz w:val="18"/>
+              </w:rPr>
+              <w:t>[ Insérer la capture d'écran ici ]</w:t>
+            </w:r>
+          </w:p>
+        </w:tc>
+      </w:tr>
+    </w:tbl>
+    <w:p>
+      <w:pPr>
+        <w:spacing w:after="240"/>
+      </w:pPr>
+    </w:p>
+    <w:p>
+      <w:pPr>
+        <w:pStyle w:val="Heading3"/>
+      </w:pPr>
+      <w:r>
+        <w:t>1.3 CREATE — Créer un profil utilisateur</w:t>
+      </w:r>
+    </w:p>
+    <w:p>
       <w:r>
         <w:rPr>
           <w:rFonts w:ascii="Calibri" w:hAnsi="Calibri"/>
-          <w:i/>
-          <w:color w:val="ABB5BF"/>
-          <w:sz w:val="18"/>
-        </w:rPr>
-        <w:t>[ Insérer la capture d'écran ici ]</w:t>
-      </w:r>
-    </w:p>
-    <w:p>
-      <w:pPr>
-        <w:pStyle w:val="Heading3"/>
-      </w:pPr>
-      <w:r>
-        <w:t>1.3 CREATE — Créer un profil utilisateur</w:t>
+          <w:sz w:val="22"/>
+        </w:rPr>
+        <w:t xml:space="preserve">L'opération de création du profil est déclenchée à la fin de l'inscription en quatre étapes. Elle consiste à écrire un objet JSON complet dans le nœud </w:t>
+      </w:r>
+      <w:r>
+        <w:rPr>
+          <w:rFonts w:ascii="Courier New" w:hAnsi="Courier New"/>
+          <w:color w:val="DC2626"/>
+          <w:sz w:val="20"/>
+        </w:rPr>
+        <w:t>users/{uid}</w:t>
+      </w:r>
+      <w:r>
+        <w:rPr>
+          <w:rFonts w:ascii="Calibri" w:hAnsi="Calibri"/>
+          <w:sz w:val="22"/>
+        </w:rPr>
+        <w:t xml:space="preserve"> de Firebase, en une seule requête atomique via </w:t>
+      </w:r>
+      <w:r>
+        <w:rPr>
+          <w:rFonts w:ascii="Courier New" w:hAnsi="Courier New"/>
+          <w:color w:val="DC2626"/>
+          <w:sz w:val="20"/>
+        </w:rPr>
+        <w:t>.set()</w:t>
+      </w:r>
+      <w:r>
+        <w:rPr>
+          <w:rFonts w:ascii="Calibri" w:hAnsi="Calibri"/>
+          <w:sz w:val="22"/>
+        </w:rPr>
+        <w:t xml:space="preserve">. Le choix d'utiliser l'UID Firebase comme clé (plutôt qu'un email) garantit l'unicité même si l'utilisateur change d'adresse. Si l'écriture échoue (réseau indisponible), l'application bascule sur le cache local </w:t>
+      </w:r>
+      <w:r>
+        <w:rPr>
+          <w:rFonts w:ascii="Courier New" w:hAnsi="Courier New"/>
+          <w:color w:val="DC2626"/>
+          <w:sz w:val="20"/>
+        </w:rPr>
+        <w:t>SharedPreferences</w:t>
+      </w:r>
+      <w:r>
+        <w:rPr>
+          <w:rFonts w:ascii="Calibri" w:hAnsi="Calibri"/>
+          <w:sz w:val="22"/>
+        </w:rPr>
+        <w:t xml:space="preserve"> pour rester fonctionnelle.</w:t>
       </w:r>
     </w:p>
     <w:p>
@@ -4969,31 +5181,92 @@
         <w:t>📸  📸 CAPTURE D'ÉCRAN — Après inscription : profil visible dans la console Firebase</w:t>
       </w:r>
     </w:p>
-    <w:p>
-      <w:pPr>
-        <w:spacing w:before="2835" w:after="240"/>
-        <w:ind w:left="0"/>
-        <w:shd w:val="clear" w:color="auto" w:fill="F9FAFB"/>
-        <w:pBdr>
-          <w:left w:val="single" w:sz="6" w:space="6" w:color="D1D5DB"/>
-        </w:pBdr>
-      </w:pPr>
+    <w:tbl>
+      <w:tblPr>
+        <w:tblStyle w:val="TableGrid"/>
+        <w:tblW w:type="auto" w:w="0"/>
+        <w:tblLook w:firstColumn="1" w:firstRow="1" w:lastColumn="0" w:lastRow="0" w:noHBand="0" w:noVBand="1" w:val="04A0"/>
+      </w:tblPr>
+      <w:tblGrid>
+        <w:gridCol w:w="9406"/>
+      </w:tblGrid>
+      <w:tr>
+        <w:trPr>
+          <w:trHeight w:val="3969" w:hRule="atLeast"/>
+        </w:trPr>
+        <w:tc>
+          <w:tcPr>
+            <w:tcW w:type="dxa" w:w="9406"/>
+            <w:shd w:val="clear" w:color="auto" w:fill="F9FAFB"/>
+          </w:tcPr>
+          <w:p>
+            <w:pPr>
+              <w:spacing w:before="1587"/>
+              <w:jc w:val="center"/>
+            </w:pPr>
+            <w:r>
+              <w:rPr>
+                <w:rFonts w:ascii="Calibri" w:hAnsi="Calibri"/>
+                <w:i/>
+                <w:color w:val="ABB5BF"/>
+                <w:sz w:val="18"/>
+              </w:rPr>
+              <w:t>[ Insérer la capture d'écran ici ]</w:t>
+            </w:r>
+          </w:p>
+        </w:tc>
+      </w:tr>
+    </w:tbl>
+    <w:p>
+      <w:pPr>
+        <w:spacing w:after="240"/>
+      </w:pPr>
+    </w:p>
+    <w:p>
+      <w:pPr>
+        <w:pStyle w:val="Heading3"/>
+      </w:pPr>
+      <w:r>
+        <w:t>1.4 READ — Lire un profil (lecture unique)</w:t>
+      </w:r>
+    </w:p>
+    <w:p>
       <w:r>
         <w:rPr>
           <w:rFonts w:ascii="Calibri" w:hAnsi="Calibri"/>
-          <w:i/>
-          <w:color w:val="ABB5BF"/>
-          <w:sz w:val="18"/>
-        </w:rPr>
-        <w:t>[ Insérer la capture d'écran ici ]</w:t>
-      </w:r>
-    </w:p>
-    <w:p>
-      <w:pPr>
-        <w:pStyle w:val="Heading3"/>
-      </w:pPr>
-      <w:r>
-        <w:t>1.4 READ — Lire un profil (lecture unique)</w:t>
+          <w:sz w:val="22"/>
+        </w:rPr>
+        <w:t xml:space="preserve">Lors de la connexion, l'application effectue une lecture unique (one-shot) du profil avec </w:t>
+      </w:r>
+      <w:r>
+        <w:rPr>
+          <w:rFonts w:ascii="Courier New" w:hAnsi="Courier New"/>
+          <w:color w:val="DC2626"/>
+          <w:sz w:val="20"/>
+        </w:rPr>
+        <w:t>.get()</w:t>
+      </w:r>
+      <w:r>
+        <w:rPr>
+          <w:rFonts w:ascii="Calibri" w:hAnsi="Calibri"/>
+          <w:sz w:val="22"/>
+        </w:rPr>
+        <w:t xml:space="preserve">. On privilégie ici une lecture ponctuelle plutôt qu'un stream continu, car le profil n'a pas besoin d'être synchronisé en permanence — seule la messagerie et les pitchs nécessitent un flux temps réel. Le résultat est immédiatement désérialisé et stocké dans le </w:t>
+      </w:r>
+      <w:r>
+        <w:rPr>
+          <w:rFonts w:ascii="Courier New" w:hAnsi="Courier New"/>
+          <w:color w:val="DC2626"/>
+          <w:sz w:val="20"/>
+        </w:rPr>
+        <w:t>UserProfileController</w:t>
+      </w:r>
+      <w:r>
+        <w:rPr>
+          <w:rFonts w:ascii="Calibri" w:hAnsi="Calibri"/>
+          <w:sz w:val="22"/>
+        </w:rPr>
+        <w:t>, accessible depuis toute l'application.</w:t>
       </w:r>
     </w:p>
     <w:p>
@@ -5301,6 +5574,60 @@
       </w:pPr>
       <w:r>
         <w:t>1.5 READ — Stream temps réel des pitchs</w:t>
+      </w:r>
+    </w:p>
+    <w:p>
+      <w:r>
+        <w:rPr>
+          <w:rFonts w:ascii="Calibri" w:hAnsi="Calibri"/>
+          <w:sz w:val="22"/>
+        </w:rPr>
+        <w:t xml:space="preserve">Pour la page des pitchs publics, nous avons besoin que chaque nouveau pitch posté par un entrepreneur apparaisse instantanément chez tous les autres membres sans nécessiter un rechargement manuel. C'est pourquoi on utilise </w:t>
+      </w:r>
+      <w:r>
+        <w:rPr>
+          <w:rFonts w:ascii="Courier New" w:hAnsi="Courier New"/>
+          <w:color w:val="DC2626"/>
+          <w:sz w:val="20"/>
+        </w:rPr>
+        <w:t>.onValue</w:t>
+      </w:r>
+      <w:r>
+        <w:rPr>
+          <w:rFonts w:ascii="Calibri" w:hAnsi="Calibri"/>
+          <w:sz w:val="22"/>
+        </w:rPr>
+        <w:t xml:space="preserve"> qui maintient une connexion WebSocket ouverte : dès qu'un nœud </w:t>
+      </w:r>
+      <w:r>
+        <w:rPr>
+          <w:rFonts w:ascii="Courier New" w:hAnsi="Courier New"/>
+          <w:color w:val="DC2626"/>
+          <w:sz w:val="20"/>
+        </w:rPr>
+        <w:t>pitches/</w:t>
+      </w:r>
+      <w:r>
+        <w:rPr>
+          <w:rFonts w:ascii="Calibri" w:hAnsi="Calibri"/>
+          <w:sz w:val="22"/>
+        </w:rPr>
+        <w:t xml:space="preserve"> est modifié côté Firebase, le stream Dart émet une nouvelle liste et le </w:t>
+      </w:r>
+      <w:r>
+        <w:rPr>
+          <w:rFonts w:ascii="Courier New" w:hAnsi="Courier New"/>
+          <w:color w:val="DC2626"/>
+          <w:sz w:val="20"/>
+        </w:rPr>
+        <w:t>StreamBuilder</w:t>
+      </w:r>
+      <w:r>
+        <w:rPr>
+          <w:rFonts w:ascii="Calibri" w:hAnsi="Calibri"/>
+          <w:sz w:val="22"/>
+        </w:rPr>
+        <w:t xml:space="preserve"> redessine l'interface. Le tri par date décroissante est appliqué côté client pour éviter d'alourdir les règles Firebase.</w:t>
       </w:r>
     </w:p>
     <w:p>
@@ -5906,31 +6233,152 @@
         <w:t>📸  📸 CAPTURE D'ÉCRAN — Écran Pitchs Publiés avec StreamBuilder fonctionnel</w:t>
       </w:r>
     </w:p>
-    <w:p>
-      <w:pPr>
-        <w:spacing w:before="2835" w:after="240"/>
-        <w:ind w:left="0"/>
-        <w:shd w:val="clear" w:color="auto" w:fill="F9FAFB"/>
-        <w:pBdr>
-          <w:left w:val="single" w:sz="6" w:space="6" w:color="D1D5DB"/>
-        </w:pBdr>
-      </w:pPr>
+    <w:tbl>
+      <w:tblPr>
+        <w:tblStyle w:val="TableGrid"/>
+        <w:tblW w:type="auto" w:w="0"/>
+        <w:tblLook w:firstColumn="1" w:firstRow="1" w:lastColumn="0" w:lastRow="0" w:noHBand="0" w:noVBand="1" w:val="04A0"/>
+      </w:tblPr>
+      <w:tblGrid>
+        <w:gridCol w:w="9406"/>
+      </w:tblGrid>
+      <w:tr>
+        <w:trPr>
+          <w:trHeight w:val="3969" w:hRule="atLeast"/>
+        </w:trPr>
+        <w:tc>
+          <w:tcPr>
+            <w:tcW w:type="dxa" w:w="9406"/>
+            <w:shd w:val="clear" w:color="auto" w:fill="F9FAFB"/>
+          </w:tcPr>
+          <w:p>
+            <w:pPr>
+              <w:spacing w:before="1587"/>
+              <w:jc w:val="center"/>
+            </w:pPr>
+            <w:r>
+              <w:rPr>
+                <w:rFonts w:ascii="Calibri" w:hAnsi="Calibri"/>
+                <w:i/>
+                <w:color w:val="ABB5BF"/>
+                <w:sz w:val="18"/>
+              </w:rPr>
+              <w:t>[ Insérer la capture d'écran ici ]</w:t>
+            </w:r>
+          </w:p>
+        </w:tc>
+      </w:tr>
+    </w:tbl>
+    <w:p>
+      <w:pPr>
+        <w:spacing w:after="240"/>
+      </w:pPr>
+    </w:p>
+    <w:p>
+      <w:pPr>
+        <w:pStyle w:val="Heading3"/>
+      </w:pPr>
+      <w:r>
+        <w:t>1.6 UPDATE — Modifier un profil</w:t>
+      </w:r>
+    </w:p>
+    <w:p>
       <w:r>
         <w:rPr>
           <w:rFonts w:ascii="Calibri" w:hAnsi="Calibri"/>
-          <w:i/>
-          <w:color w:val="ABB5BF"/>
-          <w:sz w:val="18"/>
-        </w:rPr>
-        <w:t>[ Insérer la capture d'écran ici ]</w:t>
-      </w:r>
-    </w:p>
-    <w:p>
-      <w:pPr>
-        <w:pStyle w:val="Heading3"/>
-      </w:pPr>
-      <w:r>
-        <w:t>1.6 UPDATE — Modifier un profil</w:t>
+          <w:sz w:val="22"/>
+        </w:rPr>
+        <w:t xml:space="preserve">Quand un utilisateur modifie son profil, on utilise </w:t>
+      </w:r>
+      <w:r>
+        <w:rPr>
+          <w:rFonts w:ascii="Courier New" w:hAnsi="Courier New"/>
+          <w:color w:val="DC2626"/>
+          <w:sz w:val="20"/>
+        </w:rPr>
+        <w:t>.update()</w:t>
+      </w:r>
+      <w:r>
+        <w:rPr>
+          <w:rFonts w:ascii="Calibri" w:hAnsi="Calibri"/>
+          <w:sz w:val="22"/>
+        </w:rPr>
+        <w:t xml:space="preserve"> au lieu de </w:t>
+      </w:r>
+      <w:r>
+        <w:rPr>
+          <w:rFonts w:ascii="Courier New" w:hAnsi="Courier New"/>
+          <w:color w:val="DC2626"/>
+          <w:sz w:val="20"/>
+        </w:rPr>
+        <w:t>.set()</w:t>
+      </w:r>
+      <w:r>
+        <w:rPr>
+          <w:rFonts w:ascii="Calibri" w:hAnsi="Calibri"/>
+          <w:sz w:val="22"/>
+        </w:rPr>
+        <w:t xml:space="preserve">. La différence est importante : </w:t>
+      </w:r>
+      <w:r>
+        <w:rPr>
+          <w:rFonts w:ascii="Courier New" w:hAnsi="Courier New"/>
+          <w:color w:val="DC2626"/>
+          <w:sz w:val="20"/>
+        </w:rPr>
+        <w:t>.set()</w:t>
+      </w:r>
+      <w:r>
+        <w:rPr>
+          <w:rFonts w:ascii="Calibri" w:hAnsi="Calibri"/>
+          <w:sz w:val="22"/>
+        </w:rPr>
+        <w:t xml:space="preserve"> remplacerait l'intégralité du nœud (et effacerait des champs comme </w:t>
+      </w:r>
+      <w:r>
+        <w:rPr>
+          <w:rFonts w:ascii="Courier New" w:hAnsi="Courier New"/>
+          <w:color w:val="DC2626"/>
+          <w:sz w:val="20"/>
+        </w:rPr>
+        <w:t>isPremium</w:t>
+      </w:r>
+      <w:r>
+        <w:rPr>
+          <w:rFonts w:ascii="Calibri" w:hAnsi="Calibri"/>
+          <w:sz w:val="22"/>
+        </w:rPr>
+        <w:t xml:space="preserve"> ou </w:t>
+      </w:r>
+      <w:r>
+        <w:rPr>
+          <w:rFonts w:ascii="Courier New" w:hAnsi="Courier New"/>
+          <w:color w:val="DC2626"/>
+          <w:sz w:val="20"/>
+        </w:rPr>
+        <w:t>sessionsCount</w:t>
+      </w:r>
+      <w:r>
+        <w:rPr>
+          <w:rFonts w:ascii="Calibri" w:hAnsi="Calibri"/>
+          <w:sz w:val="22"/>
+        </w:rPr>
+        <w:t xml:space="preserve"> qu'on ne renvoie pas depuis le formulaire), tandis que </w:t>
+      </w:r>
+      <w:r>
+        <w:rPr>
+          <w:rFonts w:ascii="Courier New" w:hAnsi="Courier New"/>
+          <w:color w:val="DC2626"/>
+          <w:sz w:val="20"/>
+        </w:rPr>
+        <w:t>.update()</w:t>
+      </w:r>
+      <w:r>
+        <w:rPr>
+          <w:rFonts w:ascii="Calibri" w:hAnsi="Calibri"/>
+          <w:sz w:val="22"/>
+        </w:rPr>
+        <w:t xml:space="preserve"> ne touche que les champs explicitement fournis. Cela garantit une mise à jour partielle et non destructive, même si plusieurs appareils modifient le même profil en parallèle.</w:t>
       </w:r>
     </w:p>
     <w:p>
@@ -6446,31 +6894,107 @@
         <w:t>📸  📸 CAPTURE D'ÉCRAN — Profil mis à jour après modification</w:t>
       </w:r>
     </w:p>
-    <w:p>
-      <w:pPr>
-        <w:spacing w:before="2835" w:after="240"/>
-        <w:ind w:left="0"/>
-        <w:shd w:val="clear" w:color="auto" w:fill="F9FAFB"/>
-        <w:pBdr>
-          <w:left w:val="single" w:sz="6" w:space="6" w:color="D1D5DB"/>
-        </w:pBdr>
-      </w:pPr>
+    <w:tbl>
+      <w:tblPr>
+        <w:tblStyle w:val="TableGrid"/>
+        <w:tblW w:type="auto" w:w="0"/>
+        <w:tblLook w:firstColumn="1" w:firstRow="1" w:lastColumn="0" w:lastRow="0" w:noHBand="0" w:noVBand="1" w:val="04A0"/>
+      </w:tblPr>
+      <w:tblGrid>
+        <w:gridCol w:w="9406"/>
+      </w:tblGrid>
+      <w:tr>
+        <w:trPr>
+          <w:trHeight w:val="3969" w:hRule="atLeast"/>
+        </w:trPr>
+        <w:tc>
+          <w:tcPr>
+            <w:tcW w:type="dxa" w:w="9406"/>
+            <w:shd w:val="clear" w:color="auto" w:fill="F9FAFB"/>
+          </w:tcPr>
+          <w:p>
+            <w:pPr>
+              <w:spacing w:before="1587"/>
+              <w:jc w:val="center"/>
+            </w:pPr>
+            <w:r>
+              <w:rPr>
+                <w:rFonts w:ascii="Calibri" w:hAnsi="Calibri"/>
+                <w:i/>
+                <w:color w:val="ABB5BF"/>
+                <w:sz w:val="18"/>
+              </w:rPr>
+              <w:t>[ Insérer la capture d'écran ici ]</w:t>
+            </w:r>
+          </w:p>
+        </w:tc>
+      </w:tr>
+    </w:tbl>
+    <w:p>
+      <w:pPr>
+        <w:spacing w:after="240"/>
+      </w:pPr>
+    </w:p>
+    <w:p>
+      <w:pPr>
+        <w:pStyle w:val="Heading3"/>
+      </w:pPr>
+      <w:r>
+        <w:t>1.7 CREATE — Publier un pitch dans le nœud global</w:t>
+      </w:r>
+    </w:p>
+    <w:p>
       <w:r>
         <w:rPr>
           <w:rFonts w:ascii="Calibri" w:hAnsi="Calibri"/>
-          <w:i/>
-          <w:color w:val="ABB5BF"/>
-          <w:sz w:val="18"/>
-        </w:rPr>
-        <w:t>[ Insérer la capture d'écran ici ]</w:t>
-      </w:r>
-    </w:p>
-    <w:p>
-      <w:pPr>
-        <w:pStyle w:val="Heading3"/>
-      </w:pPr>
-      <w:r>
-        <w:t>1.7 CREATE — Publier un pitch dans le nœud global</w:t>
+          <w:sz w:val="22"/>
+        </w:rPr>
+        <w:t xml:space="preserve">Publier un pitch est une double opération : le projet est enregistré dans le profil de l'entrepreneur (nœud </w:t>
+      </w:r>
+      <w:r>
+        <w:rPr>
+          <w:rFonts w:ascii="Courier New" w:hAnsi="Courier New"/>
+          <w:color w:val="DC2626"/>
+          <w:sz w:val="20"/>
+        </w:rPr>
+        <w:t>users/{uid}/projects/</w:t>
+      </w:r>
+      <w:r>
+        <w:rPr>
+          <w:rFonts w:ascii="Calibri" w:hAnsi="Calibri"/>
+          <w:sz w:val="22"/>
+        </w:rPr>
+        <w:t xml:space="preserve">) pour son suivi personnel, ET dans le nœud global </w:t>
+      </w:r>
+      <w:r>
+        <w:rPr>
+          <w:rFonts w:ascii="Courier New" w:hAnsi="Courier New"/>
+          <w:color w:val="DC2626"/>
+          <w:sz w:val="20"/>
+        </w:rPr>
+        <w:t>pitches/</w:t>
+      </w:r>
+      <w:r>
+        <w:rPr>
+          <w:rFonts w:ascii="Calibri" w:hAnsi="Calibri"/>
+          <w:sz w:val="22"/>
+        </w:rPr>
+        <w:t xml:space="preserve"> visible par tous les membres. Ce choix de duplication volontaire évite une jointure coûteuse : la page pitchs publics peut lire </w:t>
+      </w:r>
+      <w:r>
+        <w:rPr>
+          <w:rFonts w:ascii="Courier New" w:hAnsi="Courier New"/>
+          <w:color w:val="DC2626"/>
+          <w:sz w:val="20"/>
+        </w:rPr>
+        <w:t>pitches/</w:t>
+      </w:r>
+      <w:r>
+        <w:rPr>
+          <w:rFonts w:ascii="Calibri" w:hAnsi="Calibri"/>
+          <w:sz w:val="22"/>
+        </w:rPr>
+        <w:t xml:space="preserve"> sans charger chaque profil utilisateur. L'ID du pitch est généré à partir du timestamp en millisecondes, ce qui garantit l'ordre chronologique et l'unicité sans avoir besoin d'un compteur serveur.</w:t>
       </w:r>
     </w:p>
     <w:p>
@@ -7106,31 +7630,137 @@
         <w:t>📸  📸 CAPTURE D'ÉCRAN — Pitch soumis visible dans la console Firebase (pitches/)</w:t>
       </w:r>
     </w:p>
-    <w:p>
-      <w:pPr>
-        <w:spacing w:before="2835" w:after="240"/>
-        <w:ind w:left="0"/>
-        <w:shd w:val="clear" w:color="auto" w:fill="F9FAFB"/>
-        <w:pBdr>
-          <w:left w:val="single" w:sz="6" w:space="6" w:color="D1D5DB"/>
-        </w:pBdr>
-      </w:pPr>
+    <w:tbl>
+      <w:tblPr>
+        <w:tblStyle w:val="TableGrid"/>
+        <w:tblW w:type="auto" w:w="0"/>
+        <w:tblLook w:firstColumn="1" w:firstRow="1" w:lastColumn="0" w:lastRow="0" w:noHBand="0" w:noVBand="1" w:val="04A0"/>
+      </w:tblPr>
+      <w:tblGrid>
+        <w:gridCol w:w="9406"/>
+      </w:tblGrid>
+      <w:tr>
+        <w:trPr>
+          <w:trHeight w:val="3969" w:hRule="atLeast"/>
+        </w:trPr>
+        <w:tc>
+          <w:tcPr>
+            <w:tcW w:type="dxa" w:w="9406"/>
+            <w:shd w:val="clear" w:color="auto" w:fill="F9FAFB"/>
+          </w:tcPr>
+          <w:p>
+            <w:pPr>
+              <w:spacing w:before="1587"/>
+              <w:jc w:val="center"/>
+            </w:pPr>
+            <w:r>
+              <w:rPr>
+                <w:rFonts w:ascii="Calibri" w:hAnsi="Calibri"/>
+                <w:i/>
+                <w:color w:val="ABB5BF"/>
+                <w:sz w:val="18"/>
+              </w:rPr>
+              <w:t>[ Insérer la capture d'écran ici ]</w:t>
+            </w:r>
+          </w:p>
+        </w:tc>
+      </w:tr>
+    </w:tbl>
+    <w:p>
+      <w:pPr>
+        <w:spacing w:after="240"/>
+      </w:pPr>
+    </w:p>
+    <w:p>
+      <w:pPr>
+        <w:pStyle w:val="Heading3"/>
+      </w:pPr>
+      <w:r>
+        <w:t>1.8 UPDATE — Activer le statut Premium (Wave)</w:t>
+      </w:r>
+    </w:p>
+    <w:p>
       <w:r>
         <w:rPr>
           <w:rFonts w:ascii="Calibri" w:hAnsi="Calibri"/>
-          <w:i/>
-          <w:color w:val="ABB5BF"/>
-          <w:sz w:val="18"/>
-        </w:rPr>
-        <w:t>[ Insérer la capture d'écran ici ]</w:t>
-      </w:r>
-    </w:p>
-    <w:p>
-      <w:pPr>
-        <w:pStyle w:val="Heading3"/>
-      </w:pPr>
-      <w:r>
-        <w:t>1.8 UPDATE — Activer le statut Premium (Wave)</w:t>
+          <w:sz w:val="22"/>
+        </w:rPr>
+        <w:t>Le système Premium de DIAPALER fonctionne avec Wave, le principal service de paiement mobile au Sénégal. Après que l'utilisateur a validé le paiement sur l'application Wave, notre service confirme l'activation en écrivant uniquement trois champs sur le profil Firebase (</w:t>
+      </w:r>
+      <w:r>
+        <w:rPr>
+          <w:rFonts w:ascii="Courier New" w:hAnsi="Courier New"/>
+          <w:color w:val="DC2626"/>
+          <w:sz w:val="20"/>
+        </w:rPr>
+        <w:t>isPremium</w:t>
+      </w:r>
+      <w:r>
+        <w:rPr>
+          <w:rFonts w:ascii="Calibri" w:hAnsi="Calibri"/>
+          <w:sz w:val="22"/>
+        </w:rPr>
+        <w:t xml:space="preserve">, </w:t>
+      </w:r>
+      <w:r>
+        <w:rPr>
+          <w:rFonts w:ascii="Courier New" w:hAnsi="Courier New"/>
+          <w:color w:val="DC2626"/>
+          <w:sz w:val="20"/>
+        </w:rPr>
+        <w:t>premiumPlan</w:t>
+      </w:r>
+      <w:r>
+        <w:rPr>
+          <w:rFonts w:ascii="Calibri" w:hAnsi="Calibri"/>
+          <w:sz w:val="22"/>
+        </w:rPr>
+        <w:t xml:space="preserve">, </w:t>
+      </w:r>
+      <w:r>
+        <w:rPr>
+          <w:rFonts w:ascii="Courier New" w:hAnsi="Courier New"/>
+          <w:color w:val="DC2626"/>
+          <w:sz w:val="20"/>
+        </w:rPr>
+        <w:t>premiumSince</w:t>
+      </w:r>
+      <w:r>
+        <w:rPr>
+          <w:rFonts w:ascii="Calibri" w:hAnsi="Calibri"/>
+          <w:sz w:val="22"/>
+        </w:rPr>
+        <w:t xml:space="preserve">) via </w:t>
+      </w:r>
+      <w:r>
+        <w:rPr>
+          <w:rFonts w:ascii="Courier New" w:hAnsi="Courier New"/>
+          <w:color w:val="DC2626"/>
+          <w:sz w:val="20"/>
+        </w:rPr>
+        <w:t>.update()</w:t>
+      </w:r>
+      <w:r>
+        <w:rPr>
+          <w:rFonts w:ascii="Calibri" w:hAnsi="Calibri"/>
+          <w:sz w:val="22"/>
+        </w:rPr>
+        <w:t xml:space="preserve">. Ce choix d'un update partiel est délibéré : on ne veut pas écraser d'autres données du profil. Le badge Premium étoile apparaît instantanément dans l'interface grâce à la mise à jour en mémoire du </w:t>
+      </w:r>
+      <w:r>
+        <w:rPr>
+          <w:rFonts w:ascii="Courier New" w:hAnsi="Courier New"/>
+          <w:color w:val="DC2626"/>
+          <w:sz w:val="20"/>
+        </w:rPr>
+        <w:t>UserProfileController</w:t>
+      </w:r>
+      <w:r>
+        <w:rPr>
+          <w:rFonts w:ascii="Calibri" w:hAnsi="Calibri"/>
+          <w:sz w:val="22"/>
+        </w:rPr>
+        <w:t>.</w:t>
       </w:r>
     </w:p>
     <w:p>
@@ -7556,31 +8186,77 @@
         <w:t>📸  📸 CAPTURE D'ÉCRAN — Firebase Console : nœud users/{uid} avec isPremium = true</w:t>
       </w:r>
     </w:p>
-    <w:p>
-      <w:pPr>
-        <w:spacing w:before="2835" w:after="240"/>
-        <w:ind w:left="0"/>
-        <w:shd w:val="clear" w:color="auto" w:fill="F9FAFB"/>
-        <w:pBdr>
-          <w:left w:val="single" w:sz="6" w:space="6" w:color="D1D5DB"/>
-        </w:pBdr>
-      </w:pPr>
+    <w:tbl>
+      <w:tblPr>
+        <w:tblStyle w:val="TableGrid"/>
+        <w:tblW w:type="auto" w:w="0"/>
+        <w:tblLook w:firstColumn="1" w:firstRow="1" w:lastColumn="0" w:lastRow="0" w:noHBand="0" w:noVBand="1" w:val="04A0"/>
+      </w:tblPr>
+      <w:tblGrid>
+        <w:gridCol w:w="9406"/>
+      </w:tblGrid>
+      <w:tr>
+        <w:trPr>
+          <w:trHeight w:val="3969" w:hRule="atLeast"/>
+        </w:trPr>
+        <w:tc>
+          <w:tcPr>
+            <w:tcW w:type="dxa" w:w="9406"/>
+            <w:shd w:val="clear" w:color="auto" w:fill="F9FAFB"/>
+          </w:tcPr>
+          <w:p>
+            <w:pPr>
+              <w:spacing w:before="1587"/>
+              <w:jc w:val="center"/>
+            </w:pPr>
+            <w:r>
+              <w:rPr>
+                <w:rFonts w:ascii="Calibri" w:hAnsi="Calibri"/>
+                <w:i/>
+                <w:color w:val="ABB5BF"/>
+                <w:sz w:val="18"/>
+              </w:rPr>
+              <w:t>[ Insérer la capture d'écran ici ]</w:t>
+            </w:r>
+          </w:p>
+        </w:tc>
+      </w:tr>
+    </w:tbl>
+    <w:p>
+      <w:pPr>
+        <w:spacing w:after="240"/>
+      </w:pPr>
+    </w:p>
+    <w:p>
+      <w:pPr>
+        <w:pStyle w:val="Heading3"/>
+      </w:pPr>
+      <w:r>
+        <w:t>1.9 DELETE — Suppression d'une session réservée (Firebase `.remove()`)</w:t>
+      </w:r>
+    </w:p>
+    <w:p>
       <w:r>
         <w:rPr>
           <w:rFonts w:ascii="Calibri" w:hAnsi="Calibri"/>
-          <w:i/>
-          <w:color w:val="ABB5BF"/>
-          <w:sz w:val="18"/>
-        </w:rPr>
-        <w:t>[ Insérer la capture d'écran ici ]</w:t>
-      </w:r>
-    </w:p>
-    <w:p>
-      <w:pPr>
-        <w:pStyle w:val="Heading3"/>
-      </w:pPr>
-      <w:r>
-        <w:t>1.9 DELETE — Suppression d'une session réservée (Firebase `.remove()`)</w:t>
+          <w:sz w:val="22"/>
+        </w:rPr>
+        <w:t xml:space="preserve">L'annulation d'un rendez-vous doit être bilatérale : si Mariéme annule sa session avec Ibrahima, la session doit disparaître du calendrier des deux utilisateurs. On utilise </w:t>
+      </w:r>
+      <w:r>
+        <w:rPr>
+          <w:rFonts w:ascii="Courier New" w:hAnsi="Courier New"/>
+          <w:color w:val="DC2626"/>
+          <w:sz w:val="20"/>
+        </w:rPr>
+        <w:t>.remove()</w:t>
+      </w:r>
+      <w:r>
+        <w:rPr>
+          <w:rFonts w:ascii="Calibri" w:hAnsi="Calibri"/>
+          <w:sz w:val="22"/>
+        </w:rPr>
+        <w:t xml:space="preserve"> plutôt qu'un update de statut car une session annulée ne doit laisser aucune trace dans Firebase — cela évite d'accumuler des données mortes et simplifie les requêtes de lecture. Une notification est automatiquement envoyée à l'autre partie pour l'informer de l'annulation.</w:t>
       </w:r>
     </w:p>
     <w:p>
@@ -8021,31 +8697,92 @@
         <w:t>📸  📸 CAPTURE D'ÉCRAN — Console Firebase : nœud bookedSessions après annulation (nœud disparu)</w:t>
       </w:r>
     </w:p>
-    <w:p>
-      <w:pPr>
-        <w:spacing w:before="2835" w:after="240"/>
-        <w:ind w:left="0"/>
-        <w:shd w:val="clear" w:color="auto" w:fill="F9FAFB"/>
-        <w:pBdr>
-          <w:left w:val="single" w:sz="6" w:space="6" w:color="D1D5DB"/>
-        </w:pBdr>
-      </w:pPr>
+    <w:tbl>
+      <w:tblPr>
+        <w:tblStyle w:val="TableGrid"/>
+        <w:tblW w:type="auto" w:w="0"/>
+        <w:tblLook w:firstColumn="1" w:firstRow="1" w:lastColumn="0" w:lastRow="0" w:noHBand="0" w:noVBand="1" w:val="04A0"/>
+      </w:tblPr>
+      <w:tblGrid>
+        <w:gridCol w:w="9406"/>
+      </w:tblGrid>
+      <w:tr>
+        <w:trPr>
+          <w:trHeight w:val="3969" w:hRule="atLeast"/>
+        </w:trPr>
+        <w:tc>
+          <w:tcPr>
+            <w:tcW w:type="dxa" w:w="9406"/>
+            <w:shd w:val="clear" w:color="auto" w:fill="F9FAFB"/>
+          </w:tcPr>
+          <w:p>
+            <w:pPr>
+              <w:spacing w:before="1587"/>
+              <w:jc w:val="center"/>
+            </w:pPr>
+            <w:r>
+              <w:rPr>
+                <w:rFonts w:ascii="Calibri" w:hAnsi="Calibri"/>
+                <w:i/>
+                <w:color w:val="ABB5BF"/>
+                <w:sz w:val="18"/>
+              </w:rPr>
+              <w:t>[ Insérer la capture d'écran ici ]</w:t>
+            </w:r>
+          </w:p>
+        </w:tc>
+      </w:tr>
+    </w:tbl>
+    <w:p>
+      <w:pPr>
+        <w:spacing w:after="240"/>
+      </w:pPr>
+    </w:p>
+    <w:p>
+      <w:pPr>
+        <w:pStyle w:val="Heading3"/>
+      </w:pPr>
+      <w:r>
+        <w:t>1.10 DELETE — Déconnexion et nettoyage du cache local</w:t>
+      </w:r>
+    </w:p>
+    <w:p>
       <w:r>
         <w:rPr>
           <w:rFonts w:ascii="Calibri" w:hAnsi="Calibri"/>
-          <w:i/>
-          <w:color w:val="ABB5BF"/>
-          <w:sz w:val="18"/>
-        </w:rPr>
-        <w:t>[ Insérer la capture d'écran ici ]</w:t>
-      </w:r>
-    </w:p>
-    <w:p>
-      <w:pPr>
-        <w:pStyle w:val="Heading3"/>
-      </w:pPr>
-      <w:r>
-        <w:t>1.10 DELETE — Déconnexion et nettoyage du cache local</w:t>
+          <w:sz w:val="22"/>
+        </w:rPr>
+        <w:t xml:space="preserve">La déconnexion dans DIAPALER n'est pas un simple </w:t>
+      </w:r>
+      <w:r>
+        <w:rPr>
+          <w:rFonts w:ascii="Courier New" w:hAnsi="Courier New"/>
+          <w:color w:val="DC2626"/>
+          <w:sz w:val="20"/>
+        </w:rPr>
+        <w:t>signOut()</w:t>
+      </w:r>
+      <w:r>
+        <w:rPr>
+          <w:rFonts w:ascii="Calibri" w:hAnsi="Calibri"/>
+          <w:sz w:val="22"/>
+        </w:rPr>
+        <w:t xml:space="preserve"> — c'est une séquence de six opérations dans un ordre précis. On vide d'abord toutes les couches de cache en mémoire avant de révoquer la session Firebase, pour éviter qu'un état résiduel ne s'affiche brièvement à l'écran lors de la redirection. Le </w:t>
+      </w:r>
+      <w:r>
+        <w:rPr>
+          <w:rFonts w:ascii="Courier New" w:hAnsi="Courier New"/>
+          <w:color w:val="DC2626"/>
+          <w:sz w:val="20"/>
+        </w:rPr>
+        <w:t>pushAndRemoveUntil</w:t>
+      </w:r>
+      <w:r>
+        <w:rPr>
+          <w:rFonts w:ascii="Calibri" w:hAnsi="Calibri"/>
+          <w:sz w:val="22"/>
+        </w:rPr>
+        <w:t xml:space="preserve"> vide complètement la pile de navigation pour qu'un appui sur le bouton retour ne ramène pas à une page protégée après déconnexion.</w:t>
       </w:r>
     </w:p>
     <w:p>
@@ -8282,31 +9019,167 @@
         <w:t>📸  📸 CAPTURE D'ÉCRAN — Dialog de confirmation de déconnexion</w:t>
       </w:r>
     </w:p>
-    <w:p>
-      <w:pPr>
-        <w:spacing w:before="2835" w:after="240"/>
-        <w:ind w:left="0"/>
-        <w:shd w:val="clear" w:color="auto" w:fill="F9FAFB"/>
-        <w:pBdr>
-          <w:left w:val="single" w:sz="6" w:space="6" w:color="D1D5DB"/>
-        </w:pBdr>
-      </w:pPr>
+    <w:tbl>
+      <w:tblPr>
+        <w:tblStyle w:val="TableGrid"/>
+        <w:tblW w:type="auto" w:w="0"/>
+        <w:tblLook w:firstColumn="1" w:firstRow="1" w:lastColumn="0" w:lastRow="0" w:noHBand="0" w:noVBand="1" w:val="04A0"/>
+      </w:tblPr>
+      <w:tblGrid>
+        <w:gridCol w:w="9406"/>
+      </w:tblGrid>
+      <w:tr>
+        <w:trPr>
+          <w:trHeight w:val="3969" w:hRule="atLeast"/>
+        </w:trPr>
+        <w:tc>
+          <w:tcPr>
+            <w:tcW w:type="dxa" w:w="9406"/>
+            <w:shd w:val="clear" w:color="auto" w:fill="F9FAFB"/>
+          </w:tcPr>
+          <w:p>
+            <w:pPr>
+              <w:spacing w:before="1587"/>
+              <w:jc w:val="center"/>
+            </w:pPr>
+            <w:r>
+              <w:rPr>
+                <w:rFonts w:ascii="Calibri" w:hAnsi="Calibri"/>
+                <w:i/>
+                <w:color w:val="ABB5BF"/>
+                <w:sz w:val="18"/>
+              </w:rPr>
+              <w:t>[ Insérer la capture d'écran ici ]</w:t>
+            </w:r>
+          </w:p>
+        </w:tc>
+      </w:tr>
+    </w:tbl>
+    <w:p>
+      <w:pPr>
+        <w:spacing w:after="240"/>
+      </w:pPr>
+    </w:p>
+    <w:p>
+      <w:pPr>
+        <w:pStyle w:val="Heading3"/>
+      </w:pPr>
+      <w:r>
+        <w:t>1.11 Sérialisation JSON ↔ Dart</w:t>
+      </w:r>
+    </w:p>
+    <w:p>
       <w:r>
         <w:rPr>
           <w:rFonts w:ascii="Calibri" w:hAnsi="Calibri"/>
-          <w:i/>
-          <w:color w:val="ABB5BF"/>
-          <w:sz w:val="18"/>
-        </w:rPr>
-        <w:t>[ Insérer la capture d'écran ici ]</w:t>
-      </w:r>
-    </w:p>
-    <w:p>
-      <w:pPr>
-        <w:pStyle w:val="Heading3"/>
-      </w:pPr>
-      <w:r>
-        <w:t>1.11 Sérialisation JSON ↔ Dart</w:t>
+          <w:sz w:val="22"/>
+        </w:rPr>
+        <w:t xml:space="preserve">Firebase Realtime Database ne retourne pas des objets Dart typés mais des </w:t>
+      </w:r>
+      <w:r>
+        <w:rPr>
+          <w:rFonts w:ascii="Courier New" w:hAnsi="Courier New"/>
+          <w:color w:val="DC2626"/>
+          <w:sz w:val="20"/>
+        </w:rPr>
+        <w:t>Map&lt;Object?, Object?&gt;</w:t>
+      </w:r>
+      <w:r>
+        <w:rPr>
+          <w:rFonts w:ascii="Calibri" w:hAnsi="Calibri"/>
+          <w:sz w:val="22"/>
+        </w:rPr>
+        <w:t xml:space="preserve"> bruts, ce qui impose une couche de sérialisation manuelle. Nous avons délibérément choisi de ne pas utiliser </w:t>
+      </w:r>
+      <w:r>
+        <w:rPr>
+          <w:rFonts w:ascii="Courier New" w:hAnsi="Courier New"/>
+          <w:color w:val="DC2626"/>
+          <w:sz w:val="20"/>
+        </w:rPr>
+        <w:t>json_serializable</w:t>
+      </w:r>
+      <w:r>
+        <w:rPr>
+          <w:rFonts w:ascii="Calibri" w:hAnsi="Calibri"/>
+          <w:sz w:val="22"/>
+        </w:rPr>
+        <w:t xml:space="preserve"> ou </w:t>
+      </w:r>
+      <w:r>
+        <w:rPr>
+          <w:rFonts w:ascii="Courier New" w:hAnsi="Courier New"/>
+          <w:color w:val="DC2626"/>
+          <w:sz w:val="20"/>
+        </w:rPr>
+        <w:t>freezed</w:t>
+      </w:r>
+      <w:r>
+        <w:rPr>
+          <w:rFonts w:ascii="Calibri" w:hAnsi="Calibri"/>
+          <w:sz w:val="22"/>
+        </w:rPr>
+        <w:t xml:space="preserve"> pour garder le projet simple et lisible, mais aussi parce que les types retournés par Firebase (</w:t>
+      </w:r>
+      <w:r>
+        <w:rPr>
+          <w:rFonts w:ascii="Courier New" w:hAnsi="Courier New"/>
+          <w:color w:val="DC2626"/>
+          <w:sz w:val="20"/>
+        </w:rPr>
+        <w:t>num</w:t>
+      </w:r>
+      <w:r>
+        <w:rPr>
+          <w:rFonts w:ascii="Calibri" w:hAnsi="Calibri"/>
+          <w:sz w:val="22"/>
+        </w:rPr>
+        <w:t xml:space="preserve">, </w:t>
+      </w:r>
+      <w:r>
+        <w:rPr>
+          <w:rFonts w:ascii="Courier New" w:hAnsi="Courier New"/>
+          <w:color w:val="DC2626"/>
+          <w:sz w:val="20"/>
+        </w:rPr>
+        <w:t>bool</w:t>
+      </w:r>
+      <w:r>
+        <w:rPr>
+          <w:rFonts w:ascii="Calibri" w:hAnsi="Calibri"/>
+          <w:sz w:val="22"/>
+        </w:rPr>
+        <w:t xml:space="preserve">, </w:t>
+      </w:r>
+      <w:r>
+        <w:rPr>
+          <w:rFonts w:ascii="Courier New" w:hAnsi="Courier New"/>
+          <w:color w:val="DC2626"/>
+          <w:sz w:val="20"/>
+        </w:rPr>
+        <w:t>List</w:t>
+      </w:r>
+      <w:r>
+        <w:rPr>
+          <w:rFonts w:ascii="Calibri" w:hAnsi="Calibri"/>
+          <w:sz w:val="22"/>
+        </w:rPr>
+        <w:t xml:space="preserve"> ou </w:t>
+      </w:r>
+      <w:r>
+        <w:rPr>
+          <w:rFonts w:ascii="Courier New" w:hAnsi="Courier New"/>
+          <w:color w:val="DC2626"/>
+          <w:sz w:val="20"/>
+        </w:rPr>
+        <w:t>Map</w:t>
+      </w:r>
+      <w:r>
+        <w:rPr>
+          <w:rFonts w:ascii="Calibri" w:hAnsi="Calibri"/>
+          <w:sz w:val="22"/>
+        </w:rPr>
+        <w:t xml:space="preserve"> selon la valeur) nécessitent des casts personnalisés qu'un générateur automatique gère mal.</w:t>
       </w:r>
     </w:p>
     <w:p>
@@ -8886,6 +9759,135 @@
       </w:pPr>
       <w:r>
         <w:t>2.1 Demandes de mentorat (mentorRequests)</w:t>
+      </w:r>
+    </w:p>
+    <w:p>
+      <w:r>
+        <w:rPr>
+          <w:rFonts w:ascii="Calibri" w:hAnsi="Calibri"/>
+          <w:sz w:val="22"/>
+        </w:rPr>
+        <w:t xml:space="preserve">Le nœud </w:t>
+      </w:r>
+      <w:r>
+        <w:rPr>
+          <w:rFonts w:ascii="Courier New" w:hAnsi="Courier New"/>
+          <w:color w:val="DC2626"/>
+          <w:sz w:val="20"/>
+        </w:rPr>
+        <w:t>mentorRequests/</w:t>
+      </w:r>
+      <w:r>
+        <w:rPr>
+          <w:rFonts w:ascii="Calibri" w:hAnsi="Calibri"/>
+          <w:sz w:val="22"/>
+        </w:rPr>
+        <w:t xml:space="preserve"> centralise deux types d'interactions entre membres : les demandes de mentorat (un entrepreneur sollicite un mentor) et les propositions d'investissement (un investisseur s'intéresse à un entrepreneur). Un seul modèle </w:t>
+      </w:r>
+      <w:r>
+        <w:rPr>
+          <w:rFonts w:ascii="Courier New" w:hAnsi="Courier New"/>
+          <w:color w:val="DC2626"/>
+          <w:sz w:val="20"/>
+        </w:rPr>
+        <w:t>MentorRequest</w:t>
+      </w:r>
+      <w:r>
+        <w:rPr>
+          <w:rFonts w:ascii="Calibri" w:hAnsi="Calibri"/>
+          <w:sz w:val="22"/>
+        </w:rPr>
+        <w:t xml:space="preserve"> couvre les deux cas grâce au champ </w:t>
+      </w:r>
+      <w:r>
+        <w:rPr>
+          <w:rFonts w:ascii="Courier New" w:hAnsi="Courier New"/>
+          <w:color w:val="DC2626"/>
+          <w:sz w:val="20"/>
+        </w:rPr>
+        <w:t>type</w:t>
+      </w:r>
+      <w:r>
+        <w:rPr>
+          <w:rFonts w:ascii="Calibri" w:hAnsi="Calibri"/>
+          <w:sz w:val="22"/>
+        </w:rPr>
+        <w:t xml:space="preserve">, ce qui simplifie le code et la structure Firebase. Le champ </w:t>
+      </w:r>
+      <w:r>
+        <w:rPr>
+          <w:rFonts w:ascii="Courier New" w:hAnsi="Courier New"/>
+          <w:color w:val="DC2626"/>
+          <w:sz w:val="20"/>
+        </w:rPr>
+        <w:t>status</w:t>
+      </w:r>
+      <w:r>
+        <w:rPr>
+          <w:rFonts w:ascii="Calibri" w:hAnsi="Calibri"/>
+          <w:sz w:val="22"/>
+        </w:rPr>
+        <w:t xml:space="preserve"> suit le cycle de vie de chaque demande, de </w:t>
+      </w:r>
+      <w:r>
+        <w:rPr>
+          <w:rFonts w:ascii="Courier New" w:hAnsi="Courier New"/>
+          <w:color w:val="DC2626"/>
+          <w:sz w:val="20"/>
+        </w:rPr>
+        <w:t>pending</w:t>
+      </w:r>
+      <w:r>
+        <w:rPr>
+          <w:rFonts w:ascii="Calibri" w:hAnsi="Calibri"/>
+          <w:sz w:val="22"/>
+        </w:rPr>
+        <w:t xml:space="preserve"> à </w:t>
+      </w:r>
+      <w:r>
+        <w:rPr>
+          <w:rFonts w:ascii="Courier New" w:hAnsi="Courier New"/>
+          <w:color w:val="DC2626"/>
+          <w:sz w:val="20"/>
+        </w:rPr>
+        <w:t>accepted</w:t>
+      </w:r>
+      <w:r>
+        <w:rPr>
+          <w:rFonts w:ascii="Calibri" w:hAnsi="Calibri"/>
+          <w:sz w:val="22"/>
+        </w:rPr>
+        <w:t xml:space="preserve"> ou </w:t>
+      </w:r>
+      <w:r>
+        <w:rPr>
+          <w:rFonts w:ascii="Courier New" w:hAnsi="Courier New"/>
+          <w:color w:val="DC2626"/>
+          <w:sz w:val="20"/>
+        </w:rPr>
+        <w:t>rejected</w:t>
+      </w:r>
+      <w:r>
+        <w:rPr>
+          <w:rFonts w:ascii="Calibri" w:hAnsi="Calibri"/>
+          <w:sz w:val="22"/>
+        </w:rPr>
+        <w:t xml:space="preserve">, avec la date de réponse tracée dans </w:t>
+      </w:r>
+      <w:r>
+        <w:rPr>
+          <w:rFonts w:ascii="Courier New" w:hAnsi="Courier New"/>
+          <w:color w:val="DC2626"/>
+          <w:sz w:val="20"/>
+        </w:rPr>
+        <w:t>respondedAt</w:t>
+      </w:r>
+      <w:r>
+        <w:rPr>
+          <w:rFonts w:ascii="Calibri" w:hAnsi="Calibri"/>
+          <w:sz w:val="22"/>
+        </w:rPr>
+        <w:t xml:space="preserve"> pour l'historique.</w:t>
       </w:r>
     </w:p>
     <w:p>
@@ -10393,31 +11395,92 @@
         <w:t>📸  📸 CAPTURE D'ÉCRAN — Écran "Demandes reçues" avec liste des requêtes</w:t>
       </w:r>
     </w:p>
-    <w:p>
-      <w:pPr>
-        <w:spacing w:before="2835" w:after="240"/>
-        <w:ind w:left="0"/>
-        <w:shd w:val="clear" w:color="auto" w:fill="F9FAFB"/>
-        <w:pBdr>
-          <w:left w:val="single" w:sz="6" w:space="6" w:color="D1D5DB"/>
-        </w:pBdr>
-      </w:pPr>
+    <w:tbl>
+      <w:tblPr>
+        <w:tblStyle w:val="TableGrid"/>
+        <w:tblW w:type="auto" w:w="0"/>
+        <w:tblLook w:firstColumn="1" w:firstRow="1" w:lastColumn="0" w:lastRow="0" w:noHBand="0" w:noVBand="1" w:val="04A0"/>
+      </w:tblPr>
+      <w:tblGrid>
+        <w:gridCol w:w="9406"/>
+      </w:tblGrid>
+      <w:tr>
+        <w:trPr>
+          <w:trHeight w:val="3969" w:hRule="atLeast"/>
+        </w:trPr>
+        <w:tc>
+          <w:tcPr>
+            <w:tcW w:type="dxa" w:w="9406"/>
+            <w:shd w:val="clear" w:color="auto" w:fill="F9FAFB"/>
+          </w:tcPr>
+          <w:p>
+            <w:pPr>
+              <w:spacing w:before="1587"/>
+              <w:jc w:val="center"/>
+            </w:pPr>
+            <w:r>
+              <w:rPr>
+                <w:rFonts w:ascii="Calibri" w:hAnsi="Calibri"/>
+                <w:i/>
+                <w:color w:val="ABB5BF"/>
+                <w:sz w:val="18"/>
+              </w:rPr>
+              <w:t>[ Insérer la capture d'écran ici ]</w:t>
+            </w:r>
+          </w:p>
+        </w:tc>
+      </w:tr>
+    </w:tbl>
+    <w:p>
+      <w:pPr>
+        <w:spacing w:after="240"/>
+      </w:pPr>
+    </w:p>
+    <w:p>
+      <w:pPr>
+        <w:pStyle w:val="Heading3"/>
+      </w:pPr>
+      <w:r>
+        <w:t>2.2 Messagerie temps réel (messages + conversations)</w:t>
+      </w:r>
+    </w:p>
+    <w:p>
       <w:r>
         <w:rPr>
           <w:rFonts w:ascii="Calibri" w:hAnsi="Calibri"/>
-          <w:i/>
-          <w:color w:val="ABB5BF"/>
-          <w:sz w:val="18"/>
-        </w:rPr>
-        <w:t>[ Insérer la capture d'écran ici ]</w:t>
-      </w:r>
-    </w:p>
-    <w:p>
-      <w:pPr>
-        <w:pStyle w:val="Heading3"/>
-      </w:pPr>
-      <w:r>
-        <w:t>2.2 Messagerie temps réel (messages + conversations)</w:t>
+          <w:sz w:val="22"/>
+        </w:rPr>
+        <w:t xml:space="preserve">La messagerie repose sur deux nœuds complémentaires : </w:t>
+      </w:r>
+      <w:r>
+        <w:rPr>
+          <w:rFonts w:ascii="Courier New" w:hAnsi="Courier New"/>
+          <w:color w:val="DC2626"/>
+          <w:sz w:val="20"/>
+        </w:rPr>
+        <w:t>messages/</w:t>
+      </w:r>
+      <w:r>
+        <w:rPr>
+          <w:rFonts w:ascii="Calibri" w:hAnsi="Calibri"/>
+          <w:sz w:val="22"/>
+        </w:rPr>
+        <w:t xml:space="preserve"> stocke le contenu de chaque échange, et </w:t>
+      </w:r>
+      <w:r>
+        <w:rPr>
+          <w:rFonts w:ascii="Courier New" w:hAnsi="Courier New"/>
+          <w:color w:val="DC2626"/>
+          <w:sz w:val="20"/>
+        </w:rPr>
+        <w:t>conversations/</w:t>
+      </w:r>
+      <w:r>
+        <w:rPr>
+          <w:rFonts w:ascii="Calibri" w:hAnsi="Calibri"/>
+          <w:sz w:val="22"/>
+        </w:rPr>
+        <w:t xml:space="preserve"> maintient un résumé (dernier message, compteur de non lus) pour afficher la liste des conversations sans avoir à charger tous les messages. L'identifiant de conversation est généré en triant les deux UIDs alphabétiquement et en les concaténant, ce qui garantit que deux utilisateurs partagent toujours le même identifiant de canal quelle que soit la direction du premier message.</w:t>
       </w:r>
     </w:p>
     <w:p>
@@ -11218,24 +12281,46 @@
         <w:t>📸  📸 CAPTURE D'ÉCRAN — Messagerie : liste des conversations (avec compteur non lus)</w:t>
       </w:r>
     </w:p>
-    <w:p>
-      <w:pPr>
-        <w:spacing w:before="2835" w:after="240"/>
-        <w:ind w:left="0"/>
-        <w:shd w:val="clear" w:color="auto" w:fill="F9FAFB"/>
-        <w:pBdr>
-          <w:left w:val="single" w:sz="6" w:space="6" w:color="D1D5DB"/>
-        </w:pBdr>
-      </w:pPr>
-      <w:r>
-        <w:rPr>
-          <w:rFonts w:ascii="Calibri" w:hAnsi="Calibri"/>
-          <w:i/>
-          <w:color w:val="ABB5BF"/>
-          <w:sz w:val="18"/>
-        </w:rPr>
-        <w:t>[ Insérer la capture d'écran ici ]</w:t>
-      </w:r>
+    <w:tbl>
+      <w:tblPr>
+        <w:tblStyle w:val="TableGrid"/>
+        <w:tblW w:type="auto" w:w="0"/>
+        <w:tblLook w:firstColumn="1" w:firstRow="1" w:lastColumn="0" w:lastRow="0" w:noHBand="0" w:noVBand="1" w:val="04A0"/>
+      </w:tblPr>
+      <w:tblGrid>
+        <w:gridCol w:w="9406"/>
+      </w:tblGrid>
+      <w:tr>
+        <w:trPr>
+          <w:trHeight w:val="3969" w:hRule="atLeast"/>
+        </w:trPr>
+        <w:tc>
+          <w:tcPr>
+            <w:tcW w:type="dxa" w:w="9406"/>
+            <w:shd w:val="clear" w:color="auto" w:fill="F9FAFB"/>
+          </w:tcPr>
+          <w:p>
+            <w:pPr>
+              <w:spacing w:before="1587"/>
+              <w:jc w:val="center"/>
+            </w:pPr>
+            <w:r>
+              <w:rPr>
+                <w:rFonts w:ascii="Calibri" w:hAnsi="Calibri"/>
+                <w:i/>
+                <w:color w:val="ABB5BF"/>
+                <w:sz w:val="18"/>
+              </w:rPr>
+              <w:t>[ Insérer la capture d'écran ici ]</w:t>
+            </w:r>
+          </w:p>
+        </w:tc>
+      </w:tr>
+    </w:tbl>
+    <w:p>
+      <w:pPr>
+        <w:spacing w:after="240"/>
+      </w:pPr>
     </w:p>
     <w:p>
       <w:pPr>
@@ -11256,31 +12341,107 @@
         <w:t>📸  📸 CAPTURE D'ÉCRAN — Messagerie : conversation temps réel</w:t>
       </w:r>
     </w:p>
-    <w:p>
-      <w:pPr>
-        <w:spacing w:before="2835" w:after="240"/>
-        <w:ind w:left="0"/>
-        <w:shd w:val="clear" w:color="auto" w:fill="F9FAFB"/>
-        <w:pBdr>
-          <w:left w:val="single" w:sz="6" w:space="6" w:color="D1D5DB"/>
-        </w:pBdr>
-      </w:pPr>
+    <w:tbl>
+      <w:tblPr>
+        <w:tblStyle w:val="TableGrid"/>
+        <w:tblW w:type="auto" w:w="0"/>
+        <w:tblLook w:firstColumn="1" w:firstRow="1" w:lastColumn="0" w:lastRow="0" w:noHBand="0" w:noVBand="1" w:val="04A0"/>
+      </w:tblPr>
+      <w:tblGrid>
+        <w:gridCol w:w="9406"/>
+      </w:tblGrid>
+      <w:tr>
+        <w:trPr>
+          <w:trHeight w:val="3969" w:hRule="atLeast"/>
+        </w:trPr>
+        <w:tc>
+          <w:tcPr>
+            <w:tcW w:type="dxa" w:w="9406"/>
+            <w:shd w:val="clear" w:color="auto" w:fill="F9FAFB"/>
+          </w:tcPr>
+          <w:p>
+            <w:pPr>
+              <w:spacing w:before="1587"/>
+              <w:jc w:val="center"/>
+            </w:pPr>
+            <w:r>
+              <w:rPr>
+                <w:rFonts w:ascii="Calibri" w:hAnsi="Calibri"/>
+                <w:i/>
+                <w:color w:val="ABB5BF"/>
+                <w:sz w:val="18"/>
+              </w:rPr>
+              <w:t>[ Insérer la capture d'écran ici ]</w:t>
+            </w:r>
+          </w:p>
+        </w:tc>
+      </w:tr>
+    </w:tbl>
+    <w:p>
+      <w:pPr>
+        <w:spacing w:after="240"/>
+      </w:pPr>
+    </w:p>
+    <w:p>
+      <w:pPr>
+        <w:pStyle w:val="Heading3"/>
+      </w:pPr>
+      <w:r>
+        <w:t>2.3 Disponibilités mentor (availability)</w:t>
+      </w:r>
+    </w:p>
+    <w:p>
       <w:r>
         <w:rPr>
           <w:rFonts w:ascii="Calibri" w:hAnsi="Calibri"/>
-          <w:i/>
-          <w:color w:val="ABB5BF"/>
-          <w:sz w:val="18"/>
-        </w:rPr>
-        <w:t>[ Insérer la capture d'écran ici ]</w:t>
-      </w:r>
-    </w:p>
-    <w:p>
-      <w:pPr>
-        <w:pStyle w:val="Heading3"/>
-      </w:pPr>
-      <w:r>
-        <w:t>2.3 Disponibilités mentor (availability)</w:t>
+          <w:sz w:val="22"/>
+        </w:rPr>
+        <w:t xml:space="preserve">Chaque mentor peut définir ses créneaux disponibles par jour de la semaine depuis son planning. Ces données sont stockées dans le nœud </w:t>
+      </w:r>
+      <w:r>
+        <w:rPr>
+          <w:rFonts w:ascii="Courier New" w:hAnsi="Courier New"/>
+          <w:color w:val="DC2626"/>
+          <w:sz w:val="20"/>
+        </w:rPr>
+        <w:t>availability/{userId}</w:t>
+      </w:r>
+      <w:r>
+        <w:rPr>
+          <w:rFonts w:ascii="Calibri" w:hAnsi="Calibri"/>
+          <w:sz w:val="22"/>
+        </w:rPr>
+        <w:t xml:space="preserve"> et lues en temps réel par les entrepreneurs pour savoir quand réserver une session. On utilise </w:t>
+      </w:r>
+      <w:r>
+        <w:rPr>
+          <w:rFonts w:ascii="Courier New" w:hAnsi="Courier New"/>
+          <w:color w:val="DC2626"/>
+          <w:sz w:val="20"/>
+        </w:rPr>
+        <w:t>.set()</w:t>
+      </w:r>
+      <w:r>
+        <w:rPr>
+          <w:rFonts w:ascii="Calibri" w:hAnsi="Calibri"/>
+          <w:sz w:val="22"/>
+        </w:rPr>
+        <w:t xml:space="preserve"> pour les mises à jour (remplacement complet du planning) plutôt que </w:t>
+      </w:r>
+      <w:r>
+        <w:rPr>
+          <w:rFonts w:ascii="Courier New" w:hAnsi="Courier New"/>
+          <w:color w:val="DC2626"/>
+          <w:sz w:val="20"/>
+        </w:rPr>
+        <w:t>.update()</w:t>
+      </w:r>
+      <w:r>
+        <w:rPr>
+          <w:rFonts w:ascii="Calibri" w:hAnsi="Calibri"/>
+          <w:sz w:val="22"/>
+        </w:rPr>
+        <w:t>, car modifier partiellement un calendrier hebdomadaire serait plus risqué — il vaut mieux réécrire tout le planning d'un coup pour garantir sa cohérence.</w:t>
       </w:r>
     </w:p>
     <w:p>
@@ -11427,24 +12588,46 @@
         <w:t>📸  📸 CAPTURE D'ÉCRAN — Planning du mentor : gestion des créneaux disponibles</w:t>
       </w:r>
     </w:p>
-    <w:p>
-      <w:pPr>
-        <w:spacing w:before="2835" w:after="240"/>
-        <w:ind w:left="0"/>
-        <w:shd w:val="clear" w:color="auto" w:fill="F9FAFB"/>
-        <w:pBdr>
-          <w:left w:val="single" w:sz="6" w:space="6" w:color="D1D5DB"/>
-        </w:pBdr>
-      </w:pPr>
-      <w:r>
-        <w:rPr>
-          <w:rFonts w:ascii="Calibri" w:hAnsi="Calibri"/>
-          <w:i/>
-          <w:color w:val="ABB5BF"/>
-          <w:sz w:val="18"/>
-        </w:rPr>
-        <w:t>[ Insérer la capture d'écran ici ]</w:t>
-      </w:r>
+    <w:tbl>
+      <w:tblPr>
+        <w:tblStyle w:val="TableGrid"/>
+        <w:tblW w:type="auto" w:w="0"/>
+        <w:tblLook w:firstColumn="1" w:firstRow="1" w:lastColumn="0" w:lastRow="0" w:noHBand="0" w:noVBand="1" w:val="04A0"/>
+      </w:tblPr>
+      <w:tblGrid>
+        <w:gridCol w:w="9406"/>
+      </w:tblGrid>
+      <w:tr>
+        <w:trPr>
+          <w:trHeight w:val="3969" w:hRule="atLeast"/>
+        </w:trPr>
+        <w:tc>
+          <w:tcPr>
+            <w:tcW w:type="dxa" w:w="9406"/>
+            <w:shd w:val="clear" w:color="auto" w:fill="F9FAFB"/>
+          </w:tcPr>
+          <w:p>
+            <w:pPr>
+              <w:spacing w:before="1587"/>
+              <w:jc w:val="center"/>
+            </w:pPr>
+            <w:r>
+              <w:rPr>
+                <w:rFonts w:ascii="Calibri" w:hAnsi="Calibri"/>
+                <w:i/>
+                <w:color w:val="ABB5BF"/>
+                <w:sz w:val="18"/>
+              </w:rPr>
+              <w:t>[ Insérer la capture d'écran ici ]</w:t>
+            </w:r>
+          </w:p>
+        </w:tc>
+      </w:tr>
+    </w:tbl>
+    <w:p>
+      <w:pPr>
+        <w:spacing w:after="240"/>
+      </w:pPr>
     </w:p>
     <w:p>
       <w:pPr>
@@ -12387,39 +13570,85 @@
         <w:t>📸  📸 CAPTURE D'ÉCRAN — Matching : membres DIAPALER réels en tête de liste</w:t>
       </w:r>
     </w:p>
-    <w:p>
-      <w:pPr>
-        <w:spacing w:before="2835" w:after="240"/>
-        <w:ind w:left="0"/>
-        <w:shd w:val="clear" w:color="auto" w:fill="F9FAFB"/>
-        <w:pBdr>
-          <w:left w:val="single" w:sz="6" w:space="6" w:color="D1D5DB"/>
-        </w:pBdr>
-      </w:pPr>
+    <w:tbl>
+      <w:tblPr>
+        <w:tblStyle w:val="TableGrid"/>
+        <w:tblW w:type="auto" w:w="0"/>
+        <w:tblLook w:firstColumn="1" w:firstRow="1" w:lastColumn="0" w:lastRow="0" w:noHBand="0" w:noVBand="1" w:val="04A0"/>
+      </w:tblPr>
+      <w:tblGrid>
+        <w:gridCol w:w="9406"/>
+      </w:tblGrid>
+      <w:tr>
+        <w:trPr>
+          <w:trHeight w:val="3969" w:hRule="atLeast"/>
+        </w:trPr>
+        <w:tc>
+          <w:tcPr>
+            <w:tcW w:type="dxa" w:w="9406"/>
+            <w:shd w:val="clear" w:color="auto" w:fill="F9FAFB"/>
+          </w:tcPr>
+          <w:p>
+            <w:pPr>
+              <w:spacing w:before="1587"/>
+              <w:jc w:val="center"/>
+            </w:pPr>
+            <w:r>
+              <w:rPr>
+                <w:rFonts w:ascii="Calibri" w:hAnsi="Calibri"/>
+                <w:i/>
+                <w:color w:val="ABB5BF"/>
+                <w:sz w:val="18"/>
+              </w:rPr>
+              <w:t>[ Insérer la capture d'écran ici ]</w:t>
+            </w:r>
+          </w:p>
+        </w:tc>
+      </w:tr>
+    </w:tbl>
+    <w:p>
+      <w:pPr>
+        <w:spacing w:after="240"/>
+      </w:pPr>
+    </w:p>
+    <w:p>
+      <w:pPr>
+        <w:pStyle w:val="Heading2"/>
+      </w:pPr>
+      <w:r>
+        <w:t>4. Groq API — Llama 3.1 (Chatbot DIALI IA)</w:t>
+      </w:r>
+    </w:p>
+    <w:p>
+      <w:pPr>
+        <w:pStyle w:val="Heading3"/>
+      </w:pPr>
+      <w:r>
+        <w:t>4.1 Architecture sécurisée — Proxy Cloudflare Worker</w:t>
+      </w:r>
+    </w:p>
+    <w:p>
       <w:r>
         <w:rPr>
           <w:rFonts w:ascii="Calibri" w:hAnsi="Calibri"/>
-          <w:i/>
-          <w:color w:val="ABB5BF"/>
-          <w:sz w:val="18"/>
-        </w:rPr>
-        <w:t>[ Insérer la capture d'écran ici ]</w:t>
-      </w:r>
-    </w:p>
-    <w:p>
-      <w:pPr>
-        <w:pStyle w:val="Heading2"/>
-      </w:pPr>
-      <w:r>
-        <w:t>4. Groq API — Llama 3.1 (Chatbot DIALI IA)</w:t>
-      </w:r>
-    </w:p>
-    <w:p>
-      <w:pPr>
-        <w:pStyle w:val="Heading3"/>
-      </w:pPr>
-      <w:r>
-        <w:t>4.1 Architecture sécurisée — Proxy Cloudflare Worker</w:t>
+          <w:sz w:val="22"/>
+        </w:rPr>
+        <w:t xml:space="preserve">Pour le chatbot DIALI IA, nous avons choisi Groq avec le modèle Llama 3.1 8B instant. Groq se distingue par sa vitesse de génération (LPU — Language Processing Unit) qui produit des réponses en moins d'une seconde, bien adapté à une interface de chat mobile. Le modèle </w:t>
+      </w:r>
+      <w:r>
+        <w:rPr>
+          <w:rFonts w:ascii="Courier New" w:hAnsi="Courier New"/>
+          <w:color w:val="DC2626"/>
+          <w:sz w:val="20"/>
+        </w:rPr>
+        <w:t>llama-3.1-8b-instant</w:t>
+      </w:r>
+      <w:r>
+        <w:rPr>
+          <w:rFonts w:ascii="Calibri" w:hAnsi="Calibri"/>
+          <w:sz w:val="22"/>
+        </w:rPr>
+        <w:t xml:space="preserve"> est suffisamment puissant pour conseiller un entrepreneur sénégalais tout en étant gratuit dans les quotas actuels, ce qui correspond au budget de notre projet académique. Quant au proxy Cloudflare Worker, il résout un problème de sécurité fondamental : une clé API embarquée dans le code d'une application mobile peut être extraite par décompilation.</w:t>
       </w:r>
     </w:p>
     <w:p>
@@ -12935,6 +14164,30 @@
       </w:r>
     </w:p>
     <w:p>
+      <w:r>
+        <w:rPr>
+          <w:rFonts w:ascii="Calibri" w:hAnsi="Calibri"/>
+          <w:sz w:val="22"/>
+        </w:rPr>
+        <w:t xml:space="preserve">Le service chatbot construit un prompt système personnalisé à partir du profil de l'utilisateur connecté : son prénom, son rôle (Entrepreneur/Mentor/Investisseur), son secteur d'activité et sa ville. Cette personnalisation rend les réponses de DIALI bien plus pertinentes — un entrepreneur du secteur Mode à Dakar recevra des conseils différents d'un mentor tech à Saint-Louis. L'historique complet de la conversation est envoyé à chaque requête (format </w:t>
+      </w:r>
+      <w:r>
+        <w:rPr>
+          <w:rFonts w:ascii="Courier New" w:hAnsi="Courier New"/>
+          <w:color w:val="DC2626"/>
+          <w:sz w:val="20"/>
+        </w:rPr>
+        <w:t>messages[]</w:t>
+      </w:r>
+      <w:r>
+        <w:rPr>
+          <w:rFonts w:ascii="Calibri" w:hAnsi="Calibri"/>
+          <w:sz w:val="22"/>
+        </w:rPr>
+        <w:t>) pour que DIALI garde le contexte des échanges précédents.</w:t>
+      </w:r>
+    </w:p>
+    <w:p>
       <w:pPr>
         <w:spacing w:before="0" w:after="0"/>
         <w:ind w:left="283"/>
@@ -14460,6 +15713,30 @@
       </w:pPr>
       <w:r>
         <w:t>4.3 Appel depuis `page_chatbot.dart`</w:t>
+      </w:r>
+    </w:p>
+    <w:p>
+      <w:r>
+        <w:rPr>
+          <w:rFonts w:ascii="Calibri" w:hAnsi="Calibri"/>
+          <w:sz w:val="22"/>
+        </w:rPr>
+        <w:t xml:space="preserve">La page chatbot gère l'affichage optimiste des messages : le message de l'utilisateur est ajouté immédiatement dans la liste locale (avant même que la requête HTTP parte), ce qui donne l'impression d'une réactivité instantanée. Si l'appel échoue, le dernier message de l'utilisateur est retiré de la liste et une </w:t>
+      </w:r>
+      <w:r>
+        <w:rPr>
+          <w:rFonts w:ascii="Courier New" w:hAnsi="Courier New"/>
+          <w:color w:val="DC2626"/>
+          <w:sz w:val="20"/>
+        </w:rPr>
+        <w:t>SnackBar</w:t>
+      </w:r>
+      <w:r>
+        <w:rPr>
+          <w:rFonts w:ascii="Calibri" w:hAnsi="Calibri"/>
+          <w:sz w:val="22"/>
+        </w:rPr>
+        <w:t xml:space="preserve"> affiche l'erreur. Ce pattern « affichage optimiste + rollback en cas d'erreur » est courant dans les applications de messagerie modernes.</w:t>
       </w:r>
     </w:p>
     <w:p>
@@ -15101,24 +16378,46 @@
         <w:t>📸  📸 CAPTURE D'ÉCRAN — Chatbot DIALI IA en cours de conversation</w:t>
       </w:r>
     </w:p>
-    <w:p>
-      <w:pPr>
-        <w:spacing w:before="2835" w:after="240"/>
-        <w:ind w:left="0"/>
-        <w:shd w:val="clear" w:color="auto" w:fill="F9FAFB"/>
-        <w:pBdr>
-          <w:left w:val="single" w:sz="6" w:space="6" w:color="D1D5DB"/>
-        </w:pBdr>
-      </w:pPr>
-      <w:r>
-        <w:rPr>
-          <w:rFonts w:ascii="Calibri" w:hAnsi="Calibri"/>
-          <w:i/>
-          <w:color w:val="ABB5BF"/>
-          <w:sz w:val="18"/>
-        </w:rPr>
-        <w:t>[ Insérer la capture d'écran ici ]</w:t>
-      </w:r>
+    <w:tbl>
+      <w:tblPr>
+        <w:tblStyle w:val="TableGrid"/>
+        <w:tblW w:type="auto" w:w="0"/>
+        <w:tblLook w:firstColumn="1" w:firstRow="1" w:lastColumn="0" w:lastRow="0" w:noHBand="0" w:noVBand="1" w:val="04A0"/>
+      </w:tblPr>
+      <w:tblGrid>
+        <w:gridCol w:w="9406"/>
+      </w:tblGrid>
+      <w:tr>
+        <w:trPr>
+          <w:trHeight w:val="3969" w:hRule="atLeast"/>
+        </w:trPr>
+        <w:tc>
+          <w:tcPr>
+            <w:tcW w:type="dxa" w:w="9406"/>
+            <w:shd w:val="clear" w:color="auto" w:fill="F9FAFB"/>
+          </w:tcPr>
+          <w:p>
+            <w:pPr>
+              <w:spacing w:before="1587"/>
+              <w:jc w:val="center"/>
+            </w:pPr>
+            <w:r>
+              <w:rPr>
+                <w:rFonts w:ascii="Calibri" w:hAnsi="Calibri"/>
+                <w:i/>
+                <w:color w:val="ABB5BF"/>
+                <w:sz w:val="18"/>
+              </w:rPr>
+              <w:t>[ Insérer la capture d'écran ici ]</w:t>
+            </w:r>
+          </w:p>
+        </w:tc>
+      </w:tr>
+    </w:tbl>
+    <w:p>
+      <w:pPr>
+        <w:spacing w:after="240"/>
+      </w:pPr>
     </w:p>
     <w:p>
       <w:pPr>
@@ -15139,31 +16438,77 @@
         <w:t>📸  📸 CAPTURE D'ÉCRAN — Réponse de DIALI sur le financement sénégalais (DER/FJ)</w:t>
       </w:r>
     </w:p>
-    <w:p>
-      <w:pPr>
-        <w:spacing w:before="2835" w:after="240"/>
-        <w:ind w:left="0"/>
-        <w:shd w:val="clear" w:color="auto" w:fill="F9FAFB"/>
-        <w:pBdr>
-          <w:left w:val="single" w:sz="6" w:space="6" w:color="D1D5DB"/>
-        </w:pBdr>
-      </w:pPr>
+    <w:tbl>
+      <w:tblPr>
+        <w:tblStyle w:val="TableGrid"/>
+        <w:tblW w:type="auto" w:w="0"/>
+        <w:tblLook w:firstColumn="1" w:firstRow="1" w:lastColumn="0" w:lastRow="0" w:noHBand="0" w:noVBand="1" w:val="04A0"/>
+      </w:tblPr>
+      <w:tblGrid>
+        <w:gridCol w:w="9406"/>
+      </w:tblGrid>
+      <w:tr>
+        <w:trPr>
+          <w:trHeight w:val="3969" w:hRule="atLeast"/>
+        </w:trPr>
+        <w:tc>
+          <w:tcPr>
+            <w:tcW w:type="dxa" w:w="9406"/>
+            <w:shd w:val="clear" w:color="auto" w:fill="F9FAFB"/>
+          </w:tcPr>
+          <w:p>
+            <w:pPr>
+              <w:spacing w:before="1587"/>
+              <w:jc w:val="center"/>
+            </w:pPr>
+            <w:r>
+              <w:rPr>
+                <w:rFonts w:ascii="Calibri" w:hAnsi="Calibri"/>
+                <w:i/>
+                <w:color w:val="ABB5BF"/>
+                <w:sz w:val="18"/>
+              </w:rPr>
+              <w:t>[ Insérer la capture d'écran ici ]</w:t>
+            </w:r>
+          </w:p>
+        </w:tc>
+      </w:tr>
+    </w:tbl>
+    <w:p>
+      <w:pPr>
+        <w:spacing w:after="240"/>
+      </w:pPr>
+    </w:p>
+    <w:p>
+      <w:pPr>
+        <w:pStyle w:val="Heading2"/>
+      </w:pPr>
+      <w:r>
+        <w:t>5. Tableau récapitulatif CRUD complet</w:t>
+      </w:r>
+    </w:p>
+    <w:p>
       <w:r>
         <w:rPr>
           <w:rFonts w:ascii="Calibri" w:hAnsi="Calibri"/>
-          <w:i/>
-          <w:color w:val="ABB5BF"/>
-          <w:sz w:val="18"/>
-        </w:rPr>
-        <w:t>[ Insérer la capture d'écran ici ]</w:t>
-      </w:r>
-    </w:p>
-    <w:p>
-      <w:pPr>
-        <w:pStyle w:val="Heading2"/>
-      </w:pPr>
-      <w:r>
-        <w:t>5. Tableau récapitulatif CRUD complet</w:t>
+          <w:sz w:val="22"/>
+        </w:rPr>
+        <w:t>Pour récapituler l'ensemble des interactions avec Firebase et l'API Groq, le tableau ci-dessous liste chaque opération CRUD implémentée dans DIAPALER AFRICA. On constate que les opérations READ en mode stream (</w:t>
+      </w:r>
+      <w:r>
+        <w:rPr>
+          <w:rFonts w:ascii="Courier New" w:hAnsi="Courier New"/>
+          <w:color w:val="DC2626"/>
+          <w:sz w:val="20"/>
+        </w:rPr>
+        <w:t>.onValue</w:t>
+      </w:r>
+      <w:r>
+        <w:rPr>
+          <w:rFonts w:ascii="Calibri" w:hAnsi="Calibri"/>
+          <w:sz w:val="22"/>
+        </w:rPr>
+        <w:t>) sont les plus nombreuses, ce qui reflète bien l'architecture temps réel de l'application. Les opérations DELETE sont plus rares et ciblées : on préfère marquer un élément comme annulé ou lu plutôt que de le supprimer, sauf pour les sessions (données bilatérales) et le cache local à la déconnexion.</w:t>
       </w:r>
     </w:p>
     <w:tbl>
@@ -17285,24 +18630,46 @@
         <w:t>📸  📸 CAPTURE D'ÉCRAN — Console Firebase : messages en temps réel dans messages/</w:t>
       </w:r>
     </w:p>
-    <w:p>
-      <w:pPr>
-        <w:spacing w:before="2835" w:after="240"/>
-        <w:ind w:left="0"/>
-        <w:shd w:val="clear" w:color="auto" w:fill="F9FAFB"/>
-        <w:pBdr>
-          <w:left w:val="single" w:sz="6" w:space="6" w:color="D1D5DB"/>
-        </w:pBdr>
-      </w:pPr>
-      <w:r>
-        <w:rPr>
-          <w:rFonts w:ascii="Calibri" w:hAnsi="Calibri"/>
-          <w:i/>
-          <w:color w:val="ABB5BF"/>
-          <w:sz w:val="18"/>
-        </w:rPr>
-        <w:t>[ Insérer la capture d'écran ici ]</w:t>
-      </w:r>
+    <w:tbl>
+      <w:tblPr>
+        <w:tblStyle w:val="TableGrid"/>
+        <w:tblW w:type="auto" w:w="0"/>
+        <w:tblLook w:firstColumn="1" w:firstRow="1" w:lastColumn="0" w:lastRow="0" w:noHBand="0" w:noVBand="1" w:val="04A0"/>
+      </w:tblPr>
+      <w:tblGrid>
+        <w:gridCol w:w="9406"/>
+      </w:tblGrid>
+      <w:tr>
+        <w:trPr>
+          <w:trHeight w:val="3969" w:hRule="atLeast"/>
+        </w:trPr>
+        <w:tc>
+          <w:tcPr>
+            <w:tcW w:type="dxa" w:w="9406"/>
+            <w:shd w:val="clear" w:color="auto" w:fill="F9FAFB"/>
+          </w:tcPr>
+          <w:p>
+            <w:pPr>
+              <w:spacing w:before="1587"/>
+              <w:jc w:val="center"/>
+            </w:pPr>
+            <w:r>
+              <w:rPr>
+                <w:rFonts w:ascii="Calibri" w:hAnsi="Calibri"/>
+                <w:i/>
+                <w:color w:val="ABB5BF"/>
+                <w:sz w:val="18"/>
+              </w:rPr>
+              <w:t>[ Insérer la capture d'écran ici ]</w:t>
+            </w:r>
+          </w:p>
+        </w:tc>
+      </w:tr>
+    </w:tbl>
+    <w:p>
+      <w:pPr>
+        <w:spacing w:after="240"/>
+      </w:pPr>
     </w:p>
     <w:p>
       <w:pPr>

</xml_diff>